<commit_message>
Left-align the 2525 Word file
Thai distributed alignment letter-spaced whole lines in Word without
Thai word breaking. Body styles are now left-aligned, and the mistake
is recorded in the project skill.

Co-Authored-By: Claude Opus 5.5 <noreply@anthropic.com>
Claude-Session: https://claude.ai/code/session_01U2SdPW1rHLhRKCXxNJ4pJp
</commit_message>
<xml_diff>
--- a/files/รัฐธรรมนูญ_๒๕๒๕_แก้ไขเพิ่มเติม.docx
+++ b/files/รัฐธรรมนูญ_๒๕๒๕_แก้ไขเพิ่มเติม.docx
@@ -36850,7 +36850,7 @@
       <w:pageBreakBefore w:val="0"/>
       <w:spacing w:before="0" w:after="60"/>
       <w:ind w:firstLine="1417"/>
-      <w:jc w:val="thaiDistribute"/>
+      <w:jc w:val="left"/>
     </w:pPr>
     <w:rPr>
       <w:rFonts w:ascii="TH Sarabun New" w:hAnsi="TH Sarabun New" w:eastAsia="TH Sarabun New" w:cs="TH Sarabun New"/>
@@ -36908,7 +36908,7 @@
       <w:pageBreakBefore w:val="0"/>
       <w:spacing w:before="120" w:after="0"/>
       <w:ind w:firstLine="1417"/>
-      <w:jc w:val="thaiDistribute"/>
+      <w:jc w:val="left"/>
     </w:pPr>
     <w:rPr>
       <w:rFonts w:ascii="TH Sarabun New" w:hAnsi="TH Sarabun New" w:eastAsia="TH Sarabun New" w:cs="TH Sarabun New"/>
@@ -36926,7 +36926,7 @@
       <w:pageBreakBefore w:val="0"/>
       <w:spacing w:before="0" w:after="0"/>
       <w:ind w:firstLine="1417"/>
-      <w:jc w:val="thaiDistribute"/>
+      <w:jc w:val="left"/>
     </w:pPr>
     <w:rPr>
       <w:rFonts w:ascii="TH Sarabun New" w:hAnsi="TH Sarabun New" w:eastAsia="TH Sarabun New" w:cs="TH Sarabun New"/>
@@ -36944,7 +36944,7 @@
       <w:pageBreakBefore w:val="0"/>
       <w:spacing w:before="0" w:after="0"/>
       <w:ind w:hanging="567" w:left="1984"/>
-      <w:jc w:val="thaiDistribute"/>
+      <w:jc w:val="left"/>
     </w:pPr>
     <w:rPr>
       <w:rFonts w:ascii="TH Sarabun New" w:hAnsi="TH Sarabun New" w:eastAsia="TH Sarabun New" w:cs="TH Sarabun New"/>

</xml_diff>

<commit_message>
Align chapters 20, 25, 26 and 29 with articles 38, 39, 57, 58, 59, 211 and 278
Review found the rewritten chapters contradicting the original text: media
funds that article 38 forbids, a second spectrum regulator beside the one in
article 39, and treaty, disclosure, information and whistleblower rules that
restated chapters 1-16 without referring to them.

Co-Authored-By: Claude Opus 5.5 <noreply@anthropic.com>
Claude-Session: https://claude.ai/code/session_01GWidoSqKEDFLRmf2kvfPx4
</commit_message>
<xml_diff>
--- a/files/รัฐธรรมนูญ_๒๕๒๕_แก้ไขเพิ่มเติม.docx
+++ b/files/รัฐธรรมนูญ_๒๕๒๕_แก้ไขเพิ่มเติม.docx
@@ -14285,7 +14285,7 @@
         <w:t>มาตรา ๔๘๕</w:t>
       </w:r>
       <w:r>
-        <w:t xml:space="preserve">  บุคคลย่อมมีเสรีภาพในการสื่อสารถึงกันโดยทางที่ชอบด้วยกฎหมาย การดักรับ ตรวจ หรือสอดแนมการสื่อสารด้วยวิธีการใด ๆ จะกระทำมิได้ เว้นแต่มีคำสั่งศาลเฉพาะรายบุคคลและเฉพาะคราว รัฐจะบังคับให้ผู้ให้บริการสร้างช่องทางลับเพื่อเข้าถึงข้อมูลที่เข้ารหัสมิได้</w:t>
+        <w:t xml:space="preserve">  บุคคลย่อมมีเสรีภาพในการสื่อสารถึงกันโดยทางที่ชอบด้วยกฎหมาย การดักรับ ตรวจ หรือสอดแนมการสื่อสารด้วยวิธีการใด ๆ จะกระทำมิได้ เว้นแต่มีคำสั่งศาลเฉพาะรายบุคคลและเฉพาะคราวตามมาตรา ๕๘ รัฐจะบังคับให้ผู้ให้บริการสร้างช่องทางลับเพื่อเข้าถึงข้อมูลที่เข้ารหัสมิได้</w:t>
       </w:r>
     </w:p>
     <w:p>
@@ -14375,7 +14375,7 @@
         <w:t>มาตรา ๔๙๑</w:t>
       </w:r>
       <w:r>
-        <w:t xml:space="preserve">  ให้มีคณะกรรมการกิจการโทรคมนาคมซึ่งเป็นองค์กรอิสระ ทำหน้าที่จัดสรรคลื่นความถี่โดยการประมูลที่โปร่งใส กำกับคุณภาพบริการ และป้องกันการผูกขาดโครงข่าย</w:t>
+        <w:t xml:space="preserve">  ให้องค์กรอิสระตามมาตรา ๓๙ ทำหน้าที่จัดสรรคลื่นความถี่สำหรับกิจการโทรคมนาคมโดยการประมูลที่โปร่งใส กำกับคุณภาพบริการ และป้องกันการผูกขาดโครงข่าย</w:t>
       </w:r>
     </w:p>
     <w:p>
@@ -14735,7 +14735,7 @@
         <w:t>มาตรา ๕๑๕</w:t>
       </w:r>
       <w:r>
-        <w:t xml:space="preserve">  ให้คณะกรรมการตามมาตรา ๔๙๑ มีอำนาจตรวจสอบและระงับการเบิกจ่ายเงินกองทุนตามมาตรา ๔๙๙ เมื่อพบว่าการก่อสร้างไม่เป็นไปตามสัญญาหรือมีการสมยอมราคา</w:t>
+        <w:t xml:space="preserve">  ให้องค์กรตามมาตรา ๓๙ มีอำนาจตรวจสอบและระงับการเบิกจ่ายเงินกองทุนตามมาตรา ๔๙๙ เมื่อพบว่าการก่อสร้างไม่เป็นไปตามสัญญาหรือมีการสมยอมราคา</w:t>
       </w:r>
     </w:p>
     <w:p>
@@ -17285,7 +17285,7 @@
         <w:t>มาตรา ๖๘๑</w:t>
       </w:r>
       <w:r>
-        <w:t xml:space="preserve">  รัฐต้องรับรองหลักการว่าผู้ดำรงตำแหน่งทางการเมือง ผู้บริหารองค์กรอิสระ ตุลาการ และข้าราชการระดับสูง ต้องเปิดเผยบัญชีแสดงรายการทรัพย์สินและหนี้สินของตน คู่สมรส และบุตรที่ยังไม่บรรลุนิติภาวะต่อสาธารณะ ทั้งเมื่อเข้ารับตำแหน่ง ทุกปีระหว่างดำรงตำแหน่ง และเมื่อพ้นจากตำแหน่ง</w:t>
+        <w:t xml:space="preserve">  รัฐต้องรับรองหลักการว่าผู้ดำรงตำแหน่งทางการเมืองตามมาตรา ๒๗๘ ผู้บริหารองค์กรอิสระ ตุลาการ และข้าราชการระดับสูง ต้องเปิดเผยบัญชีแสดงรายการทรัพย์สินและหนี้สินของตน คู่สมรส และบุตรที่ยังไม่บรรลุนิติภาวะต่อสาธารณะ ทั้งเมื่อเข้ารับตำแหน่ง ทุกปีระหว่างดำรงตำแหน่ง และเมื่อพ้นจากตำแหน่ง</w:t>
       </w:r>
     </w:p>
     <w:p>
@@ -17315,7 +17315,7 @@
         <w:t>มาตรา ๖๘๓</w:t>
       </w:r>
       <w:r>
-        <w:t xml:space="preserve">  รัฐต้องรับรองหลักการว่าผู้แจ้งเบาะแสการทุจริตโดยสุจริตต้องได้รับความคุ้มครองจากการถูกกลั่นแกล้ง ลงโทษ หรือฟ้องร้อง และการเปิดเผยตัวตนของผู้แจ้งเบาะแสโดยไม่ได้รับความยินยอมจะกระทำมิได้</w:t>
+        <w:t xml:space="preserve">  รัฐต้องรับรองหลักการว่าผู้แจ้งเบาะแสการทุจริตโดยสุจริตต้องได้รับความคุ้มครองตามมาตรา ๕๙จากการถูกกลั่นแกล้ง ลงโทษ หรือฟ้องร้อง และการเปิดเผยตัวตนของผู้แจ้งเบาะแสโดยไม่ได้รับความยินยอมจะกระทำมิได้</w:t>
       </w:r>
     </w:p>
     <w:p>
@@ -17360,7 +17360,7 @@
         <w:t>มาตรา ๖๘๖</w:t>
       </w:r>
       <w:r>
-        <w:t xml:space="preserve">  บุคคลย่อมมีสิทธิเข้าถึงข้อมูลหรือข่าวสารสาธารณะในครอบครองของหน่วยงานของรัฐ เว้นแต่การเปิดเผยจะกระทบต่อความมั่นคงของรัฐ ความปลอดภัยของประชาชน หรือสิทธิส่วนบุคคล ซึ่งหน่วยงานต้องแสดงเหตุผลเป็นรายกรณี</w:t>
+        <w:t xml:space="preserve">  ในการใช้สิทธิเข้าถึงข้อมูลหรือข่าวสารสาธารณะตามมาตรา ๕๗ หน่วยงานของรัฐที่ปฏิเสธการเปิดเผยข้อมูลต้องแสดงเหตุผลเป็นรายกรณีว่าการเปิดเผยจะกระทบต่อความมั่นคงของรัฐ ความปลอดภัยของประชาชน หรือสิทธิส่วนบุคคลอย่างไร</w:t>
       </w:r>
     </w:p>
     <w:p>
@@ -17912,7 +17912,7 @@
         <w:t>มาตรา ๗๒๒</w:t>
       </w:r>
       <w:r>
-        <w:t xml:space="preserve">  รัฐต้องรับรองหลักการว่าการสั่งปิดกิจการสื่อมวลชน การตรวจข่าวก่อนการเผยแพร่ และการสั่งห้ามเสนอข่าวจะกระทำมิได้ ไม่ว่าในภาวะปกติหรือภาวะฉุกเฉิน เว้นแต่มีคำสั่งศาลเฉพาะเนื้อหาที่ขัดต่อกฎหมาย</w:t>
+        <w:t xml:space="preserve">  รัฐต้องรับรองหลักการว่าการสั่งปิดกิจการสื่อมวลชน การตรวจข่าวก่อนการเผยแพร่ และการสั่งห้ามเสนอข่าวจะกระทำมิได้ ไม่ว่าในภาวะปกติหรือภาวะฉุกเฉิน เว้นแต่ในภาวะการสงครามหรือการรบตามมาตรา ๓๘ หรือมีคำสั่งศาลเฉพาะเนื้อหาที่ขัดต่อกฎหมาย</w:t>
       </w:r>
     </w:p>
     <w:p>
@@ -18032,7 +18032,7 @@
         <w:t>มาตรา ๗๓๐</w:t>
       </w:r>
       <w:r>
-        <w:t xml:space="preserve">  ให้คณะกรรมการกิจการกระจายเสียงและกิจการโทรทัศน์ซึ่งเป็นองค์กรอิสระเป็นผู้กำกับดูแลการใช้คลื่นความถี่ โดยจะนำอำนาจกำกับดูแลมาใช้ลงโทษสื่อเพราะเนื้อหาที่วิพากษ์วิจารณ์รัฐบาลมิได้</w:t>
+        <w:t xml:space="preserve">  ให้องค์กรอิสระตามมาตรา ๓๙ เป็นผู้กำกับดูแลกิจการกระจายเสียงและกิจการโทรทัศน์ โดยจะนำอำนาจกำกับดูแลมาใช้ลงโทษสื่อเพราะเนื้อหาที่วิพากษ์วิจารณ์รัฐบาลมิได้</w:t>
       </w:r>
     </w:p>
     <w:p>
@@ -18047,7 +18047,7 @@
         <w:t>มาตรา ๗๓๑</w:t>
       </w:r>
       <w:r>
-        <w:t xml:space="preserve">  ให้คณะกรรมการตามมาตรา ๗๓๐ มีหน้าที่พิจารณาการควบรวมกิจการสื่อมวลชนก่อนมีผลบังคับ และสั่งระงับการควบรวมที่ทำให้ความหลากหลายของข่าวสารลดลงอย่างมีนัยสำคัญ</w:t>
+        <w:t xml:space="preserve">  ให้องค์กรตามมาตรา ๓๙ มีหน้าที่พิจารณาการควบรวมกิจการสื่อมวลชนก่อนมีผลบังคับ และสั่งระงับการควบรวมที่ทำให้ความหลากหลายของข่าวสารลดลงอย่างมีนัยสำคัญ</w:t>
       </w:r>
     </w:p>
     <w:p>
@@ -18107,7 +18107,7 @@
         <w:t>มาตรา ๗๓๕</w:t>
       </w:r>
       <w:r>
-        <w:t xml:space="preserve">  ให้คณะกรรมการตามมาตรา ๗๓๐ จัดให้สื่อชุมชนได้รับใบอนุญาตโดยขั้นตอนที่ง่ายและค่าธรรมเนียมต่ำ และรับรองสถานะของสื่อชุมชนแยกจากสื่อเชิงพาณิชย์</w:t>
+        <w:t xml:space="preserve">  ให้องค์กรตามมาตรา ๓๙ จัดให้สื่อชุมชนได้รับใบอนุญาตโดยขั้นตอนที่ง่ายและค่าธรรมเนียมต่ำ และรับรองสถานะของสื่อชุมชนแยกจากสื่อเชิงพาณิชย์</w:t>
       </w:r>
     </w:p>
     <w:p>
@@ -18137,7 +18137,7 @@
         <w:t>มาตรา ๗๓๗</w:t>
       </w:r>
       <w:r>
-        <w:t xml:space="preserve">  ให้มีกองทุนส่งเสริมสื่อปลอดภัยและสร้างสรรค์ ซึ่งบริหารโดยคณะกรรมการที่ไม่ขึ้นกับฝ่ายบริหาร เพื่อสนับสนุนการผลิตข่าวเชิงสืบสวนและงานข่าวในประเด็นสาธารณะ</w:t>
+        <w:t xml:space="preserve">  ให้มีกองทุนพัฒนาวิชาชีพสื่อมวลชน ซึ่งบริหารโดยคณะกรรมการที่ไม่ขึ้นกับฝ่ายบริหาร เพื่อให้ทุนฝึกอบรมและทุนการศึกษาแก่ผู้ประกอบวิชาชีพเป็นรายบุคคล ทั้งนี้ การจัดสรรเงินกองทุนจะเป็นการอุดหนุนกิจการสื่อมวลชนของเอกชนตามที่มาตรา ๓๘ ห้ามไว้มิได้</w:t>
       </w:r>
     </w:p>
     <w:p>
@@ -18167,7 +18167,7 @@
         <w:t>มาตรา ๗๓๙</w:t>
       </w:r>
       <w:r>
-        <w:t xml:space="preserve">  ให้มีกองทุนส่งเสริมความหลากหลายของสื่อ เพื่อสนับสนุนผู้ประกอบการสื่อรายใหม่และสื่อท้องถิ่นที่ไม่อยู่ในเครือของกลุ่มทุนสื่อรายใหญ่</w:t>
+        <w:t xml:space="preserve">  รัฐต้องลดอุปสรรคการเข้าสู่ตลาดของผู้ประกอบการสื่อรายใหม่และสื่อท้องถิ่นที่ไม่อยู่ในเครือของกลุ่มทุนสื่อรายใหญ่ เช่น ค่าธรรมเนียมใบอนุญาตที่ต่ำและการเข้าถึงโครงข่ายอย่างเท่าเทียม โดยไม่เป็นการให้เงินอุดหนุนที่มาตรา ๓๘ ห้ามไว้</w:t>
       </w:r>
     </w:p>
     <w:p>
@@ -18227,7 +18227,7 @@
         <w:t>มาตรา ๗๔๓</w:t>
       </w:r>
       <w:r>
-        <w:t xml:space="preserve">  ให้มีกองทุนพัฒนาสื่อชุมชน เพื่อสนับสนุนอุปกรณ์ การฝึกอบรมผู้ผลิตรายการในชุมชน และค่าใช้จ่ายในการดำเนินงานของสื่อชุมชน</w:t>
+        <w:t xml:space="preserve">  ให้สื่อสาธารณะตามมาตรา ๗๒๕ จัดการฝึกอบรมผู้ผลิตรายการในชุมชน ให้ยืมอุปกรณ์การผลิต และจัดเวลาออกอากาศให้แก่รายการที่ชุมชนผลิต โดยไม่เป็นการให้เงินอุดหนุนแก่สื่อชุมชนโดยตรง</w:t>
       </w:r>
     </w:p>
     <w:p>
@@ -18407,7 +18407,7 @@
         <w:t>มาตรา ๗๕๕</w:t>
       </w:r>
       <w:r>
-        <w:t xml:space="preserve">  ให้คณะกรรมการตามมาตรา ๗๓๐ มีอำนาจสืบหาผู้ถือหุ้นที่แท้จริงของกิจการสื่อมวลชน และสั่งให้จำหน่ายหุ้นที่ถือไว้แทนผู้ดำรงตำแหน่งทางการเมือง</w:t>
+        <w:t xml:space="preserve">  ให้องค์กรตามมาตรา ๓๙ มีอำนาจสืบหาผู้ถือหุ้นที่แท้จริงของกิจการสื่อมวลชน และสั่งให้จำหน่ายหุ้นที่ถือไว้แทนผู้ดำรงตำแหน่งทางการเมือง</w:t>
       </w:r>
     </w:p>
     <w:p>
@@ -18467,7 +18467,7 @@
         <w:t>มาตรา ๗๕๙</w:t>
       </w:r>
       <w:r>
-        <w:t xml:space="preserve">  ให้คณะกรรมการตามมาตรา ๗๓๐ มีอำนาจตรวจสอบสื่อที่ได้รับใบอนุญาตเป็นสื่อชุมชนแต่ดำเนินการเชิงพาณิชย์หรือถูกครอบงำโดยพรรคการเมือง และเพิกถอนสถานะสื่อชุมชนนั้น</w:t>
+        <w:t xml:space="preserve">  ให้องค์กรตามมาตรา ๓๙ มีอำนาจตรวจสอบสื่อที่ได้รับใบอนุญาตเป็นสื่อชุมชนแต่ดำเนินการเชิงพาณิชย์หรือถูกครอบงำโดยพรรคการเมือง และเพิกถอนสถานะสื่อชุมชนนั้น</w:t>
       </w:r>
     </w:p>
     <w:p>
@@ -19733,7 +19733,7 @@
         <w:t>มาตรา ๘๔๑</w:t>
       </w:r>
       <w:r>
-        <w:t xml:space="preserve">  รัฐต้องรับรองหลักการว่าหนังสือสัญญาที่มีบทเปลี่ยนแปลงอาณาเขตไทย เขตอำนาจแห่งรัฐ หรือที่ผูกพันการค้า การลงทุน งบประมาณ หรือการส่งกำลังทหารไปนอกราชอาณาจักร จะมีผลผูกพันประเทศได้ต่อเมื่อได้รับความเห็นชอบจากรัฐสภาแล้ว</w:t>
+        <w:t xml:space="preserve">  รัฐต้องรับรองหลักการว่า นอกจากหนังสือสัญญาตามมาตรา ๒๑๑ แล้ว หนังสือสัญญาที่ผูกพันการค้า การลงทุน งบประมาณ หรือการส่งกำลังทหารไปนอกราชอาณาจักร จะมีผลผูกพันประเทศได้ต่อเมื่อได้รับความเห็นชอบจากรัฐสภาแล้ว</w:t>
       </w:r>
     </w:p>
     <w:p>

</xml_diff>

<commit_message>
Fix 327 article references in chapters 1-16 and the transitional provisions
Most references inside ม.๑-๓๖๐ still carried 2540 numbering (e.g. "วุฒิสภามีมติ
ตามมาตรา ๓๐๘ ให้ถอดถอน", where ม.๓๐๘ is the public prosecutor commission).
tools/charter/fix_xrefs.py matches each article to its 2540 source and points
each reference where that source article now lives; 12 were decided by hand.

Also: the placeholder articles 137, 186, 187 and 284 no longer claim ranges
held by other articles, ม.๓๑ loses a stray "มาตรา ๓๒" label, ม.๒๙๘ cites
ม.๒๗๘ instead of a non-existent ๓๑๔/๑, and the ombudsman is called
ผู้ตรวจการแผ่นดินของรัฐสภา throughout. ม.๓๖๔ and ม.๖๘๑ now refer to the
articles they extend (๓๐๔, ๒๗๘, ๒๙๘). The special chapter is untouched.

Co-Authored-By: Claude Opus 5.5 <noreply@anthropic.com>
Claude-Session: https://claude.ai/code/session_01GWidoSqKEDFLRmf2kvfPx4
</commit_message>
<xml_diff>
--- a/files/รัฐธรรมนูญ_๒๕๒๕_แก้ไขเพิ่มเติม.docx
+++ b/files/รัฐธรรมนูญ_๒๕๒๕_แก้ไขเพิ่มเติม.docx
@@ -819,7 +819,7 @@
         <w:pStyle w:val="วรรค"/>
       </w:pPr>
       <w:r>
-        <w:t>มาตรา ๓๒ บุคคลจะไม่ต้องรับโทษอาญา เว้นแต่จะได้กระทำการอันกฎหมายที่ใช้อยู่ในเวลาที่กระทำนั้นบัญญัติเป็นความผิดและกำหนดโทษไว้ และโทษที่จะลงแก่บุคคลนั้นจะหนักกว่าโทษที่กำหนดไว้ในกฎหมายที่ใช้อยู่ในเวลาที่กระทำความผิดมิได้</w:t>
+        <w:t>บุคคลจะไม่ต้องรับโทษอาญา เว้นแต่จะได้กระทำการอันกฎหมายที่ใช้อยู่ในเวลาที่กระทำนั้นบัญญัติเป็นความผิดและกำหนดโทษไว้ และโทษที่จะลงแก่บุคคลนั้นจะหนักกว่าโทษที่กำหนดไว้ในกฎหมายที่ใช้อยู่ในเวลาที่กระทำความผิดมิได้</w:t>
       </w:r>
     </w:p>
     <w:p>
@@ -2097,7 +2097,7 @@
         <w:pStyle w:val="วรรค"/>
       </w:pPr>
       <w:r>
-        <w:t>ในการแถลงนโยบายต่อรัฐสภาตามมาตรา ๒๑๑ คณะรัฐมนตรีที่จะเข้าบริหารราชการแผ่นดิน ต้องชี้แจงต่อรัฐสภาให้ชัดแจ้งว่าจะดำเนินการใดเพื่อบริหารราชการแผ่นดินให้เป็นไปตามแนวนโยบายพื้นฐานแห่งรัฐตามที่บัญญัติไว้ในหมวดนี้ และต้องจัดทำรายงานแสดงผลการดำเนินการรวมทั้งปัญหาและอุปสรรค เสนอต่อรัฐสภาปีละหนึ่งครั้ง</w:t>
+        <w:t>ในการแถลงนโยบายต่อรัฐสภาตามมาตรา ๑๙๘ คณะรัฐมนตรีที่จะเข้าบริหารราชการแผ่นดิน ต้องชี้แจงต่อรัฐสภาให้ชัดแจ้งว่าจะดำเนินการใดเพื่อบริหารราชการแผ่นดินให้เป็นไปตามแนวนโยบายพื้นฐานแห่งรัฐตามที่บัญญัติไว้ในหมวดนี้ และต้องจัดทำรายงานแสดงผลการดำเนินการรวมทั้งปัญหาและอุปสรรค เสนอต่อรัฐสภาปีละหนึ่งครั้ง</w:t>
       </w:r>
     </w:p>
     <w:p>
@@ -2297,7 +2297,7 @@
         <w:t>มาตรา ๙๗</w:t>
       </w:r>
       <w:r>
-        <w:t xml:space="preserve">  สมาชิกสภาผู้แทนราษฎรหรือสมาชิกวุฒิสภาจำนวนไม่น้อยกว่าหนึ่งในสิบของจำนวนสมาชิกทั้งหมดเท่าที่มีอยู่ของแต่ละสภา มีสิทธิเข้าชื่อร้องต่อประธานแห่งสภาที่ตนเป็นสมาชิกว่าสมาชิกภาพของสมาชิกคนใดคนหนึ่งแห่งสภานั้นสิ้นสุดลงตามมาตรา ๑๑๘ (๓) (๔) (๕) (๖) (๗) (๘) (๙) (๑๑) หรือ (๑๒) หรือมาตรา ๑๓๓ (๓) (๔) (๕) (๖) (๗) (๙) หรือ (๑๐) แล้วแต่กรณี และให้ประธานแห่งสภาที่ได้รับคำร้องส่งคำร้องนั้นไปยังศาลรัฐธรรมนูญเพื่อวินิจฉัยว่าสมาชิกภาพของสมาชิกผู้นั้นสิ้นสุดลงหรือไม่</w:t>
+        <w:t xml:space="preserve">  สมาชิกสภาผู้แทนราษฎรหรือสมาชิกวุฒิสภาจำนวนไม่น้อยกว่าหนึ่งในสิบของจำนวนสมาชิกทั้งหมดเท่าที่มีอยู่ของแต่ละสภา มีสิทธิเข้าชื่อร้องต่อประธานแห่งสภาที่ตนเป็นสมาชิกว่าสมาชิกภาพของสมาชิกคนใดคนหนึ่งแห่งสภานั้นสิ้นสุดลงตามมาตรา ๑๑๙ (๓) (๔) (๕) (๖) (๗) (๘) (๙) (๑๑) หรือ (๑๒) หรือมาตรา ๑๓๔ (๓) (๔) (๕) (๖) (๗) (๙) หรือ (๑๐) แล้วแต่กรณี และให้ประธานแห่งสภาที่ได้รับคำร้องส่งคำร้องนั้นไปยังศาลรัฐธรรมนูญเพื่อวินิจฉัยว่าสมาชิกภาพของสมาชิกผู้นั้นสิ้นสุดลงหรือไม่</w:t>
       </w:r>
     </w:p>
     <w:p>
@@ -2347,7 +2347,7 @@
         <w:t>มาตรา ๙๙</w:t>
       </w:r>
       <w:r>
-        <w:t xml:space="preserve">  สภาผู้แทนราษฎรประกอบด้วยสมาชิกจำนวนห้าร้อยคน โดยเป็นสมาชิกซึ่งมาจากการเลือกตั้งแบบบัญชีรายชื่อตามมาตรา ๙๙ จำนวนหนึ่งร้อยคน และสมาชิกซึ่งมาจากการเลือกตั้งแบบแบ่งเขตเลือกตั้งตามมาตรา ๑๐๒ จำนวนสี่ร้อยคน</w:t>
+        <w:t xml:space="preserve">  สภาผู้แทนราษฎรประกอบด้วยสมาชิกจำนวนห้าร้อยคน โดยเป็นสมาชิกซึ่งมาจากการเลือกตั้งแบบบัญชีรายชื่อตามมาตรา ๑๐๐ จำนวนหนึ่งร้อยคน และสมาชิกซึ่งมาจากการเลือกตั้งแบบแบ่งเขตเลือกตั้งตามมาตรา ๑๐๓ จำนวนสี่ร้อยคน</w:t>
       </w:r>
     </w:p>
     <w:p>
@@ -2406,7 +2406,7 @@
       <w:r>
         <w:t>(๒)</w:t>
         <w:tab/>
-        <w:t>ไม่ซ้ำกับรายชื่อในบัญชีที่พรรคการเมืองอื่นจัดทำขึ้น และไม่ซ้ำกับรายชื่อของผู้สมัครรับเลือกตั้งแบบแบ่งเขตเลือกตั้งตามมาตรา ๑๐๒ และ</w:t>
+        <w:t>ไม่ซ้ำกับรายชื่อในบัญชีที่พรรคการเมืองอื่นจัดทำขึ้น และไม่ซ้ำกับรายชื่อของผู้สมัครรับเลือกตั้งแบบแบ่งเขตเลือกตั้งตามมาตรา ๑๐๓ และ</w:t>
       </w:r>
     </w:p>
     <w:p>
@@ -2462,7 +2462,7 @@
         <w:t>มาตรา ๑๐๒</w:t>
       </w:r>
       <w:r>
-        <w:t xml:space="preserve">  ภายใต้บังคับมาตรา ๑๑๙ (๑) ในกรณีที่มีเหตุใด ๆ ทำให้ในระหว่างอายุของสภาผู้แทนราษฎรมีสมาชิกซึ่งได้รับเลือกตั้งจากการเลือกตั้งแบบบัญชีรายชื่อมีจำนวนไม่ถึงหนึ่งร้อยคน ให้สมาชิกซึ่งมาจากการเลือกตั้งแบบบัญชีรายชื่อประกอบด้วยสมาชิกเท่าที่มีอยู่</w:t>
+        <w:t xml:space="preserve">  ภายใต้บังคับมาตรา ๑๒๐ (๑) ในกรณีที่มีเหตุใด ๆ ทำให้ในระหว่างอายุของสภาผู้แทนราษฎรมีสมาชิกซึ่งได้รับเลือกตั้งจากการเลือกตั้งแบบบัญชีรายชื่อมีจำนวนไม่ถึงหนึ่งร้อยคน ให้สมาชิกซึ่งมาจากการเลือกตั้งแบบบัญชีรายชื่อประกอบด้วยสมาชิกเท่าที่มีอยู่</w:t>
       </w:r>
     </w:p>
     <w:p>
@@ -2555,7 +2555,7 @@
         <w:pStyle w:val="วรรค"/>
       </w:pPr>
       <w:r>
-        <w:t>ในการเลือกตั้งสมาชิกสภาผู้แทนราษฎรแทนตำแหน่งสมาชิกสภาผู้แทนราษฎรที่มาจากการเลือกตั้งแบบแบ่งเขตเลือกตั้งซึ่งว่างลงตามมาตรา ๑๑๙ (๒) ให้ผู้มีสิทธิเลือกตั้งสมาชิกสภาผู้แทนราษฎรมีสิทธิออกเสียงลงคะแนนเลือกตั้งผู้สมัครรับเลือกตั้งในเขตเลือกตั้งนั้นได้หนึ่งคน</w:t>
+        <w:t>ในการเลือกตั้งสมาชิกสภาผู้แทนราษฎรแทนตำแหน่งสมาชิกสภาผู้แทนราษฎรที่มาจากการเลือกตั้งแบบแบ่งเขตเลือกตั้งซึ่งว่างลงตามมาตรา ๑๒๐ (๒) ให้ผู้มีสิทธิเลือกตั้งสมาชิกสภาผู้แทนราษฎรมีสิทธิออกเสียงลงคะแนนเลือกตั้งผู้สมัครรับเลือกตั้งในเขตเลือกตั้งนั้นได้หนึ่งคน</w:t>
       </w:r>
     </w:p>
     <w:p>
@@ -2579,7 +2579,7 @@
         <w:pStyle w:val="วรรค"/>
       </w:pPr>
       <w:r>
-        <w:t>การนับคะแนนและการประกาศคะแนนที่บัญชีรายชื่อแต่ละบัญชีได้รับในแต่ละเขตเลือกตั้งตามมาตรา ๑๐๓ ให้นำบทบัญญัติวรรคสี่มาใช้บังคับโดยอนุโลม</w:t>
+        <w:t>การนับคะแนนและการประกาศคะแนนที่บัญชีรายชื่อแต่ละบัญชีได้รับในแต่ละเขตเลือกตั้งตามมาตรา ๑๐๔ ให้นำบทบัญญัติวรรคสี่มาใช้บังคับโดยอนุโลม</w:t>
       </w:r>
     </w:p>
     <w:p>
@@ -2632,7 +2632,7 @@
         <w:pStyle w:val="วรรค"/>
       </w:pPr>
       <w:r>
-        <w:t>ผู้มีสิทธิเลือกตั้งซึ่งอยู่นอกเขตเลือกตั้งตามมาตรา ๑๐๓ ที่ตนมีชื่ออยู่ในทะเบียนบ้าน หรือมีชื่ออยู่ในทะเบียนบ้านในเขตเลือกตั้งเป็นเวลาน้อยกว่าเก้าสิบวันนับถึงวันเลือกตั้ง หรือมีถิ่นที่อยู่นอกราชอาณาจักร ย่อมมีสิทธิออกเสียงลงคะแนนเลือกตั้ง ทั้งนี้ ตามหลักเกณฑ์ วิธีการ และเงื่อนไขที่กฎหมายประกอบรัฐธรรมนูญว่าด้วยการเลือกตั้งสมาชิกสภาผู้แทนราษฎรและสมาชิกวุฒิสภาบัญญัติ</w:t>
+        <w:t>ผู้มีสิทธิเลือกตั้งซึ่งอยู่นอกเขตเลือกตั้งตามมาตรา ๑๐๔ ที่ตนมีชื่ออยู่ในทะเบียนบ้าน หรือมีชื่ออยู่ในทะเบียนบ้านในเขตเลือกตั้งเป็นเวลาน้อยกว่าเก้าสิบวันนับถึงวันเลือกตั้ง หรือมีถิ่นที่อยู่นอกราชอาณาจักร ย่อมมีสิทธิออกเสียงลงคะแนนเลือกตั้ง ทั้งนี้ ตามหลักเกณฑ์ วิธีการ และเงื่อนไขที่กฎหมายประกอบรัฐธรรมนูญว่าด้วยการเลือกตั้งสมาชิกสภาผู้แทนราษฎรและสมาชิกวุฒิสภาบัญญัติ</w:t>
       </w:r>
     </w:p>
     <w:p>
@@ -2852,7 +2852,7 @@
       <w:r>
         <w:t>(๓)</w:t>
         <w:tab/>
-        <w:t>เป็นบุคคลผู้มีลักษณะต้องห้ามมิให้ใช้สิทธิเลือกตั้งสมาชิกสภาผู้แทนราษฎรตามมาตรา ๑๐๖ (๑) (๒) หรือ (๔)</w:t>
+        <w:t>เป็นบุคคลผู้มีลักษณะต้องห้ามมิให้ใช้สิทธิเลือกตั้งสมาชิกสภาผู้แทนราษฎรตามมาตรา ๑๐๗ (๑) (๒) หรือ (๔)</w:t>
       </w:r>
     </w:p>
     <w:p>
@@ -2952,7 +2952,7 @@
       <w:r>
         <w:t>(๑๓)</w:t>
         <w:tab/>
-        <w:t>อยู่ในระหว่างต้องห้ามมิให้ดำรงตำแหน่งทางการเมืองตามมาตรา ๒๙๕</w:t>
+        <w:t>อยู่ในระหว่างต้องห้ามมิให้ดำรงตำแหน่งทางการเมืองตามมาตรา ๒๘๒</w:t>
       </w:r>
     </w:p>
     <w:p>
@@ -2962,7 +2962,7 @@
       <w:r>
         <w:t>(๑๔)</w:t>
         <w:tab/>
-        <w:t>เคยถูกวุฒิสภามีมติตามมาตรา ๓๐๘ ให้ถอดถอนออกจากตำแหน่งและยังไม่พ้นกำหนดห้าปีนับแต่วันที่วุฒิสภามีมติจนถึงวันเลือกตั้ง</w:t>
+        <w:t>เคยถูกวุฒิสภามีมติตามมาตรา ๒๘๙ ให้ถอดถอนออกจากตำแหน่งและยังไม่พ้นกำหนดห้าปีนับแต่วันที่วุฒิสภามีมติจนถึงวันเลือกตั้ง</w:t>
       </w:r>
     </w:p>
     <w:p>
@@ -3257,7 +3257,7 @@
       <w:r>
         <w:t>(๔)</w:t>
         <w:tab/>
-        <w:t>ขาดคุณสมบัติตามมาตรา ๑๐๗</w:t>
+        <w:t>ขาดคุณสมบัติตามมาตรา ๑๐๘</w:t>
       </w:r>
     </w:p>
     <w:p>
@@ -3267,7 +3267,7 @@
       <w:r>
         <w:t>(๕)</w:t>
         <w:tab/>
-        <w:t>มีลักษณะต้องห้ามตามมาตรา ๑๐๙ (๑) (๒) (๓) (๕) (๖) (๗) (๘) (๙) (๑๐) (๑๑) (๑๒) (๑๓) หรือ (๑๔)</w:t>
+        <w:t>มีลักษณะต้องห้ามตามมาตรา ๑๑๐ (๑) (๒) (๓) (๕) (๖) (๗) (๘) (๙) (๑๐) (๑๑) (๑๒) (๑๓) หรือ (๑๔)</w:t>
       </w:r>
     </w:p>
     <w:p>
@@ -3277,7 +3277,7 @@
       <w:r>
         <w:t>(๖)</w:t>
         <w:tab/>
-        <w:t>กระทำการอันต้องห้ามตามมาตรา ๑๑๐ หรือมาตรา ๑๑๑</w:t>
+        <w:t>กระทำการอันต้องห้ามตามมาตรา ๑๑๑ หรือมาตรา ๑๑๒</w:t>
       </w:r>
     </w:p>
     <w:p>
@@ -3297,7 +3297,7 @@
       <w:r>
         <w:t>(๘)</w:t>
         <w:tab/>
-        <w:t>ลาออกจากพรรคการเมืองที่ตนเป็นสมาชิก หรือพรรคการเมืองที่ตนเป็นสมาชิกมีมติด้วยคะแนนเสียงไม่น้อยกว่าสามในสี่ของที่ประชุมร่วมของคณะกรรมการบริหารของพรรคการเมืองและสมาชิกสภาผู้แทนราษฎรที่สังกัดพรรคการเมืองนั้น ให้พ้นจากการเป็นสมาชิกของพรรคการเมืองที่ตนเป็นสมาชิก ในกรณีเช่นนี้ ให้ถือว่าสิ้นสุดสมาชิกภาพนับแต่วันที่ลาออกหรือพรรคการเมืองมีมติ เว้นแต่สมาชิกสภาผู้แทนราษฎรผู้นั้นได้อุทธรณ์ต่อศาลรัฐธรรมนูญภายในสามสิบวันนับแต่วันที่พรรคการเมืองมีมติคัดค้านว่ามติดังกล่าวมีลักษณะตามมาตรา ๔๗ วรรคสาม ถ้าศาลรัฐธรรมนูญวินิจฉัยว่ามติดังกล่าวมิได้มีลักษณะตามมาตรา ๔๗ วรรคสาม ให้ถือว่าสมาชิกภาพสิ้นสุดลงนับแต่วันที่ศาลรัฐธรรมนูญวินิจฉัย แต่ถ้าศาลรัฐธรรมนูญวินิจฉัยว่ามติดังกล่าวมีลักษณะตามมาตรา ๔๗ วรรคสาม สมาชิกสภาผู้แทนราษฎรผู้นั้นอาจเข้าเป็นสมาชิกของพรรคการเมืองอื่นได้ภายในสามสิบวันนับแต่วันที่ศาลรัฐธรรมนูญวินิจฉัย</w:t>
+        <w:t>ลาออกจากพรรคการเมืองที่ตนเป็นสมาชิก หรือพรรคการเมืองที่ตนเป็นสมาชิกมีมติด้วยคะแนนเสียงไม่น้อยกว่าสามในสี่ของที่ประชุมร่วมของคณะกรรมการบริหารของพรรคการเมืองและสมาชิกสภาผู้แทนราษฎรที่สังกัดพรรคการเมืองนั้น ให้พ้นจากการเป็นสมาชิกของพรรคการเมืองที่ตนเป็นสมาชิก ในกรณีเช่นนี้ ให้ถือว่าสิ้นสุดสมาชิกภาพนับแต่วันที่ลาออกหรือพรรคการเมืองมีมติ เว้นแต่สมาชิกสภาผู้แทนราษฎรผู้นั้นได้อุทธรณ์ต่อศาลรัฐธรรมนูญภายในสามสิบวันนับแต่วันที่พรรคการเมืองมีมติคัดค้านว่ามติดังกล่าวมีลักษณะตามมาตรา ๔๖ วรรคสาม ถ้าศาลรัฐธรรมนูญวินิจฉัยว่ามติดังกล่าวมิได้มีลักษณะตามมาตรา ๔๖ วรรคสาม ให้ถือว่าสมาชิกภาพสิ้นสุดลงนับแต่วันที่ศาลรัฐธรรมนูญวินิจฉัย แต่ถ้าศาลรัฐธรรมนูญวินิจฉัยว่ามติดังกล่าวมีลักษณะตามมาตรา ๔๖ วรรคสาม สมาชิกสภาผู้แทนราษฎรผู้นั้นอาจเข้าเป็นสมาชิกของพรรคการเมืองอื่นได้ภายในสามสิบวันนับแต่วันที่ศาลรัฐธรรมนูญวินิจฉัย</w:t>
       </w:r>
     </w:p>
     <w:p>
@@ -3317,7 +3317,7 @@
       <w:r>
         <w:t>(๑๐)</w:t>
         <w:tab/>
-        <w:t>วุฒิสภามีมติตามมาตรา ๓๐๘ ให้ถอดถอนออกจากตำแหน่ง หรือศาลรัฐธรรมนูญมีคำวินิจฉัยให้พ้นจากสมาชิกภาพตามมาตรา ๙๖ ในกรณีเช่นนี้ ให้ถือว่าสิ้นสุดสมาชิกภาพนับแต่วันที่วุฒิสภามีมติหรือศาลรัฐธรรมนูญมีคำวินิจฉัย แล้วแต่กรณี</w:t>
+        <w:t>วุฒิสภามีมติตามมาตรา ๒๘๙ ให้ถอดถอนออกจากตำแหน่ง หรือศาลรัฐธรรมนูญมีคำวินิจฉัยให้พ้นจากสมาชิกภาพตามมาตรา ๙๗ ในกรณีเช่นนี้ ให้ถือว่าสิ้นสุดสมาชิกภาพนับแต่วันที่วุฒิสภามีมติหรือศาลรัฐธรรมนูญมีคำวินิจฉัย แล้วแต่กรณี</w:t>
       </w:r>
     </w:p>
     <w:p>
@@ -3370,7 +3370,7 @@
       <w:r>
         <w:t>(๑)</w:t>
         <w:tab/>
-        <w:t>ในกรณีที่ตำแหน่งที่ว่างเป็นตำแหน่งสมาชิกสภาผู้แทนราษฎรในบัญชีรายชื่อที่พรรคการเมืองใดจัดทำขึ้นตามมาตรา ๙๙ ให้ประธานสภาผู้แทนราษฎรประกาศในราชกิจจานุเบกษาภายในเจ็ดวันนับแต่วันที่ตำแหน่งนั้นว่างลง ให้ผู้มีชื่ออยู่ในบัญชีรายชื่อของพรรคการเมืองนั้นในลำดับถัดไป เลื่อนขึ้นมาเป็นสมาชิกสภาผู้แทนราษฎรแทน</w:t>
+        <w:t>ในกรณีที่ตำแหน่งที่ว่างเป็นตำแหน่งสมาชิกสภาผู้แทนราษฎรในบัญชีรายชื่อที่พรรคการเมืองใดจัดทำขึ้นตามมาตรา ๑๐๐ ให้ประธานสภาผู้แทนราษฎรประกาศในราชกิจจานุเบกษาภายในเจ็ดวันนับแต่วันที่ตำแหน่งนั้นว่างลง ให้ผู้มีชื่ออยู่ในบัญชีรายชื่อของพรรคการเมืองนั้นในลำดับถัดไป เลื่อนขึ้นมาเป็นสมาชิกสภาผู้แทนราษฎรแทน</w:t>
       </w:r>
     </w:p>
     <w:p>
@@ -3380,7 +3380,7 @@
       <w:r>
         <w:t>(๒)</w:t>
         <w:tab/>
-        <w:t>ในกรณีที่ตำแหน่งที่ว่างเป็นตำแหน่งสมาชิกสภาผู้แทนราษฎรที่มาจากการเลือกตั้งแบบแบ่งเขตเลือกตั้งตามมาตรา ๑๐๒ ให้มีการเลือกตั้งสมาชิกสภาผู้แทนราษฎรขึ้นแทนภายในสี่สิบห้าวันนับแต่วันที่ตำแหน่งนั้นว่าง เว้นแต่อายุของสภาผู้แทนราษฎรจะเหลือไม่ถึงหนึ่งร้อยแปดสิบวัน</w:t>
+        <w:t>ในกรณีที่ตำแหน่งที่ว่างเป็นตำแหน่งสมาชิกสภาผู้แทนราษฎรที่มาจากการเลือกตั้งแบบแบ่งเขตเลือกตั้งตามมาตรา ๑๐๓ ให้มีการเลือกตั้งสมาชิกสภาผู้แทนราษฎรขึ้นแทนภายในสี่สิบห้าวันนับแต่วันที่ตำแหน่งนั้นว่าง เว้นแต่อายุของสภาผู้แทนราษฎรจะเหลือไม่ถึงหนึ่งร้อยแปดสิบวัน</w:t>
       </w:r>
     </w:p>
     <w:p>
@@ -3427,7 +3427,7 @@
         <w:pStyle w:val="วรรค"/>
       </w:pPr>
       <w:r>
-        <w:t>ผู้นำฝ่ายค้านในสภาผู้แทนราษฎรย่อมพ้นจากตำแหน่งเมื่อขาดคุณสมบัติดังกล่าวในวรรคหนึ่งหรือวรรคสอง และให้นำบทบัญญัติมาตรา ๑๕๒ มาใช้บังคับโดยอนุโลม ในกรณีเช่นนี้พระมหากษัตริย์จะได้ทรงแต่งตั้งผู้นำฝ่ายค้านในสภาผู้แทนราษฎรแทนตำแหน่งที่ว่าง</w:t>
+        <w:t>ผู้นำฝ่ายค้านในสภาผู้แทนราษฎรย่อมพ้นจากตำแหน่งเมื่อขาดคุณสมบัติดังกล่าวในวรรคหนึ่งหรือวรรคสอง และให้นำบทบัญญัติมาตรา ๑๔๑ มาใช้บังคับโดยอนุโลม ในกรณีเช่นนี้พระมหากษัตริย์จะได้ทรงแต่งตั้งผู้นำฝ่ายค้านในสภาผู้แทนราษฎรแทนตำแหน่งที่ว่าง</w:t>
       </w:r>
     </w:p>
     <w:p>
@@ -3485,7 +3485,7 @@
         <w:pStyle w:val="วรรค"/>
       </w:pPr>
       <w:r>
-        <w:t>การคำนวณเกณฑ์จำนวนสมาชิกวุฒิสภาที่แต่ละจังหวัดจะพึงมี ให้คำนวณตามวิธีที่บัญญัติไว้ในมาตรา ๑๐๒ วรรคสอง วรรคสาม และวรรคสี่ โดยอนุโลม</w:t>
+        <w:t>การคำนวณเกณฑ์จำนวนสมาชิกวุฒิสภาที่แต่ละจังหวัดจะพึงมี ให้คำนวณตามวิธีที่บัญญัติไว้ในมาตรา ๑๐๓ วรรคสอง วรรคสาม และวรรคสี่ โดยอนุโลม</w:t>
       </w:r>
     </w:p>
     <w:p>
@@ -3531,7 +3531,7 @@
         <w:t>มาตรา ๑๒๕</w:t>
       </w:r>
       <w:r>
-        <w:t xml:space="preserve">  ให้นำบทบัญญัติมาตรา ๑๐๕ และมาตรา ๑๐๖ มาใช้บังคับกับคุณสมบัติและลักษณะต้องห้ามของผู้มีสิทธิเลือกตั้งสมาชิกวุฒิสภาด้วย โดยอนุโลม</w:t>
+        <w:t xml:space="preserve">  ให้นำบทบัญญัติมาตรา ๑๐๖ และมาตรา ๑๐๗ มาใช้บังคับกับคุณสมบัติและลักษณะต้องห้ามของผู้มีสิทธิเลือกตั้งสมาชิกวุฒิสภาด้วย โดยอนุโลม</w:t>
       </w:r>
     </w:p>
     <w:p>
@@ -3586,7 +3586,7 @@
       <w:r>
         <w:t>(๔)</w:t>
         <w:tab/>
-        <w:t>มีลักษณะอย่างใดอย่างหนึ่งตามมาตรา ๑๐๗ (๕)</w:t>
+        <w:t>มีลักษณะอย่างใดอย่างหนึ่งตามมาตรา ๑๐๘ (๕)</w:t>
       </w:r>
     </w:p>
     <w:p>
@@ -3641,7 +3641,7 @@
       <w:r>
         <w:t>(๔)</w:t>
         <w:tab/>
-        <w:t>เป็นบุคคลต้องห้ามมิให้ใช้สิทธิสมัครรับเลือกตั้งตามมาตรา ๑๐๙ (๑) (๒) (๓) (๔) (๕) (๖) (๗) (๘) (๙) (๑๑) (๑๒) (๑๓) หรือ (๑๔)</w:t>
+        <w:t>เป็นบุคคลต้องห้ามมิให้ใช้สิทธิสมัครรับเลือกตั้งตามมาตรา ๑๑๐ (๑) (๒) (๓) (๔) (๕) (๖) (๗) (๘) (๙) (๑๑) (๑๒) (๑๓) หรือ (๑๔)</w:t>
       </w:r>
     </w:p>
     <w:p>
@@ -3664,7 +3664,7 @@
         <w:pStyle w:val="วรรค"/>
       </w:pPr>
       <w:r>
-        <w:t>บุคคลผู้เคยดำรงตำแหน่งสมาชิกวุฒิสภาและสมาชิกภาพสิ้นสุดลงมาแล้วยังไม่เกินหนึ่งปี เว้นแต่สมาชิกภาพสิ้นสุดลงตามมาตรา ๑๓๓ (๑) จะเป็นรัฐมนตรีหรือข้าราชการการเมืองอื่นมิได้</w:t>
+        <w:t>บุคคลผู้เคยดำรงตำแหน่งสมาชิกวุฒิสภาและสมาชิกภาพสิ้นสุดลงมาแล้วยังไม่เกินหนึ่งปี เว้นแต่สมาชิกภาพสิ้นสุดลงตามมาตรา ๑๓๔ (๑) จะเป็นรัฐมนตรีหรือข้าราชการการเมืองอื่นมิได้</w:t>
       </w:r>
     </w:p>
     <w:p>
@@ -3679,7 +3679,7 @@
         <w:t>มาตรา ๑๒๙</w:t>
       </w:r>
       <w:r>
-        <w:t xml:space="preserve">  ให้นำบทบัญญัติมาตรา ๑๑๐ และมาตรา ๑๑๑ มาใช้บังคับกับการกระทำอันต้องห้ามของสมาชิกวุฒิสภาด้วย โดยอนุโลม</w:t>
+        <w:t xml:space="preserve">  ให้นำบทบัญญัติมาตรา ๑๑๑ และมาตรา ๑๑๒ มาใช้บังคับกับการกระทำอันต้องห้ามของสมาชิกวุฒิสภาด้วย โดยอนุโลม</w:t>
       </w:r>
     </w:p>
     <w:p>
@@ -3796,7 +3796,7 @@
         <w:pStyle w:val="วรรค"/>
       </w:pPr>
       <w:r>
-        <w:t>เพื่อประโยชน์ในการดำเนินการตามมาตรา ๑๖๘ ให้สมาชิกวุฒิสภาที่ดำรงตำแหน่งอยู่ในวันที่อายุของวุฒิสภาสิ้นสุดลงตามวรรคหนึ่ง ทำหน้าที่ต่อไปจนกว่าสมาชิกวุฒิสภาที่ได้รับเลือกตั้งใหม่จะเข้ารับหน้าที่</w:t>
+        <w:t>เพื่อประโยชน์ในการดำเนินการตามมาตรา ๑๕๗ ให้สมาชิกวุฒิสภาที่ดำรงตำแหน่งอยู่ในวันที่อายุของวุฒิสภาสิ้นสุดลงตามวรรคหนึ่ง ทำหน้าที่ต่อไปจนกว่าสมาชิกวุฒิสภาที่ได้รับเลือกตั้งใหม่จะเข้ารับหน้าที่</w:t>
       </w:r>
     </w:p>
     <w:p>
@@ -3866,7 +3866,7 @@
       <w:r>
         <w:t>(๔)</w:t>
         <w:tab/>
-        <w:t>ขาดคุณสมบัติตามมาตรา ๑๒๕</w:t>
+        <w:t>ขาดคุณสมบัติตามมาตรา ๑๒๖</w:t>
       </w:r>
     </w:p>
     <w:p>
@@ -3876,7 +3876,7 @@
       <w:r>
         <w:t>(๕)</w:t>
         <w:tab/>
-        <w:t>มีลักษณะต้องห้ามตามมาตรา ๑๒๖</w:t>
+        <w:t>มีลักษณะต้องห้ามตามมาตรา ๑๒๗</w:t>
       </w:r>
     </w:p>
     <w:p>
@@ -3886,7 +3886,7 @@
       <w:r>
         <w:t>(๖)</w:t>
         <w:tab/>
-        <w:t>มีลักษณะต้องห้ามตามมาตรา ๑๒๗</w:t>
+        <w:t>มีลักษณะต้องห้ามตามมาตรา ๑๒๘</w:t>
       </w:r>
     </w:p>
     <w:p>
@@ -3896,7 +3896,7 @@
       <w:r>
         <w:t>(๗)</w:t>
         <w:tab/>
-        <w:t>กระทำการอันต้องห้ามตามมาตรา ๑๒๘</w:t>
+        <w:t>กระทำการอันต้องห้ามตามมาตรา ๑๒๙</w:t>
       </w:r>
     </w:p>
     <w:p>
@@ -3906,7 +3906,7 @@
       <w:r>
         <w:t>(๘)</w:t>
         <w:tab/>
-        <w:t>วุฒิสภามีมติตามมาตรา ๓๐๘ ให้ถอดถอนออกจากตำแหน่ง หรือศาลรัฐธรรมนูญมีคำวินิจฉัยให้พ้นจากสมาชิกภาพตามมาตรา ๙๖ ในกรณีเช่นนี้ ให้ถือว่าสิ้นสุดสมาชิกภาพนับแต่วันที่วุฒิสภามีมติหรือศาลรัฐธรรมนูญมีคำวินิจฉัย แล้วแต่กรณี</w:t>
+        <w:t>วุฒิสภามีมติตามมาตรา ๒๘๙ ให้ถอดถอนออกจากตำแหน่ง หรือศาลรัฐธรรมนูญมีคำวินิจฉัยให้พ้นจากสมาชิกภาพตามมาตรา ๙๗ ในกรณีเช่นนี้ ให้ถือว่าสิ้นสุดสมาชิกภาพนับแต่วันที่วุฒิสภามีมติหรือศาลรัฐธรรมนูญมีคำวินิจฉัย แล้วแต่กรณี</w:t>
       </w:r>
     </w:p>
     <w:p>
@@ -3964,7 +3964,7 @@
         <w:t>มาตรา ๑๓๖</w:t>
       </w:r>
       <w:r>
-        <w:t xml:space="preserve">  ในการพิจารณาเลือก แต่งตั้ง ให้คำแนะนำ หรือให้ความเห็นชอบ ให้บุคคลดำรงตำแหน่งใดตามมาตรา ๑๓๘ มาตรา ๑๔๓ มาตรา ๑๙๖ มาตรา ๑๙๙ มาตรา ๒๕๗ มาตรา ๒๖๑ มาตรา ๒๗๔ (๓) มาตรา ๒๗๗ มาตรา ๒๗๘ มาตรา ๒๗๙ (๓) มาตรา ๒๙๘ มาตรา ๓๐๓ และมาตรา ๓๑๓ ให้วุฒิสภาแต่งตั้งคณะกรรมาธิการขึ้นคณะหนึ่ง ทำหน้าที่ตรวจสอบประวัติและความประพฤติของบุคคลผู้ได้รับการเสนอชื่อให้ดำรงตำแหน่งนั้น รวมทั้งรวบรวมข้อเท็จจริงและพยานหลักฐานอันจำเป็น แล้วรายงานต่อวุฒิสภาเพื่อประกอบการพิจารณาต่อไป</w:t>
+        <w:t xml:space="preserve">  ในการพิจารณาเลือก แต่งตั้ง ให้คำแนะนำ หรือให้ความเห็นชอบ ให้บุคคลดำรงตำแหน่งใดตามมาตรา ๓๑๕ มาตรา ๓๒๐ มาตรา ๓๒๖ มาตรา ๓๒๙ มาตรา ๒๔๔ มาตรา ๒๔๘ มาตรา ๒๖๑ (๓) มาตรา ๒๖๔ มาตรา ๒๖๕ มาตรา ๒๖๖ (๓) มาตรา ๓๓๑ มาตรา ๓๓๖ และมาตรา ๓๓๗ ให้วุฒิสภาแต่งตั้งคณะกรรมาธิการขึ้นคณะหนึ่ง ทำหน้าที่ตรวจสอบประวัติและความประพฤติของบุคคลผู้ได้รับการเสนอชื่อให้ดำรงตำแหน่งนั้น รวมทั้งรวบรวมข้อเท็จจริงและพยานหลักฐานอันจำเป็น แล้วรายงานต่อวุฒิสภาเพื่อประกอบการพิจารณาต่อไป</w:t>
       </w:r>
     </w:p>
     <w:p>
@@ -3999,7 +3999,7 @@
         <w:t>มาตรา ๑๓๗</w:t>
       </w:r>
       <w:r>
-        <w:t xml:space="preserve">  ถึง มาตรา ๑๔๘ (ย้ายไปบัญญัติไว้ในหมวด ๑๖ องค์กรอิสระ)</w:t>
+        <w:t xml:space="preserve">  (ย้ายไปบัญญัติไว้ในหมวด ๑๖ องค์กรอิสระ)</w:t>
       </w:r>
     </w:p>
     <w:p>
@@ -4188,7 +4188,7 @@
         <w:t>มาตรา ๑๔๔</w:t>
       </w:r>
       <w:r>
-        <w:t xml:space="preserve">  การประชุมสภาผู้แทนราษฎรและการประชุมวุฒิสภาต้องมีสมาชิกมาประชุมไม่น้อยกว่ากึ่งหนึ่งของจำนวนสมาชิกทั้งหมดเท่าที่มีอยู่ของแต่ละสภาจึงจะเป็นองค์ประชุม เว้นแต่ในกรณีการพิจารณาระเบียบวาระกระทู้ถามตามมาตรา ๑๘๓ และมาตรา ๑๘๔ สภาผู้แทนราษฎรและวุฒิสภาจะกำหนดเรื่ององค์ประชุมไว้ในข้อบังคับเป็นอย่างอื่นก็ได้</w:t>
+        <w:t xml:space="preserve">  การประชุมสภาผู้แทนราษฎรและการประชุมวุฒิสภาต้องมีสมาชิกมาประชุมไม่น้อยกว่ากึ่งหนึ่งของจำนวนสมาชิกทั้งหมดเท่าที่มีอยู่ของแต่ละสภาจึงจะเป็นองค์ประชุม เว้นแต่ในกรณีการพิจารณาระเบียบวาระกระทู้ถามตามมาตรา ๑๗๓ และมาตรา ๑๗๔ สภาผู้แทนราษฎรและวุฒิสภาจะกำหนดเรื่ององค์ประชุมไว้ในข้อบังคับเป็นอย่างอื่นก็ได้</w:t>
       </w:r>
     </w:p>
     <w:p>
@@ -4273,7 +4273,7 @@
         <w:t>มาตรา ๑๔๗</w:t>
       </w:r>
       <w:r>
-        <w:t xml:space="preserve">  เอกสิทธิ์ที่บัญญัติไว้ในมาตรา ๑๕๗ ย่อมคุ้มครองไปถึงผู้พิมพ์และผู้โฆษณารายงานการประชุมตามข้อบังคับของสภาผู้แทนราษฎร วุฒิสภา หรือรัฐสภา แล้วแต่กรณี และคุ้มครองไปถึงบุคคลซึ่งประธานในที่ประชุมอนุญาตให้แถลงข้อเท็จจริง หรือแสดงความคิดเห็นในที่ประชุมตลอดจนผู้ดำเนินการถ่ายทอดการประชุมสภาทางวิทยุกระจายเสียงหรือวิทยุโทรทัศน์ที่ได้รับอนุญาตจากประธานแห่งสภานั้น ด้วย โดยอนุโลม</w:t>
+        <w:t xml:space="preserve">  เอกสิทธิ์ที่บัญญัติไว้ในมาตรา ๑๔๖ ย่อมคุ้มครองไปถึงผู้พิมพ์และผู้โฆษณารายงานการประชุมตามข้อบังคับของสภาผู้แทนราษฎร วุฒิสภา หรือรัฐสภา แล้วแต่กรณี และคุ้มครองไปถึงบุคคลซึ่งประธานในที่ประชุมอนุญาตให้แถลงข้อเท็จจริง หรือแสดงความคิดเห็นในที่ประชุมตลอดจนผู้ดำเนินการถ่ายทอดการประชุมสภาทางวิทยุกระจายเสียงหรือวิทยุโทรทัศน์ที่ได้รับอนุญาตจากประธานแห่งสภานั้น ด้วย โดยอนุโลม</w:t>
       </w:r>
     </w:p>
     <w:p>
@@ -4358,7 +4358,7 @@
         <w:pStyle w:val="วรรค"/>
       </w:pPr>
       <w:r>
-        <w:t>พระมหากษัตริย์จะเสด็จพระราชดำเนินมาทรงทำรัฐพิธีเปิดประชุมสมัยประชุมสามัญทั่วไปครั้งแรกตามมาตรา ๑๕๙ วรรคหนึ่ง ด้วยพระองค์เอง หรือจะโปรดเกล้าโปรดกระหม่อมให้พระรัชทายาทซึ่งบรรลุนิติภาวะแล้ว หรือผู้ใดผู้หนึ่งเป็นผู้แทนพระองค์ มาทำรัฐพิธีก็ได้</w:t>
+        <w:t>พระมหากษัตริย์จะเสด็จพระราชดำเนินมาทรงทำรัฐพิธีเปิดประชุมสมัยประชุมสามัญทั่วไปครั้งแรกตามมาตรา ๑๔๘ วรรคหนึ่ง ด้วยพระองค์เอง หรือจะโปรดเกล้าโปรดกระหม่อมให้พระรัชทายาทซึ่งบรรลุนิติภาวะแล้ว หรือผู้ใดผู้หนึ่งเป็นผู้แทนพระองค์ มาทำรัฐพิธีก็ได้</w:t>
       </w:r>
     </w:p>
     <w:p>
@@ -4419,7 +4419,7 @@
         <w:t>มาตรา ๑๕๓</w:t>
       </w:r>
       <w:r>
-        <w:t xml:space="preserve">  ภายใต้บังคับมาตรา ๑๖๓ การเรียกประชุม การขยายเวลาประชุม และการปิดประชุมรัฐสภา ให้กระทำโดยพระราชกฤษฎีกา</w:t>
+        <w:t xml:space="preserve">  ภายใต้บังคับมาตรา ๑๕๒ การเรียกประชุม การขยายเวลาประชุม และการปิดประชุมรัฐสภา ให้กระทำโดยพระราชกฤษฎีกา</w:t>
       </w:r>
     </w:p>
     <w:p>
@@ -4513,7 +4513,7 @@
       <w:r>
         <w:t>(๑)</w:t>
         <w:tab/>
-        <w:t>การประชุมที่ให้วุฒิสภาทำหน้าที่รัฐสภาตามมาตรา ๑๙ มาตรา ๒๑ มาตรา ๒๒ มาตรา ๒๓ และมาตรา ๒๒๓ โดยถือคะแนนเสียงจากจำนวนสมาชิกของวุฒิสภา</w:t>
+        <w:t>การประชุมที่ให้วุฒิสภาทำหน้าที่รัฐสภาตามมาตรา ๑๙ มาตรา ๒๑ มาตรา ๒๒ มาตรา ๒๓ และมาตรา ๒๑๐ โดยถือคะแนนเสียงจากจำนวนสมาชิกของวุฒิสภา</w:t>
       </w:r>
     </w:p>
     <w:p>
@@ -4523,7 +4523,7 @@
       <w:r>
         <w:t>(๒)</w:t>
         <w:tab/>
-        <w:t>การประชุมที่ให้วุฒิสภาทำหน้าที่เลือก แต่งตั้ง ให้คำแนะนำ หรือให้ความเห็นชอบ ให้บุคคลดำรงตำแหน่งใดตามมาตรา ๑๓๘ มาตรา ๑๔๓ มาตรา ๑๙๖ มาตรา ๑๙๙ มาตรา ๒๕๗ มาตรา ๒๖๑ มาตรา ๒๗๔ (๓) มาตรา ๒๗๗ มาตรา ๒๗๘ มาตรา ๒๗๙ (๓) มาตรา ๒๙๘ มาตรา ๓๐๓ และมาตรา ๓๑๓</w:t>
+        <w:t>การประชุมที่ให้วุฒิสภาทำหน้าที่เลือก แต่งตั้ง ให้คำแนะนำ หรือให้ความเห็นชอบ ให้บุคคลดำรงตำแหน่งใดตามมาตรา ๓๑๕ มาตรา ๓๒๐ มาตรา ๓๒๖ มาตรา ๓๒๙ มาตรา ๒๔๔ มาตรา ๒๔๘ มาตรา ๒๖๑ (๓) มาตรา ๒๖๔ มาตรา ๒๖๕ มาตรา ๒๖๖ (๓) มาตรา ๓๓๑ มาตรา ๓๓๖ และมาตรา ๓๓๗</w:t>
       </w:r>
     </w:p>
     <w:p>
@@ -4548,7 +4548,7 @@
         <w:t>มาตรา ๑๕๘</w:t>
       </w:r>
       <w:r>
-        <w:t xml:space="preserve">  ภายใต้บังคับมาตรา ๑๗๐ ร่างพระราชบัญญัติหรือร่างพระราชบัญญัติประกอบรัฐธรรมนูญจะเสนอได้ก็แต่โดยสมาชิกสภาผู้แทนราษฎรหรือคณะรัฐมนตรี แต่ร่างพระราชบัญญัติเกี่ยวด้วยการเงิน สมาชิกสภาผู้แทนราษฎรจะเสนอได้ก็ต่อเมื่อมีคำรับรองของนายกรัฐมนตรี</w:t>
+        <w:t xml:space="preserve">  ภายใต้บังคับมาตรา ๑๕๙ ร่างพระราชบัญญัติหรือร่างพระราชบัญญัติประกอบรัฐธรรมนูญจะเสนอได้ก็แต่โดยสมาชิกสภาผู้แทนราษฎรหรือคณะรัฐมนตรี แต่ร่างพระราชบัญญัติเกี่ยวด้วยการเงิน สมาชิกสภาผู้แทนราษฎรจะเสนอได้ก็ต่อเมื่อมีคำรับรองของนายกรัฐมนตรี</w:t>
       </w:r>
     </w:p>
     <w:p>
@@ -4735,7 +4735,7 @@
         <w:t>มาตรา ๑๖๓</w:t>
       </w:r>
       <w:r>
-        <w:t xml:space="preserve">  ร่างพระราชบัญญัติที่คณะรัฐมนตรีระบุไว้ในนโยบายที่แถลงต่อรัฐสภาตามมาตรา ๒๑๑ ว่าจำเป็นต่อการบริหารราชการแผ่นดิน หรือร่างพระราชบัญญัติประกอบรัฐธรรมนูญใด หากสภาผู้แทนราษฎรมีมติไม่ให้ความเห็นชอบ และคะแนนเสียงที่ไม่ให้ความเห็นชอบไม่ถึงกึ่งหนึ่งของจำนวนสมาชิกสภาผู้แทนราษฎรทั้งหมดเท่าที่มีอยู่ คณะรัฐมนตรีอาจขอให้รัฐสภาประชุมร่วมกันเพื่อมีมติอีกครั้งหนึ่ง หากรัฐสภามีมติให้ความเห็นชอบ ให้ตั้งบุคคลซึ่งเป็นหรือมิได้เป็นสมาชิกของแต่ละสภามีจำนวนเท่ากันตามที่คณะรัฐมนตรีเสนอ ประกอบกันเป็นคณะกรรมาธิการร่วมกันของรัฐสภาเพื่อพิจารณาร่างพระราชบัญญัติหรือร่างพระราชบัญญัติประกอบรัฐธรรมนูญนั้น และให้คณะกรรมาธิการร่วมกันของรัฐสภารายงานและเสนอร่างพระราชบัญญัติหรือร่างพระราชบัญญัติประกอบรัฐธรรมนูญที่ได้พิจารณาแล้วต่อรัฐสภา ถ้ารัฐสภามีมติเห็นชอบด้วยร่างพระราชบัญญัติหรือร่างพระราชบัญญัติประกอบรัฐธรรมนูญนั้น ให้ดำเนินการต่อไปตามมาตรา ๙๓ ถ้ารัฐสภามีมติไม่ให้ความเห็นชอบ ให้ร่างพระราชบัญญัติหรือร่างพระราชบัญญัติประกอบรัฐธรรมนูญนั้นเป็นอันตกไป</w:t>
+        <w:t xml:space="preserve">  ร่างพระราชบัญญัติที่คณะรัฐมนตรีระบุไว้ในนโยบายที่แถลงต่อรัฐสภาตามมาตรา ๑๙๘ ว่าจำเป็นต่อการบริหารราชการแผ่นดิน หรือร่างพระราชบัญญัติประกอบรัฐธรรมนูญใด หากสภาผู้แทนราษฎรมีมติไม่ให้ความเห็นชอบ และคะแนนเสียงที่ไม่ให้ความเห็นชอบไม่ถึงกึ่งหนึ่งของจำนวนสมาชิกสภาผู้แทนราษฎรทั้งหมดเท่าที่มีอยู่ คณะรัฐมนตรีอาจขอให้รัฐสภาประชุมร่วมกันเพื่อมีมติอีกครั้งหนึ่ง หากรัฐสภามีมติให้ความเห็นชอบ ให้ตั้งบุคคลซึ่งเป็นหรือมิได้เป็นสมาชิกของแต่ละสภามีจำนวนเท่ากันตามที่คณะรัฐมนตรีเสนอ ประกอบกันเป็นคณะกรรมาธิการร่วมกันของรัฐสภาเพื่อพิจารณาร่างพระราชบัญญัติหรือร่างพระราชบัญญัติประกอบรัฐธรรมนูญนั้น และให้คณะกรรมาธิการร่วมกันของรัฐสภารายงานและเสนอร่างพระราชบัญญัติหรือร่างพระราชบัญญัติประกอบรัฐธรรมนูญที่ได้พิจารณาแล้วต่อรัฐสภา ถ้ารัฐสภามีมติเห็นชอบด้วยร่างพระราชบัญญัติหรือร่างพระราชบัญญัติประกอบรัฐธรรมนูญนั้น ให้ดำเนินการต่อไปตามมาตรา ๙๔ ถ้ารัฐสภามีมติไม่ให้ความเห็นชอบ ให้ร่างพระราชบัญญัติหรือร่างพระราชบัญญัติประกอบรัฐธรรมนูญนั้นเป็นอันตกไป</w:t>
       </w:r>
     </w:p>
     <w:p>
@@ -4750,7 +4750,7 @@
         <w:t>มาตรา ๑๖๔</w:t>
       </w:r>
       <w:r>
-        <w:t xml:space="preserve">  ภายใต้บังคับมาตรา ๑๘๐ เมื่อสภาผู้แทนราษฎรได้พิจารณาร่างพระราชบัญญัติหรือร่างพระราชบัญญัติประกอบรัฐธรรมนูญที่เสนอตามมาตรา ๑๗๒ และลงมติเห็นชอบแล้ว ให้สภาผู้แทนราษฎรเสนอร่างพระราชบัญญัติหรือร่างพระราชบัญญัติประกอบรัฐธรรมนูญนั้นต่อวุฒิสภา วุฒิสภาต้องพิจารณาร่างพระราชบัญญัติหรือร่างพระราชบัญญัติประกอบรัฐธรรมนูญที่เสนอมานั้นให้เสร็จภายในหกสิบวัน แต่ถ้าร่างพระราชบัญญัติหรือร่างพระราชบัญญัติประกอบรัฐธรรมนูญนั้นเป็นร่างพระราชบัญญัติเกี่ยวด้วยการเงิน ต้องพิจารณาให้เสร็จภายในสามสิบวัน ทั้งนี้ เว้นแต่วุฒิสภาจะได้ลงมติให้ขยายเวลาออกไปเป็นกรณีพิเศษซึ่งต้องไม่เกินสามสิบวัน กำหนดวันดังกล่าวให้หมายถึงวันในสมัยประชุม และให้เริ่มนับแต่วันที่ร่างพระราชบัญญัติหรือร่างพระราชบัญญัติประกอบรัฐธรรมนูญนั้นมาถึงวุฒิสภา</w:t>
+        <w:t xml:space="preserve">  ภายใต้บังคับมาตรา ๑๗๐ เมื่อสภาผู้แทนราษฎรได้พิจารณาร่างพระราชบัญญัติหรือร่างพระราชบัญญัติประกอบรัฐธรรมนูญที่เสนอตามมาตรา ๑๖๒ และลงมติเห็นชอบแล้ว ให้สภาผู้แทนราษฎรเสนอร่างพระราชบัญญัติหรือร่างพระราชบัญญัติประกอบรัฐธรรมนูญนั้นต่อวุฒิสภา วุฒิสภาต้องพิจารณาร่างพระราชบัญญัติหรือร่างพระราชบัญญัติประกอบรัฐธรรมนูญที่เสนอมานั้นให้เสร็จภายในหกสิบวัน แต่ถ้าร่างพระราชบัญญัติหรือร่างพระราชบัญญัติประกอบรัฐธรรมนูญนั้นเป็นร่างพระราชบัญญัติเกี่ยวด้วยการเงิน ต้องพิจารณาให้เสร็จภายในสามสิบวัน ทั้งนี้ เว้นแต่วุฒิสภาจะได้ลงมติให้ขยายเวลาออกไปเป็นกรณีพิเศษซึ่งต้องไม่เกินสามสิบวัน กำหนดวันดังกล่าวให้หมายถึงวันในสมัยประชุม และให้เริ่มนับแต่วันที่ร่างพระราชบัญญัติหรือร่างพระราชบัญญัติประกอบรัฐธรรมนูญนั้นมาถึงวุฒิสภา</w:t>
       </w:r>
     </w:p>
     <w:p>
@@ -4758,7 +4758,7 @@
         <w:pStyle w:val="วรรค"/>
       </w:pPr>
       <w:r>
-        <w:t>ระยะเวลาดังกล่าวในวรรคหนึ่ง ไม่ให้นับรวมระยะเวลาที่อยู่ในระหว่างการพิจารณาของศาลรัฐธรรมนูญตามมาตรา ๑๗๗</w:t>
+        <w:t>ระยะเวลาดังกล่าวในวรรคหนึ่ง ไม่ให้นับรวมระยะเวลาที่อยู่ในระหว่างการพิจารณาของศาลรัฐธรรมนูญตามมาตรา ๑๖๗</w:t>
       </w:r>
     </w:p>
     <w:p>
@@ -4797,7 +4797,7 @@
         <w:t>มาตรา ๑๖๕</w:t>
       </w:r>
       <w:r>
-        <w:t xml:space="preserve">  ภายใต้บังคับมาตรา ๑๘๐ เมื่อวุฒิสภาได้พิจารณาร่างพระราชบัญญัติหรือร่างพระราชบัญญัติประกอบรัฐธรรมนูญเสร็จแล้ว</w:t>
+        <w:t xml:space="preserve">  ภายใต้บังคับมาตรา ๑๗๐ เมื่อวุฒิสภาได้พิจารณาร่างพระราชบัญญัติหรือร่างพระราชบัญญัติประกอบรัฐธรรมนูญเสร็จแล้ว</w:t>
       </w:r>
     </w:p>
     <w:p>
@@ -4807,7 +4807,7 @@
       <w:r>
         <w:t>(๑)</w:t>
         <w:tab/>
-        <w:t>ถ้าเห็นชอบด้วยกับสภาผู้แทนราษฎร ให้ดำเนินการต่อไปตามมาตรา ๙๓</w:t>
+        <w:t>ถ้าเห็นชอบด้วยกับสภาผู้แทนราษฎร ให้ดำเนินการต่อไปตามมาตรา ๙๔</w:t>
       </w:r>
     </w:p>
     <w:p>
@@ -4827,7 +4827,7 @@
       <w:r>
         <w:t>(๓)</w:t>
         <w:tab/>
-        <w:t>ถ้าแก้ไขเพิ่มเติม ให้ส่งร่างพระราชบัญญัติหรือร่างพระราชบัญญัติประกอบรัฐธรรมนูญตามที่แก้ไขเพิ่มเติมนั้นไปยังสภาผู้แทนราษฎร ถ้าสภาผู้แทนราษฎรเห็นชอบด้วยกับการแก้ไขเพิ่มเติม ให้ดำเนินการต่อไปตามมาตรา ๙๓ ถ้าเป็นกรณีอื่น ให้แต่ละสภาตั้งบุคคลซึ่งเป็นหรือมิได้เป็นสมาชิกแห่งสภานั้น ๆ มีจำนวนเท่ากันตามที่สภาผู้แทนราษฎรกำหนด ประกอบเป็นคณะกรรมาธิการร่วมกันเพื่อพิจารณาร่างพระราชบัญญัติหรือร่างพระราชบัญญัติประกอบรัฐธรรมนูญนั้น และให้คณะกรรมาธิการร่วมกันรายงานและเสนอร่างพระราชบัญญัติหรือร่างพระราชบัญญัติประกอบรัฐธรรมนูญที่คณะกรรมาธิการร่วมกันได้พิจารณาแล้วต่อสภาทั้งสอง ถ้าสภาทั้งสองต่างเห็นชอบด้วยร่างพระราชบัญญัติหรือร่างพระราชบัญญัติประกอบรัฐธรรมนูญที่คณะกรรมาธิการร่วมกันได้พิจารณาแล้ว ให้ดำเนินการต่อไปตามมาตรา ๙๓ ถ้าสภาใดสภาหนึ่งไม่เห็นชอบด้วย ก็ให้ยับยั้งร่างพระราชบัญญัติหรือร่างพระราชบัญญัติประกอบรัฐธรรมนูญนั้นไว้ก่อน</w:t>
+        <w:t>ถ้าแก้ไขเพิ่มเติม ให้ส่งร่างพระราชบัญญัติหรือร่างพระราชบัญญัติประกอบรัฐธรรมนูญตามที่แก้ไขเพิ่มเติมนั้นไปยังสภาผู้แทนราษฎร ถ้าสภาผู้แทนราษฎรเห็นชอบด้วยกับการแก้ไขเพิ่มเติม ให้ดำเนินการต่อไปตามมาตรา ๙๔ ถ้าเป็นกรณีอื่น ให้แต่ละสภาตั้งบุคคลซึ่งเป็นหรือมิได้เป็นสมาชิกแห่งสภานั้น ๆ มีจำนวนเท่ากันตามที่สภาผู้แทนราษฎรกำหนด ประกอบเป็นคณะกรรมาธิการร่วมกันเพื่อพิจารณาร่างพระราชบัญญัติหรือร่างพระราชบัญญัติประกอบรัฐธรรมนูญนั้น และให้คณะกรรมาธิการร่วมกันรายงานและเสนอร่างพระราชบัญญัติหรือร่างพระราชบัญญัติประกอบรัฐธรรมนูญที่คณะกรรมาธิการร่วมกันได้พิจารณาแล้วต่อสภาทั้งสอง ถ้าสภาทั้งสองต่างเห็นชอบด้วยร่างพระราชบัญญัติหรือร่างพระราชบัญญัติประกอบรัฐธรรมนูญที่คณะกรรมาธิการร่วมกันได้พิจารณาแล้ว ให้ดำเนินการต่อไปตามมาตรา ๙๔ ถ้าสภาใดสภาหนึ่งไม่เห็นชอบด้วย ก็ให้ยับยั้งร่างพระราชบัญญัติหรือร่างพระราชบัญญัติประกอบรัฐธรรมนูญนั้นไว้ก่อน</w:t>
       </w:r>
     </w:p>
     <w:p>
@@ -4835,7 +4835,7 @@
         <w:pStyle w:val="วรรค"/>
       </w:pPr>
       <w:r>
-        <w:t>คณะกรรมาธิการร่วมกันอาจเรียกเอกสารจากบุคคลใด หรือเรียกบุคคลใดมาแถลงข้อเท็จจริงหรือแสดงความคิดเห็นในการพิจารณาร่างพระราชบัญญัติหรือร่างพระราชบัญญัติประกอบรัฐธรรมนูญได้ และเอกสิทธิ์ที่บัญญัติไว้ในมาตรา ๑๕๗ และมาตรา ๑๕๘ นั้น ให้คุ้มครองถึงบุคคลผู้กระทำหน้าที่ตามมาตรานี้ด้วย</w:t>
+        <w:t>คณะกรรมาธิการร่วมกันอาจเรียกเอกสารจากบุคคลใด หรือเรียกบุคคลใดมาแถลงข้อเท็จจริงหรือแสดงความคิดเห็นในการพิจารณาร่างพระราชบัญญัติหรือร่างพระราชบัญญัติประกอบรัฐธรรมนูญได้ และเอกสิทธิ์ที่บัญญัติไว้ในมาตรา ๑๔๖ และมาตรา ๑๔๗ นั้น ให้คุ้มครองถึงบุคคลผู้กระทำหน้าที่ตามมาตรานี้ด้วย</w:t>
       </w:r>
     </w:p>
     <w:p>
@@ -4843,7 +4843,7 @@
         <w:pStyle w:val="วรรค"/>
       </w:pPr>
       <w:r>
-        <w:t>การประชุมคณะกรรมาธิการร่วมกันต้องมีกรรมาธิการของสภาทั้งสองมาประชุมไม่น้อยกว่ากึ่งหนึ่งของจำนวนกรรมาธิการทั้งหมดจึงจะเป็นองค์ประชุม และให้นำบทบัญญัติมาตรา ๑๙๔ มาใช้บังคับโดยอนุโลม</w:t>
+        <w:t>การประชุมคณะกรรมาธิการร่วมกันต้องมีกรรมาธิการของสภาทั้งสองมาประชุมไม่น้อยกว่ากึ่งหนึ่งของจำนวนกรรมาธิการทั้งหมดจึงจะเป็นองค์ประชุม และให้นำบทบัญญัติมาตรา ๑๘๔ มาใช้บังคับโดยอนุโลม</w:t>
       </w:r>
     </w:p>
     <w:p>
@@ -4858,7 +4858,7 @@
         <w:t>มาตรา ๑๖๖</w:t>
       </w:r>
       <w:r>
-        <w:t xml:space="preserve">  ร่างพระราชบัญญัติหรือร่างพระราชบัญญัติประกอบรัฐธรรมนูญที่ต้องยับยั้งไว้ตามมาตรา ๑๗๕ นั้น สภาผู้แทนราษฎรจะยกขึ้นพิจารณาใหม่ได้ต่อเมื่อเวลาหนึ่งร้อยแปดสิบวันได้ล่วงพ้นไปนับแต่วันที่วุฒิสภาส่งร่างพระราชบัญญัติหรือร่างพระราชบัญญัติประกอบรัฐธรรมนูญนั้นคืนไปยังสภาผู้แทนราษฎร สำหรับกรณีการยับยั้งตามมาตรา ๑๗๕ (๒) และนับแต่วันที่สภาใดสภาหนึ่งไม่เห็นชอบด้วย สำหรับกรณีการยับยั้งตามมาตรา ๑๗๕ (๓)ในกรณีเช่นว่านี้ ถ้าสภาผู้แทนราษฎรลงมติยืนยันร่างเดิมหรือร่างที่คณะกรรมาธิการร่วมกันพิจารณาด้วยคะแนนเสียงมากกว่ากึ่งหนึ่งของจำนวนสมาชิกทั้งหมดเท่าที่มีอยู่ของสภาผู้แทนราษฎรแล้ว ให้ถือว่าร่างพระราชบัญญัติหรือร่างพระราชบัญญัติประกอบรัฐธรรมนูญนั้นเป็นอันได้รับความเห็นชอบของรัฐสภา และให้ดำเนินการต่อไปตามมาตรา ๙๓</w:t>
+        <w:t xml:space="preserve">  ร่างพระราชบัญญัติหรือร่างพระราชบัญญัติประกอบรัฐธรรมนูญที่ต้องยับยั้งไว้ตามมาตรา ๑๖๕ นั้น สภาผู้แทนราษฎรจะยกขึ้นพิจารณาใหม่ได้ต่อเมื่อเวลาหนึ่งร้อยแปดสิบวันได้ล่วงพ้นไปนับแต่วันที่วุฒิสภาส่งร่างพระราชบัญญัติหรือร่างพระราชบัญญัติประกอบรัฐธรรมนูญนั้นคืนไปยังสภาผู้แทนราษฎร สำหรับกรณีการยับยั้งตามมาตรา ๑๖๕ (๒) และนับแต่วันที่สภาใดสภาหนึ่งไม่เห็นชอบด้วย สำหรับกรณีการยับยั้งตามมาตรา ๑๖๕ (๓)ในกรณีเช่นว่านี้ ถ้าสภาผู้แทนราษฎรลงมติยืนยันร่างเดิมหรือร่างที่คณะกรรมาธิการร่วมกันพิจารณาด้วยคะแนนเสียงมากกว่ากึ่งหนึ่งของจำนวนสมาชิกทั้งหมดเท่าที่มีอยู่ของสภาผู้แทนราษฎรแล้ว ให้ถือว่าร่างพระราชบัญญัติหรือร่างพระราชบัญญัติประกอบรัฐธรรมนูญนั้นเป็นอันได้รับความเห็นชอบของรัฐสภา และให้ดำเนินการต่อไปตามมาตรา ๙๔</w:t>
       </w:r>
     </w:p>
     <w:p>
@@ -4866,7 +4866,7 @@
         <w:pStyle w:val="วรรค"/>
       </w:pPr>
       <w:r>
-        <w:t>ถ้าร่างพระราชบัญญัติหรือร่างพระราชบัญญัติประกอบรัฐธรรมนูญที่ต้องยับยั้งไว้เป็นร่างพระราชบัญญัติเกี่ยวด้วยการเงิน สภาผู้แทนราษฎรอาจยกร่างพระราชบัญญัติหรือร่างพระราชบัญญัติประกอบรัฐธรรมนูญนั้นขึ้นพิจารณาใหม่ได้ทันที ในกรณีเช่นว่านี้ ถ้าสภาผู้แทนราษฎรลงมติยืนยันร่างเดิมหรือร่างที่คณะกรรมาธิการร่วมกันพิจารณาด้วยคะแนนเสียงมากกว่ากึ่งหนึ่งของจำนวนสมาชิกทั้งหมดเท่าที่มีอยู่ของสภาผู้แทนราษฎรแล้ว ให้ถือว่าร่างพระราชบัญญัติหรือร่างพระราชบัญญัติประกอบรัฐธรรมนูญนั้นเป็นอันได้รับความเห็นชอบของรัฐสภา และให้ดำเนินการต่อไปตามมาตรา ๙๓</w:t>
+        <w:t>ถ้าร่างพระราชบัญญัติหรือร่างพระราชบัญญัติประกอบรัฐธรรมนูญที่ต้องยับยั้งไว้เป็นร่างพระราชบัญญัติเกี่ยวด้วยการเงิน สภาผู้แทนราษฎรอาจยกร่างพระราชบัญญัติหรือร่างพระราชบัญญัติประกอบรัฐธรรมนูญนั้นขึ้นพิจารณาใหม่ได้ทันที ในกรณีเช่นว่านี้ ถ้าสภาผู้แทนราษฎรลงมติยืนยันร่างเดิมหรือร่างที่คณะกรรมาธิการร่วมกันพิจารณาด้วยคะแนนเสียงมากกว่ากึ่งหนึ่งของจำนวนสมาชิกทั้งหมดเท่าที่มีอยู่ของสภาผู้แทนราษฎรแล้ว ให้ถือว่าร่างพระราชบัญญัติหรือร่างพระราชบัญญัติประกอบรัฐธรรมนูญนั้นเป็นอันได้รับความเห็นชอบของรัฐสภา และให้ดำเนินการต่อไปตามมาตรา ๙๔</w:t>
       </w:r>
     </w:p>
     <w:p>
@@ -4881,7 +4881,7 @@
         <w:t>มาตรา ๑๖๗</w:t>
       </w:r>
       <w:r>
-        <w:t xml:space="preserve">  ในระหว่างที่มีการยับยั้งร่างพระราชบัญญัติหรือร่างพระราชบัญญัติประกอบรัฐธรรมนูญใดตามมาตรา ๑๗๕ คณะรัฐมนตรีหรือสมาชิกสภาผู้แทนราษฎรจะเสนอร่างพระราชบัญญัติหรือร่างพระราชบัญญัติประกอบรัฐธรรมนูญที่มีหลักการอย่างเดียวกันหรือคล้ายกันกับหลักการของร่างพระราชบัญญัติหรือร่างพระราชบัญญัติประกอบรัฐธรรมนูญที่ต้องยับยั้งไว้มิได้</w:t>
+        <w:t xml:space="preserve">  ในระหว่างที่มีการยับยั้งร่างพระราชบัญญัติหรือร่างพระราชบัญญัติประกอบรัฐธรรมนูญใดตามมาตรา ๑๖๕ คณะรัฐมนตรีหรือสมาชิกสภาผู้แทนราษฎรจะเสนอร่างพระราชบัญญัติหรือร่างพระราชบัญญัติประกอบรัฐธรรมนูญที่มีหลักการอย่างเดียวกันหรือคล้ายกันกับหลักการของร่างพระราชบัญญัติหรือร่างพระราชบัญญัติประกอบรัฐธรรมนูญที่ต้องยับยั้งไว้มิได้</w:t>
       </w:r>
     </w:p>
     <w:p>
@@ -4966,7 +4966,7 @@
         <w:pStyle w:val="วรรค"/>
       </w:pPr>
       <w:r>
-        <w:t>ในการพิจารณาของวุฒิสภา วุฒิสภาจะต้องให้ความเห็นชอบหรือไม่ให้ความเห็นชอบภายในยี่สิบวันนับแต่วันที่ร่างพระราชบัญญัตินั้นมาถึงวุฒิสภา โดยจะแก้ไขเพิ่มเติมใด ๆ มิได้ ถ้าพ้นกำหนดเวลาดังกล่าวให้ถือว่าวุฒิสภาได้ให้ความเห็นชอบในร่างพระราชบัญญัตินั้น ในกรณีเช่นนี้และในกรณีที่วุฒิสภาให้ความเห็นชอบ ให้ดำเนินการต่อไปตามมาตรา ๙๓</w:t>
+        <w:t>ในการพิจารณาของวุฒิสภา วุฒิสภาจะต้องให้ความเห็นชอบหรือไม่ให้ความเห็นชอบภายในยี่สิบวันนับแต่วันที่ร่างพระราชบัญญัตินั้นมาถึงวุฒิสภา โดยจะแก้ไขเพิ่มเติมใด ๆ มิได้ ถ้าพ้นกำหนดเวลาดังกล่าวให้ถือว่าวุฒิสภาได้ให้ความเห็นชอบในร่างพระราชบัญญัตินั้น ในกรณีเช่นนี้และในกรณีที่วุฒิสภาให้ความเห็นชอบ ให้ดำเนินการต่อไปตามมาตรา ๙๔</w:t>
       </w:r>
     </w:p>
     <w:p>
@@ -4974,7 +4974,7 @@
         <w:pStyle w:val="วรรค"/>
       </w:pPr>
       <w:r>
-        <w:t>ถ้าร่างพระราชบัญญัติดังกล่าววุฒิสภาไม่เห็นชอบด้วย ให้นำบทบัญญัติมาตรา ๑๗๖ วรรคสอง มาใช้บังคับโดยอนุโลม</w:t>
+        <w:t>ถ้าร่างพระราชบัญญัติดังกล่าววุฒิสภาไม่เห็นชอบด้วย ให้นำบทบัญญัติมาตรา ๑๖๖ วรรคสอง มาใช้บังคับโดยอนุโลม</w:t>
       </w:r>
     </w:p>
     <w:p>
@@ -5043,7 +5043,7 @@
         <w:t>มาตรา ๑๗๑</w:t>
       </w:r>
       <w:r>
-        <w:t xml:space="preserve">  การจ่ายเงินแผ่นดินจะกระทำได้ก็เฉพาะที่ได้อนุญาตไว้ในกฎหมายว่าด้วยงบประมาณรายจ่าย กฎหมายว่าด้วยวิธีการงบประมาณ กฎหมายเกี่ยวด้วยการโอนงบประมาณ หรือกฎหมายว่าด้วยเงินคงคลัง เว้นแต่ในกรณีจำเป็นรีบด่วนจะจ่ายไปก่อนก็ได้ แต่ต้องเป็นไปตามหลักเกณฑ์และวิธีการที่กฎหมายบัญญัติ ในกรณีเช่นว่านี้ต้องตั้งงบประมาณรายจ่ายชดใช้ในพระราชบัญญัติโอนงบประมาณรายจ่าย พระราชบัญญัติงบประมาณรายจ่ายเพิ่มเติม หรือพระราชบัญญัติงบประมาณรายจ่ายประจำปีงบประมาณถัดไป หรือเว้นแต่เป็นกรณีตามมาตรา ๒๓๐ วรรคสอง</w:t>
+        <w:t xml:space="preserve">  การจ่ายเงินแผ่นดินจะกระทำได้ก็เฉพาะที่ได้อนุญาตไว้ในกฎหมายว่าด้วยงบประมาณรายจ่าย กฎหมายว่าด้วยวิธีการงบประมาณ กฎหมายเกี่ยวด้วยการโอนงบประมาณ หรือกฎหมายว่าด้วยเงินคงคลัง เว้นแต่ในกรณีจำเป็นรีบด่วนจะจ่ายไปก่อนก็ได้ แต่ต้องเป็นไปตามหลักเกณฑ์และวิธีการที่กฎหมายบัญญัติ ในกรณีเช่นว่านี้ต้องตั้งงบประมาณรายจ่ายชดใช้ในพระราชบัญญัติโอนงบประมาณรายจ่าย พระราชบัญญัติงบประมาณรายจ่ายเพิ่มเติม หรือพระราชบัญญัติงบประมาณรายจ่ายประจำปีงบประมาณถัดไป หรือเว้นแต่เป็นกรณีตามมาตรา ๒๑๗ วรรคสอง</w:t>
       </w:r>
     </w:p>
     <w:p>
@@ -5111,7 +5111,7 @@
         <w:t>มาตรา ๑๗๕</w:t>
       </w:r>
       <w:r>
-        <w:t xml:space="preserve">  สมาชิกสภาผู้แทนราษฎรจำนวนไม่น้อยกว่าสองในห้าของจำนวนสมาชิกทั้งหมดเท่าที่มีอยู่ของสภาผู้แทนราษฎร มีสิทธิเข้าชื่อเสนอญัตติขอเปิดอภิปรายทั่วไปเพื่อลงมติไม่ไว้วางใจนายกรัฐมนตรี ญัตติดังกล่าวต้องเสนอชื่อผู้สมควรดำรงตำแหน่งนายกรัฐมนตรีคนต่อไปซึ่งเป็นบุคคลตามมาตรา ๒๐๑ วรรคสอง ด้วย และเมื่อได้มีการเสนอญัตติแล้ว จะมีการยุบสภาผู้แทนราษฎรมิได้ เว้นแต่จะมีการถอนญัตติหรือการลงมตินั้นไม่ได้คะแนนเสียงตามวรรคสาม</w:t>
+        <w:t xml:space="preserve">  สมาชิกสภาผู้แทนราษฎรจำนวนไม่น้อยกว่าสองในห้าของจำนวนสมาชิกทั้งหมดเท่าที่มีอยู่ของสภาผู้แทนราษฎร มีสิทธิเข้าชื่อเสนอญัตติขอเปิดอภิปรายทั่วไปเพื่อลงมติไม่ไว้วางใจนายกรัฐมนตรี ญัตติดังกล่าวต้องเสนอชื่อผู้สมควรดำรงตำแหน่งนายกรัฐมนตรีคนต่อไปซึ่งเป็นบุคคลตามมาตรา ๑๘๘ วรรคสอง ด้วย และเมื่อได้มีการเสนอญัตติแล้ว จะมีการยุบสภาผู้แทนราษฎรมิได้ เว้นแต่จะมีการถอนญัตติหรือการลงมตินั้นไม่ได้คะแนนเสียงตามวรรคสาม</w:t>
       </w:r>
     </w:p>
     <w:p>
@@ -5119,7 +5119,7 @@
         <w:pStyle w:val="วรรค"/>
       </w:pPr>
       <w:r>
-        <w:t>การเสนอญัตติขอเปิดอภิปรายทั่วไปตามวรรคหนึ่ง ถ้าเป็นเรื่องที่เกี่ยวกับพฤติกรรมของนายกรัฐมนตรีที่มีพฤติการณ์ร่ำรวยผิดปกติ ส่อไปในทางทุจริตต่อหน้าที่ราชการ หรือจงใจฝ่าฝืนบทบัญญัติแห่งรัฐธรรมนูญหรือกฎหมาย จะเสนอโดยไม่มีการยื่นคำร้องขอตามมาตรา ๓๐๕ ก่อน มิได้ และเมื่อได้มีการยื่นคำร้องขอตามมาตรา ๓๐๕ แล้ว ให้ดำเนินการต่อไปได้โดยไม่ต้องรอผลการดำเนินการตามมาตรา ๓๐๖</w:t>
+        <w:t>การเสนอญัตติขอเปิดอภิปรายทั่วไปตามวรรคหนึ่ง ถ้าเป็นเรื่องที่เกี่ยวกับพฤติกรรมของนายกรัฐมนตรีที่มีพฤติการณ์ร่ำรวยผิดปกติ ส่อไปในทางทุจริตต่อหน้าที่ราชการ หรือจงใจฝ่าฝืนบทบัญญัติแห่งรัฐธรรมนูญหรือกฎหมาย จะเสนอโดยไม่มีการยื่นคำร้องขอตามมาตรา ๒๘๖ ก่อน มิได้ และเมื่อได้มีการยื่นคำร้องขอตามมาตรา ๒๘๖ แล้ว ให้ดำเนินการต่อไปได้โดยไม่ต้องรอผลการดำเนินการตามมาตรา ๒๘๗</w:t>
       </w:r>
     </w:p>
     <w:p>
@@ -5143,7 +5143,7 @@
         <w:pStyle w:val="วรรค"/>
       </w:pPr>
       <w:r>
-        <w:t>ในกรณีที่มติไม่ไว้วางใจมีคะแนนเสียงมากกว่ากึ่งหนึ่งของจำนวนสมาชิกทั้งหมดเท่าที่มีอยู่ของสภาผู้แทนราษฎร ให้ประธานสภาผู้แทนราษฎรนำชื่อผู้ที่ได้รับการเสนอชื่อตามวรรคหนึ่งกราบบังคมทูลเพื่อทรงแต่งตั้งต่อไป และมิให้นำมาตรา ๒๐๒ มาใช้บังคับ</w:t>
+        <w:t>ในกรณีที่มติไม่ไว้วางใจมีคะแนนเสียงมากกว่ากึ่งหนึ่งของจำนวนสมาชิกทั้งหมดเท่าที่มีอยู่ของสภาผู้แทนราษฎร ให้ประธานสภาผู้แทนราษฎรนำชื่อผู้ที่ได้รับการเสนอชื่อตามวรรคหนึ่งกราบบังคมทูลเพื่อทรงแต่งตั้งต่อไป และมิให้นำมาตรา ๑๘๙ มาใช้บังคับ</w:t>
       </w:r>
     </w:p>
     <w:p>
@@ -5166,7 +5166,7 @@
         <w:pStyle w:val="วรรค"/>
       </w:pPr>
       <w:r>
-        <w:t>ให้นำบทบัญญัติมาตรา ๑๘๕ วรรคสอง วรรคสาม และวรรคสี่ มาใช้บังคับโดยอนุโลม</w:t>
+        <w:t>ให้นำบทบัญญัติมาตรา ๑๗๕ วรรคสอง วรรคสาม และวรรคสี่ มาใช้บังคับโดยอนุโลม</w:t>
       </w:r>
     </w:p>
     <w:p>
@@ -5243,7 +5243,7 @@
         <w:pStyle w:val="วรรค"/>
       </w:pPr>
       <w:r>
-        <w:t>เอกสิทธิ์ที่บัญญัติไว้ในมาตรา ๑๕๗ และมาตรา ๑๕๘ นั้น ให้คุ้มครองถึงบุคคลผู้กระทำหน้าที่ตามมาตรานี้ด้วย</w:t>
+        <w:t>เอกสิทธิ์ที่บัญญัติไว้ในมาตรา ๑๔๖ และมาตรา ๑๔๗ นั้น ให้คุ้มครองถึงบุคคลผู้กระทำหน้าที่ตามมาตรานี้ด้วย</w:t>
       </w:r>
     </w:p>
     <w:p>
@@ -5259,7 +5259,7 @@
         <w:pStyle w:val="วรรค"/>
       </w:pPr>
       <w:r>
-        <w:t>ในระหว่างที่ยังไม่มีข้อบังคับการประชุมสภาผู้แทนราษฎรตามมาตรา ๑๙๑ ให้ประธานสภาผู้แทนราษฎรเป็นผู้กำหนดอัตราส่วนตามวรรคห้า</w:t>
+        <w:t>ในระหว่างที่ยังไม่มีข้อบังคับการประชุมสภาผู้แทนราษฎรตามมาตรา ๑๘๑ ให้ประธานสภาผู้แทนราษฎรเป็นผู้กำหนดอัตราส่วนตามวรรคห้า</w:t>
       </w:r>
     </w:p>
     <w:p>
@@ -5381,7 +5381,7 @@
       <w:r>
         <w:t>(๕)</w:t>
         <w:tab/>
-        <w:t>การปรึกษาร่างพระราชบัญญัติหรือร่างพระราชบัญญัติประกอบรัฐธรรมนูญใหม่ตามมาตรา ๙๔</w:t>
+        <w:t>การปรึกษาร่างพระราชบัญญัติหรือร่างพระราชบัญญัติประกอบรัฐธรรมนูญใหม่ตามมาตรา ๙๕</w:t>
       </w:r>
     </w:p>
     <w:p>
@@ -5391,7 +5391,7 @@
       <w:r>
         <w:t>(๖)</w:t>
         <w:tab/>
-        <w:t>การมีมติให้รัฐสภาพิจารณาเรื่องอื่นในสมัยประชุมสามัญนิติบัญญัติได้ตามมาตรา ๑๕๙</w:t>
+        <w:t>การมีมติให้รัฐสภาพิจารณาเรื่องอื่นในสมัยประชุมสามัญนิติบัญญัติได้ตามมาตรา ๑๔๘</w:t>
       </w:r>
     </w:p>
     <w:p>
@@ -5401,7 +5401,7 @@
       <w:r>
         <w:t>(๗)</w:t>
         <w:tab/>
-        <w:t>การให้ความเห็นชอบในการปิดสมัยประชุมตามมาตรา ๑๖๐</w:t>
+        <w:t>การให้ความเห็นชอบในการปิดสมัยประชุมตามมาตรา ๑๔๙</w:t>
       </w:r>
     </w:p>
     <w:p>
@@ -5411,7 +5411,7 @@
       <w:r>
         <w:t>(๘)</w:t>
         <w:tab/>
-        <w:t>การเปิดประชุมรัฐสภาตามมาตรา ๑๖๑</w:t>
+        <w:t>การเปิดประชุมรัฐสภาตามมาตรา ๑๕๐</w:t>
       </w:r>
     </w:p>
     <w:p>
@@ -5421,7 +5421,7 @@
       <w:r>
         <w:t>(๙)</w:t>
         <w:tab/>
-        <w:t>การให้ความเห็นชอบให้พิจารณาร่างพระราชบัญญัติหรือร่างพระราชบัญญัติประกอบรัฐธรรมนูญตามมาตรา ๑๗๓</w:t>
+        <w:t>การให้ความเห็นชอบให้พิจารณาร่างพระราชบัญญัติหรือร่างพระราชบัญญัติประกอบรัฐธรรมนูญตามมาตรา ๑๖๓</w:t>
       </w:r>
     </w:p>
     <w:p>
@@ -5431,7 +5431,7 @@
       <w:r>
         <w:t>(๑๐)</w:t>
         <w:tab/>
-        <w:t>การให้ความเห็นชอบให้พิจารณาร่างรัฐธรรมนูญแก้ไขเพิ่มเติม ร่างพระราชบัญญัติหรือร่างพระราชบัญญัติประกอบรัฐธรรมนูญต่อไปตามมาตรา ๑๗๘ วรรคสอง</w:t>
+        <w:t>การให้ความเห็นชอบให้พิจารณาร่างรัฐธรรมนูญแก้ไขเพิ่มเติม ร่างพระราชบัญญัติหรือร่างพระราชบัญญัติประกอบรัฐธรรมนูญต่อไปตามมาตรา ๑๖๘ วรรคสอง</w:t>
       </w:r>
     </w:p>
     <w:p>
@@ -5441,7 +5441,7 @@
       <w:r>
         <w:t>(๑๑)</w:t>
         <w:tab/>
-        <w:t>การตราข้อบังคับการประชุมรัฐสภาตามมาตรา ๑๙๔</w:t>
+        <w:t>การตราข้อบังคับการประชุมรัฐสภาตามมาตรา ๑๘๔</w:t>
       </w:r>
     </w:p>
     <w:p>
@@ -5451,7 +5451,7 @@
       <w:r>
         <w:t>(๑๒)</w:t>
         <w:tab/>
-        <w:t>การแถลงนโยบายตามมาตรา ๒๑๑</w:t>
+        <w:t>การแถลงนโยบายตามมาตรา ๑๙๘</w:t>
       </w:r>
     </w:p>
     <w:p>
@@ -5461,7 +5461,7 @@
       <w:r>
         <w:t>(๑๓)</w:t>
         <w:tab/>
-        <w:t>การเปิดอภิปรายทั่วไปตามมาตรา ๒๑๓</w:t>
+        <w:t>การเปิดอภิปรายทั่วไปตามมาตรา ๒๐๐</w:t>
       </w:r>
     </w:p>
     <w:p>
@@ -5471,7 +5471,7 @@
       <w:r>
         <w:t>(๑๔)</w:t>
         <w:tab/>
-        <w:t>การให้ความเห็นชอบในการประกาศสงครามตามมาตรา ๒๒๓</w:t>
+        <w:t>การให้ความเห็นชอบในการประกาศสงครามตามมาตรา ๒๑๐</w:t>
       </w:r>
     </w:p>
     <w:p>
@@ -5481,7 +5481,7 @@
       <w:r>
         <w:t>(๑๕)</w:t>
         <w:tab/>
-        <w:t>การให้ความเห็นชอบหนังสือสัญญาตามมาตรา ๒๒๔</w:t>
+        <w:t>การให้ความเห็นชอบหนังสือสัญญาตามมาตรา ๒๑๑</w:t>
       </w:r>
     </w:p>
     <w:p>
@@ -5491,7 +5491,7 @@
       <w:r>
         <w:t>(๑๖)</w:t>
         <w:tab/>
-        <w:t>การแก้ไขเพิ่มเติมรัฐธรรมนูญตามมาตรา ๓๑๔</w:t>
+        <w:t>การแก้ไขเพิ่มเติมรัฐธรรมนูญตามมาตรา ๒๙๕</w:t>
       </w:r>
     </w:p>
     <w:p>
@@ -5548,7 +5548,7 @@
         <w:t>มาตรา ๑๘๖</w:t>
       </w:r>
       <w:r>
-        <w:t xml:space="preserve">  ถึง มาตรา ๑๙๘ (ย้ายไปบัญญัติไว้ในหมวด ๑๖ องค์กรอิสระ)</w:t>
+        <w:t xml:space="preserve">  (ย้ายไปบัญญัติไว้ในหมวด ๑๖ องค์กรอิสระ)</w:t>
       </w:r>
     </w:p>
     <w:p>
@@ -5575,7 +5575,7 @@
         <w:t>มาตรา ๑๘๗</w:t>
       </w:r>
       <w:r>
-        <w:t xml:space="preserve">  ถึง มาตรา ๒๐๐ (ย้ายไปบัญญัติไว้ในหมวด ๑๖ องค์กรอิสระ)</w:t>
+        <w:t xml:space="preserve">  (ย้ายไปบัญญัติไว้ในหมวด ๑๖ องค์กรอิสระ)</w:t>
       </w:r>
     </w:p>
     <w:p>
@@ -5610,7 +5610,7 @@
         <w:pStyle w:val="วรรค"/>
       </w:pPr>
       <w:r>
-        <w:t>นายกรัฐมนตรีต้องแต่งตั้งจากสมาชิกสภาผู้แทนราษฎรหรือผู้เคยเป็นสมาชิกสภาผู้แทนราษฎรแต่พ้นจากสมาชิกภาพตามมาตรา ๑๑๘ (๗) ในอายุของสภาผู้แทนราษฎรชุดเดียวกัน</w:t>
+        <w:t>นายกรัฐมนตรีต้องแต่งตั้งจากสมาชิกสภาผู้แทนราษฎรหรือผู้เคยเป็นสมาชิกสภาผู้แทนราษฎรแต่พ้นจากสมาชิกภาพตามมาตรา ๑๑๙ (๗) ในอายุของสภาผู้แทนราษฎรชุดเดียวกัน</w:t>
       </w:r>
     </w:p>
     <w:p>
@@ -5641,7 +5641,7 @@
         <w:t>มาตรา ๑๘๙</w:t>
       </w:r>
       <w:r>
-        <w:t xml:space="preserve">  ให้สภาผู้แทนราษฎรพิจารณาให้ความเห็นชอบบุคคลซึ่งสมควรได้รับแต่งตั้งเป็นนายกรัฐมนตรีให้แล้วเสร็จภายในสามสิบวันนับแต่วันที่มีการเรียกประชุมรัฐสภาเป็นครั้งแรกตามมาตรา ๑๕๙</w:t>
+        <w:t xml:space="preserve">  ให้สภาผู้แทนราษฎรพิจารณาให้ความเห็นชอบบุคคลซึ่งสมควรได้รับแต่งตั้งเป็นนายกรัฐมนตรีให้แล้วเสร็จภายในสามสิบวันนับแต่วันที่มีการเรียกประชุมรัฐสภาเป็นครั้งแรกตามมาตรา ๑๔๘</w:t>
       </w:r>
     </w:p>
     <w:p>
@@ -5672,7 +5672,7 @@
         <w:t>มาตรา ๑๙๐</w:t>
       </w:r>
       <w:r>
-        <w:t xml:space="preserve">  ในกรณีที่พ้นกำหนดสามสิบวันนับแต่วันที่มีการเรียกประชุมรัฐสภาเพื่อให้สมาชิกได้มาประชุมเป็นครั้งแรกแล้ว ไม่ปรากฏว่ามีบุคคลใดได้รับคะแนนเสียงเห็นชอบให้ได้รับแต่งตั้งเป็นนายกรัฐมนตรีตามมาตรา ๒๐๒ วรรคสาม ภายในสิบห้าวันนับแต่วันที่พ้นกำหนดเวลาดังกล่าว ให้ประธานสภาผู้แทนราษฎรนำความขึ้นกราบบังคมทูลเพื่อทรงมีพระบรมราชโองการแต่งตั้งบุคคลซึ่งได้รับคะแนนเสียงสูงสุดเป็นนายกรัฐมนตรี</w:t>
+        <w:t xml:space="preserve">  ในกรณีที่พ้นกำหนดสามสิบวันนับแต่วันที่มีการเรียกประชุมรัฐสภาเพื่อให้สมาชิกได้มาประชุมเป็นครั้งแรกแล้ว ไม่ปรากฏว่ามีบุคคลใดได้รับคะแนนเสียงเห็นชอบให้ได้รับแต่งตั้งเป็นนายกรัฐมนตรีตามมาตรา ๑๘๙ วรรคสาม ภายในสิบห้าวันนับแต่วันที่พ้นกำหนดเวลาดังกล่าว ให้ประธานสภาผู้แทนราษฎรนำความขึ้นกราบบังคมทูลเพื่อทรงมีพระบรมราชโองการแต่งตั้งบุคคลซึ่งได้รับคะแนนเสียงสูงสุดเป็นนายกรัฐมนตรี</w:t>
       </w:r>
     </w:p>
     <w:p>
@@ -5773,7 +5773,7 @@
       <w:r>
         <w:t>(๔)</w:t>
         <w:tab/>
-        <w:t>ไม่มีลักษณะต้องห้ามตามมาตรา ๑๐๙ (๑) (๒) (๓) (๔) (๖) (๗) (๑๒) (๑๓) หรือ (๑๔)</w:t>
+        <w:t>ไม่มีลักษณะต้องห้ามตามมาตรา ๑๑๐ (๑) (๒) (๓) (๔) (๖) (๗) (๑๒) (๑๓) หรือ (๑๔)</w:t>
       </w:r>
     </w:p>
     <w:p>
@@ -5793,7 +5793,7 @@
       <w:r>
         <w:t>(๖)</w:t>
         <w:tab/>
-        <w:t>ไม่เป็นสมาชิกวุฒิสภา หรือเคยเป็นสมาชิกวุฒิสภาซึ่งสมาชิกภาพสิ้นสุดลงมาแล้วยังไม่เกินหนึ่งปีนับถึงวันที่ได้รับแต่งตั้งเป็นรัฐมนตรี เว้นแต่สมาชิกภาพสิ้นสุดลงตามมาตรา ๑๓๓ (๑)</w:t>
+        <w:t>ไม่เป็นสมาชิกวุฒิสภา หรือเคยเป็นสมาชิกวุฒิสภาซึ่งสมาชิกภาพสิ้นสุดลงมาแล้วยังไม่เกินหนึ่งปีนับถึงวันที่ได้รับแต่งตั้งเป็นรัฐมนตรี เว้นแต่สมาชิกภาพสิ้นสุดลงตามมาตรา ๑๓๔ (๑)</w:t>
       </w:r>
     </w:p>
     <w:p>
@@ -5823,7 +5823,7 @@
         <w:t>มาตรา ๑๙๕</w:t>
       </w:r>
       <w:r>
-        <w:t xml:space="preserve">  รัฐมนตรีจะดำรงตำแหน่งหรือกระทำการใดตามที่บัญญัติในมาตรา ๑๑๐ มิได้ เว้นแต่ตำแหน่งที่ต้องดำรงตามบทบัญญัติแห่งกฎหมาย และจะดำรงตำแหน่งใดในห้างหุ้นส่วน บริษัท หรือองค์การที่ดำเนินธุรกิจโดยมุ่งหาผลกำไรหรือรายได้มาแบ่งปันกัน หรือเป็นลูกจ้างของบุคคลใดก็มิได้ด้วย</w:t>
+        <w:t xml:space="preserve">  รัฐมนตรีจะดำรงตำแหน่งหรือกระทำการใดตามที่บัญญัติในมาตรา ๑๑๑ มิได้ เว้นแต่ตำแหน่งที่ต้องดำรงตามบทบัญญัติแห่งกฎหมาย และจะดำรงตำแหน่งใดในห้างหุ้นส่วน บริษัท หรือองค์การที่ดำเนินธุรกิจโดยมุ่งหาผลกำไรหรือรายได้มาแบ่งปันกัน หรือเป็นลูกจ้างของบุคคลใดก็มิได้ด้วย</w:t>
       </w:r>
     </w:p>
     <w:p>
@@ -5869,7 +5869,7 @@
         <w:pStyle w:val="วรรค"/>
       </w:pPr>
       <w:r>
-        <w:t>เอกสิทธิ์ที่บัญญัติไว้ในมาตรา ๑๕๗ และมาตรา ๑๕๘ ให้นำมาใช้บังคับโดยอนุโลม</w:t>
+        <w:t>เอกสิทธิ์ที่บัญญัติไว้ในมาตรา ๑๔๖ และมาตรา ๑๔๗ ให้นำมาใช้บังคับโดยอนุโลม</w:t>
       </w:r>
     </w:p>
     <w:p>
@@ -5907,7 +5907,7 @@
         <w:t>มาตรา ๑๙๙</w:t>
       </w:r>
       <w:r>
-        <w:t xml:space="preserve">  ในการบริหารราชการแผ่นดิน รัฐมนตรีต้องดำเนินการตามบทบัญญัติแห่งรัฐธรรมนูญ กฎหมาย และนโยบายที่ได้แถลงไว้ตามมาตรา ๒๑๑ และต้องรับผิดชอบต่อสภาผู้แทนราษฎรในหน้าที่ของตน รวมทั้งต้องรับผิดชอบร่วมกันต่อรัฐสภาในนโยบายทั่วไปของคณะรัฐมนตรี</w:t>
+        <w:t xml:space="preserve">  ในการบริหารราชการแผ่นดิน รัฐมนตรีต้องดำเนินการตามบทบัญญัติแห่งรัฐธรรมนูญ กฎหมาย และนโยบายที่ได้แถลงไว้ตามมาตรา ๑๙๘ และต้องรับผิดชอบต่อสภาผู้แทนราษฎรในหน้าที่ของตน รวมทั้งต้องรับผิดชอบร่วมกันต่อรัฐสภาในนโยบายทั่วไปของคณะรัฐมนตรี</w:t>
       </w:r>
     </w:p>
     <w:p>
@@ -6018,7 +6018,7 @@
       <w:r>
         <w:t>(๑)</w:t>
         <w:tab/>
-        <w:t>ความเป็นรัฐมนตรีของนายกรัฐมนตรีสิ้นสุดลงตามมาตรา ๒๑๖</w:t>
+        <w:t>ความเป็นรัฐมนตรีของนายกรัฐมนตรีสิ้นสุดลงตามมาตรา ๒๐๓</w:t>
       </w:r>
     </w:p>
     <w:p>
@@ -6054,7 +6054,7 @@
         <w:pStyle w:val="วรรค"/>
       </w:pPr>
       <w:r>
-        <w:t>มิให้นำบทบัญญัติมาตรา ๑๑๘ (๗) และวรรคสอง และมาตรา ๒๐๔ มาใช้บังคับกับคณะรัฐมนตรีที่พ้นจากตำแหน่งและอยู่ในระหว่างที่ปฏิบัติหน้าที่ตามวรรคสอง</w:t>
+        <w:t>มิให้นำบทบัญญัติมาตรา ๑๑๙ (๗) และวรรคสอง และมาตรา ๑๙๑ มาใช้บังคับกับคณะรัฐมนตรีที่พ้นจากตำแหน่งและอยู่ในระหว่างที่ปฏิบัติหน้าที่ตามวรรคสอง</w:t>
       </w:r>
     </w:p>
     <w:p>
@@ -6062,7 +6062,7 @@
         <w:pStyle w:val="วรรค"/>
       </w:pPr>
       <w:r>
-        <w:t>ในกรณีที่ความเป็นรัฐมนตรีของนายกรัฐมนตรีสิ้นสุดลงตามมาตรา ๒๑๖ (๑) (๒) (๓) (๔) (๖) หรือ (๘) ให้ดำเนินการตามมาตรา ๒๐๒ และมาตรา ๒๐๓ โดยอนุโลม</w:t>
+        <w:t>ในกรณีที่ความเป็นรัฐมนตรีของนายกรัฐมนตรีสิ้นสุดลงตามมาตรา ๒๐๓ (๑) (๒) (๓) (๔) (๖) หรือ (๘) ให้ดำเนินการตามมาตรา ๑๘๙ และมาตรา ๑๙๐ โดยอนุโลม</w:t>
       </w:r>
     </w:p>
     <w:p>
@@ -6107,7 +6107,7 @@
       <w:r>
         <w:t>(๓)</w:t>
         <w:tab/>
-        <w:t>ขาดคุณสมบัติหรือมีลักษณะต้องห้ามตามมาตรา ๒๐๖</w:t>
+        <w:t>ขาดคุณสมบัติหรือมีลักษณะต้องห้ามตามมาตรา ๑๙๓</w:t>
       </w:r>
     </w:p>
     <w:p>
@@ -6127,7 +6127,7 @@
       <w:r>
         <w:t>(๕)</w:t>
         <w:tab/>
-        <w:t>สภาผู้แทนราษฎรมีมติไม่ไว้วางใจตามมาตรา ๑๘๕ หรือมาตรา ๑๘๖</w:t>
+        <w:t>สภาผู้แทนราษฎรมีมติไม่ไว้วางใจตามมาตรา ๑๗๕ หรือมาตรา ๑๗๖</w:t>
       </w:r>
     </w:p>
     <w:p>
@@ -6137,7 +6137,7 @@
       <w:r>
         <w:t>(๖)</w:t>
         <w:tab/>
-        <w:t>กระทำการอันต้องห้ามตามมาตรา ๒๐๘ หรือมาตรา ๒๐๙</w:t>
+        <w:t>กระทำการอันต้องห้ามตามมาตรา ๑๙๕ หรือมาตรา ๑๙๖</w:t>
       </w:r>
     </w:p>
     <w:p>
@@ -6147,7 +6147,7 @@
       <w:r>
         <w:t>(๗)</w:t>
         <w:tab/>
-        <w:t>มีพระบรมราชโองการตามมาตรา ๒๑๗</w:t>
+        <w:t>มีพระบรมราชโองการตามมาตรา ๒๐๔</w:t>
       </w:r>
     </w:p>
     <w:p>
@@ -6157,7 +6157,7 @@
       <w:r>
         <w:t>(๘)</w:t>
         <w:tab/>
-        <w:t>วุฒิสภามีมติตามมาตรา ๓๐๘ ให้ถอดถอนออกจากตำแหน่ง</w:t>
+        <w:t>วุฒิสภามีมติตามมาตรา ๒๘๙ ให้ถอดถอนออกจากตำแหน่ง</w:t>
       </w:r>
     </w:p>
     <w:p>
@@ -6167,7 +6167,7 @@
       <w:r>
         <w:t>(๙)</w:t>
         <w:tab/>
-        <w:t>ดำรงตำแหน่งครบกำหนดตามมาตรา ๒๐๑ วรรคสาม</w:t>
+        <w:t>ดำรงตำแหน่งครบกำหนดตามมาตรา ๑๘๘ วรรคสาม</w:t>
       </w:r>
     </w:p>
     <w:p>
@@ -6175,7 +6175,7 @@
         <w:pStyle w:val="วรรค"/>
       </w:pPr>
       <w:r>
-        <w:t>ให้นำบทบัญญัติมาตรา ๙๖ และมาตรา ๙๗ มาใช้บังคับกับการสิ้นสุดของความเป็นรัฐมนตรีตาม (๒) (๓) (๔) หรือ (๖)</w:t>
+        <w:t>ให้นำบทบัญญัติมาตรา ๙๗ และมาตรา ๙๘ มาใช้บังคับกับการสิ้นสุดของความเป็นรัฐมนตรีตาม (๒) (๓) (๔) หรือ (๖)</w:t>
       </w:r>
     </w:p>
     <w:p>
@@ -6268,7 +6268,7 @@
         <w:t>มาตรา ๒๐๖</w:t>
       </w:r>
       <w:r>
-        <w:t xml:space="preserve">  ก่อนที่สภาผู้แทนราษฎรหรือวุฒิสภาจะได้อนุมัติพระราชกำหนดใดตามมาตรา ๒๑๘ วรรคสาม สมาชิกสภาผู้แทนราษฎรหรือสมาชิกวุฒิสภาจำนวนไม่น้อยกว่าหนึ่งในห้าของจำนวนสมาชิกทั้งหมดเท่าที่มีอยู่ของแต่ละสภา มีสิทธิเข้าชื่อเสนอความเห็นต่อประธานแห่งสภาที่ตนเป็นสมาชิกว่าพระราชกำหนดนั้นไม่เป็นไปตามมาตรา ๒๑๘ วรรคหนึ่ง และให้ประธานแห่งสภาที่ได้รับความเห็นดังกล่าว ส่งความเห็นนั้นไปยังศาลรัฐธรรมนูญเพื่อวินิจฉัย เมื่อศาลรัฐธรรมนูญวินิจฉัยแล้ว ให้ศาลรัฐธรรมนูญแจ้งคำวินิจฉัยนั้นไปยังประธานแห่งสภาที่ส่งความเห็นนั้นมา</w:t>
+        <w:t xml:space="preserve">  ก่อนที่สภาผู้แทนราษฎรหรือวุฒิสภาจะได้อนุมัติพระราชกำหนดใดตามมาตรา ๒๐๕ วรรคสาม สมาชิกสภาผู้แทนราษฎรหรือสมาชิกวุฒิสภาจำนวนไม่น้อยกว่าหนึ่งในห้าของจำนวนสมาชิกทั้งหมดเท่าที่มีอยู่ของแต่ละสภา มีสิทธิเข้าชื่อเสนอความเห็นต่อประธานแห่งสภาที่ตนเป็นสมาชิกว่าพระราชกำหนดนั้นไม่เป็นไปตามมาตรา ๒๐๕ วรรคหนึ่ง และให้ประธานแห่งสภาที่ได้รับความเห็นดังกล่าว ส่งความเห็นนั้นไปยังศาลรัฐธรรมนูญเพื่อวินิจฉัย เมื่อศาลรัฐธรรมนูญวินิจฉัยแล้ว ให้ศาลรัฐธรรมนูญแจ้งคำวินิจฉัยนั้นไปยังประธานแห่งสภาที่ส่งความเห็นนั้นมา</w:t>
       </w:r>
     </w:p>
     <w:p>
@@ -6284,7 +6284,7 @@
         <w:pStyle w:val="วรรค"/>
       </w:pPr>
       <w:r>
-        <w:t>ในกรณีที่ศาลรัฐธรรมนูญวินิจฉัยว่าพระราชกำหนดใดไม่เป็นไปตามมาตรา ๒๑๘ วรรคหนึ่ง ให้พระราชกำหนดนั้นไม่มีผลบังคับมาแต่ต้น</w:t>
+        <w:t>ในกรณีที่ศาลรัฐธรรมนูญวินิจฉัยว่าพระราชกำหนดใดไม่เป็นไปตามมาตรา ๒๐๕ วรรคหนึ่ง ให้พระราชกำหนดนั้นไม่มีผลบังคับมาแต่ต้น</w:t>
       </w:r>
     </w:p>
     <w:p>
@@ -6292,7 +6292,7 @@
         <w:pStyle w:val="วรรค"/>
       </w:pPr>
       <w:r>
-        <w:t>คำวินิจฉัยของศาลรัฐธรรมนูญว่าพระราชกำหนดใดไม่เป็นไปตามมาตรา ๒๑๘ วรรคหนึ่ง ต้องมีคะแนนเสียงไม่น้อยกว่าสองในสามของจำนวนตุลาการศาลรัฐธรรมนูญทั้งหมด</w:t>
+        <w:t>คำวินิจฉัยของศาลรัฐธรรมนูญว่าพระราชกำหนดใดไม่เป็นไปตามมาตรา ๒๐๕ วรรคหนึ่ง ต้องมีคะแนนเสียงไม่น้อยกว่าสองในสามของจำนวนตุลาการศาลรัฐธรรมนูญทั้งหมด</w:t>
       </w:r>
     </w:p>
     <w:p>
@@ -6315,7 +6315,7 @@
         <w:pStyle w:val="วรรค"/>
       </w:pPr>
       <w:r>
-        <w:t>พระราชกำหนดที่ได้ตราขึ้นตามวรรคหนึ่ง จะต้องนำเสนอต่อสภาผู้แทนราษฎรภายในสามวันนับแต่วันถัดจากวันประกาศในราชกิจจานุเบกษา และให้นำบทบัญญัติมาตรา ๒๑๘ มาใช้บังคับโดยอนุโลม</w:t>
+        <w:t>พระราชกำหนดที่ได้ตราขึ้นตามวรรคหนึ่ง จะต้องนำเสนอต่อสภาผู้แทนราษฎรภายในสามวันนับแต่วันถัดจากวันประกาศในราชกิจจานุเบกษา และให้นำบทบัญญัติมาตรา ๒๐๕ มาใช้บังคับโดยอนุโลม</w:t>
       </w:r>
     </w:p>
     <w:p>
@@ -7142,7 +7142,7 @@
       <w:r>
         <w:t>(๓)</w:t>
         <w:tab/>
-        <w:t>ผู้ทรงคุณวุฒิสาขานิติศาสตร์ ซึ่งได้รับเลือกตามมาตรา ๒๕๗ จำนวนห้าคน</w:t>
+        <w:t>ผู้ทรงคุณวุฒิสาขานิติศาสตร์ ซึ่งได้รับเลือกตามมาตรา ๒๔๔ จำนวนห้าคน</w:t>
       </w:r>
     </w:p>
     <w:p>
@@ -7152,7 +7152,7 @@
       <w:r>
         <w:t>(๔)</w:t>
         <w:tab/>
-        <w:t>ผู้ทรงคุณวุฒิสาขารัฐศาสตร์ ซึ่งได้รับเลือกตามมาตรา ๒๕๗ จำนวนสามคน</w:t>
+        <w:t>ผู้ทรงคุณวุฒิสาขารัฐศาสตร์ ซึ่งได้รับเลือกตามมาตรา ๒๔๔ จำนวนสามคน</w:t>
       </w:r>
     </w:p>
     <w:p>
@@ -7183,7 +7183,7 @@
         <w:t>มาตรา ๒๔๓</w:t>
       </w:r>
       <w:r>
-        <w:t xml:space="preserve">  ผู้ทรงคุณวุฒิตามมาตรา ๒๕๕ (๓) และ (๔) ต้องมีคุณสมบัติและไม่มีลักษณะต้องห้าม ดังต่อไปนี้</w:t>
+        <w:t xml:space="preserve">  ผู้ทรงคุณวุฒิตามมาตรา ๒๔๒ (๓) และ (๔) ต้องมีคุณสมบัติและไม่มีลักษณะต้องห้าม ดังต่อไปนี้</w:t>
       </w:r>
     </w:p>
     <w:p>
@@ -7223,7 +7223,7 @@
       <w:r>
         <w:t>(๔)</w:t>
         <w:tab/>
-        <w:t>ไม่มีลักษณะต้องห้ามตามมาตรา ๑๐๖ หรือมาตรา ๑๐๙ (๑) (๒) (๔) (๕) (๖) (๗) (๑๓) หรือ (๑๔)</w:t>
+        <w:t>ไม่มีลักษณะต้องห้ามตามมาตรา ๑๐๗ หรือมาตรา ๑๑๐ (๑) (๒) (๔) (๕) (๖) (๗) (๑๓) หรือ (๑๔)</w:t>
       </w:r>
     </w:p>
     <w:p>
@@ -7268,7 +7268,7 @@
         <w:t>มาตรา ๒๔๔</w:t>
       </w:r>
       <w:r>
-        <w:t xml:space="preserve">  การสรรหาและการเลือกตุลาการศาลรัฐธรรมนูญตามมาตรา ๒๕๕ (๓) และ (๔) ให้ดำเนินการดังนี้</w:t>
+        <w:t xml:space="preserve">  การสรรหาและการเลือกตุลาการศาลรัฐธรรมนูญตามมาตรา ๒๔๒ (๓) และ (๔) ให้ดำเนินการดังนี้</w:t>
       </w:r>
     </w:p>
     <w:p>
@@ -7278,7 +7278,7 @@
       <w:r>
         <w:t>(๑)</w:t>
         <w:tab/>
-        <w:t>ให้มีคณะกรรมการสรรหาตุลาการศาลรัฐธรรมนูญคณะหนึ่ง ประกอบด้วย ประธานศาลฎีกา คณบดีคณะนิติศาสตร์หรือเทียบเท่าของสถาบันอุดมศึกษาของรัฐทุกแห่งซึ่งเลือกกันเองให้เหลือสี่คน คณบดีคณะรัฐศาสตร์หรือเทียบเท่าของสถาบันอุดมศึกษาของรัฐทุกแห่งซึ่งเลือกกันเองให้เหลือสี่คน ผู้แทนพรรคการเมืองทุกพรรคที่มีสมาชิกเป็นสมาชิกสภาผู้แทนราษฎร พรรคละหนึ่งคน ซึ่งเลือกกันเองให้เหลือสี่คน เป็นกรรมการ คณะกรรมการดังกล่าวมีหน้าที่สรรหาและจัดทำบัญชีรายชื่อผู้ทรงคุณวุฒิตามมาตรา ๒๕๕ (๓) จำนวนสิบคน และผู้ทรงคุณวุฒิตามมาตรา ๒๕๕ (๔) จำนวนหกคน เสนอต่อประธานวุฒิสภา โดยต้องเสนอพร้อมความยินยอมของผู้ได้รับการเสนอชื่อนั้น ทั้งนี้ ภายในสามสิบวันนับแต่วันที่มีเหตุทำให้ต้องมีการเลือกบุคคลให้ดำรงตำแหน่งดังกล่าว มติในการเสนอชื่อดังกล่าวต้องมีคะแนนเสียงไม่น้อยกว่าสามในสี่ของจำนวนกรรมการทั้งหมดเท่าที่มีอยู่</w:t>
+        <w:t>ให้มีคณะกรรมการสรรหาตุลาการศาลรัฐธรรมนูญคณะหนึ่ง ประกอบด้วย ประธานศาลฎีกา คณบดีคณะนิติศาสตร์หรือเทียบเท่าของสถาบันอุดมศึกษาของรัฐทุกแห่งซึ่งเลือกกันเองให้เหลือสี่คน คณบดีคณะรัฐศาสตร์หรือเทียบเท่าของสถาบันอุดมศึกษาของรัฐทุกแห่งซึ่งเลือกกันเองให้เหลือสี่คน ผู้แทนพรรคการเมืองทุกพรรคที่มีสมาชิกเป็นสมาชิกสภาผู้แทนราษฎร พรรคละหนึ่งคน ซึ่งเลือกกันเองให้เหลือสี่คน เป็นกรรมการ คณะกรรมการดังกล่าวมีหน้าที่สรรหาและจัดทำบัญชีรายชื่อผู้ทรงคุณวุฒิตามมาตรา ๒๔๒ (๓) จำนวนสิบคน และผู้ทรงคุณวุฒิตามมาตรา ๒๔๒ (๔) จำนวนหกคน เสนอต่อประธานวุฒิสภา โดยต้องเสนอพร้อมความยินยอมของผู้ได้รับการเสนอชื่อนั้น ทั้งนี้ ภายในสามสิบวันนับแต่วันที่มีเหตุทำให้ต้องมีการเลือกบุคคลให้ดำรงตำแหน่งดังกล่าว มติในการเสนอชื่อดังกล่าวต้องมีคะแนนเสียงไม่น้อยกว่าสามในสี่ของจำนวนกรรมการทั้งหมดเท่าที่มีอยู่</w:t>
       </w:r>
     </w:p>
     <w:p>
@@ -7288,7 +7288,7 @@
       <w:r>
         <w:t>(๒)</w:t>
         <w:tab/>
-        <w:t>ให้ประธานวุฒิสภาเรียกประชุมวุฒิสภาเพื่อมีมติเลือกบุคคลผู้ได้รับการเสนอชื่อในบัญชีตาม (๑) ซึ่งต้องกระทำโดยวิธีลงคะแนนลับ ในการนี้ ให้ห้าคนแรกในบัญชีรายชื่อผู้ทรงคุณวุฒิตามมาตรา ๒๕๕ (๓) และสามคนแรกในบัญชีรายชื่อผู้ทรงคุณวุฒิตามมาตรา ๒๕๕ (๔) ซึ่งได้รับคะแนนสูงสุดและมีคะแนนมากกว่ากึ่งหนึ่งของจำนวนสมาชิกทั้งหมดเท่าที่มีอยู่ของวุฒิสภา เป็นผู้ได้รับเลือกเป็นตุลาการศาลรัฐธรรมนูญ แต่ถ้าจำนวนผู้ได้รับเลือกดังกล่าวจากบัญชีรายชื่อผู้ทรงคุณวุฒิตามมาตรา ๒๕๕ (๓) มีไม่ครบห้าคน หรือจากบัญชีรายชื่อผู้ทรงคุณวุฒิตามมาตรา ๒๕๕ (๔) มีไม่ครบสามคน ให้นำรายชื่อผู้ไม่ได้รับเลือกในคราวแรกในบัญชีนั้นมาให้สมาชิกวุฒิสภาออกเสียงลงคะแนนเลือกอีกครั้งหนึ่งต่อเนื่องกันไป และในกรณีนี้ ให้ผู้ได้รับคะแนนสูงสุดเรียงลงไปตามลำดับจนครบจำนวน เป็นผู้ได้รับเลือกให้เป็นตุลาการศาลรัฐธรรมนูญ ถ้ามีผู้ได้รับคะแนนเท่ากันในลำดับใดอันเป็นเหตุให้มีผู้ได้รับเลือกเกินห้าคนหรือสามคน แล้วแต่กรณี ให้ประธานวุฒิสภาจับสลากว่าผู้ใดเป็นผู้ได้รับเลือก</w:t>
+        <w:t>ให้ประธานวุฒิสภาเรียกประชุมวุฒิสภาเพื่อมีมติเลือกบุคคลผู้ได้รับการเสนอชื่อในบัญชีตาม (๑) ซึ่งต้องกระทำโดยวิธีลงคะแนนลับ ในการนี้ ให้ห้าคนแรกในบัญชีรายชื่อผู้ทรงคุณวุฒิตามมาตรา ๒๔๒ (๓) และสามคนแรกในบัญชีรายชื่อผู้ทรงคุณวุฒิตามมาตรา ๒๔๒ (๔) ซึ่งได้รับคะแนนสูงสุดและมีคะแนนมากกว่ากึ่งหนึ่งของจำนวนสมาชิกทั้งหมดเท่าที่มีอยู่ของวุฒิสภา เป็นผู้ได้รับเลือกเป็นตุลาการศาลรัฐธรรมนูญ แต่ถ้าจำนวนผู้ได้รับเลือกดังกล่าวจากบัญชีรายชื่อผู้ทรงคุณวุฒิตามมาตรา ๒๔๒ (๓) มีไม่ครบห้าคน หรือจากบัญชีรายชื่อผู้ทรงคุณวุฒิตามมาตรา ๒๔๒ (๔) มีไม่ครบสามคน ให้นำรายชื่อผู้ไม่ได้รับเลือกในคราวแรกในบัญชีนั้นมาให้สมาชิกวุฒิสภาออกเสียงลงคะแนนเลือกอีกครั้งหนึ่งต่อเนื่องกันไป และในกรณีนี้ ให้ผู้ได้รับคะแนนสูงสุดเรียงลงไปตามลำดับจนครบจำนวน เป็นผู้ได้รับเลือกให้เป็นตุลาการศาลรัฐธรรมนูญ ถ้ามีผู้ได้รับคะแนนเท่ากันในลำดับใดอันเป็นเหตุให้มีผู้ได้รับเลือกเกินห้าคนหรือสามคน แล้วแต่กรณี ให้ประธานวุฒิสภาจับสลากว่าผู้ใดเป็นผู้ได้รับเลือก</w:t>
       </w:r>
     </w:p>
     <w:p>
@@ -7296,7 +7296,7 @@
         <w:pStyle w:val="วรรค"/>
       </w:pPr>
       <w:r>
-        <w:t>ให้นำบทบัญญัติมาตรา ๒๕๕ วรรคสองและวรรคสาม มาใช้บังคับ</w:t>
+        <w:t>ให้นำบทบัญญัติมาตรา ๒๔๒ วรรคสองและวรรคสาม มาใช้บังคับ</w:t>
       </w:r>
     </w:p>
     <w:p>
@@ -7359,7 +7359,7 @@
         <w:pStyle w:val="วรรค"/>
       </w:pPr>
       <w:r>
-        <w:t>ในกรณีที่ที่ประชุมใหญ่ศาลฎีกา ที่ประชุมใหญ่ศาลปกครองสูงสุด หรือวุฒิสภา แล้วแต่กรณี เลือกบุคคลตาม (๑) (๒) (๓) หรือ (๔) โดยได้รับความยินยอมของบุคคลนั้น ผู้ได้รับเลือกจะเริ่มปฏิบัติหน้าที่ได้ต่อเมื่อตนได้ลาออกจากการเป็นบุคคลตาม (๑) (๒) หรือ (๓) หรือแสดงหลักฐานให้เป็นที่เชื่อได้ว่าตนได้เลิกประกอบวิชาชีพอิสระดังกล่าวแล้ว ซึ่งต้องกระทำภายในสิบห้าวันนับแต่วันที่ได้รับเลือก แต่ถ้าผู้นั้นมิได้ลาออกหรือเลิกประกอบวิชาชีพอิสระภายในเวลาที่กำหนด ให้ถือว่าผู้นั้นมิได้เคยรับเลือกให้เป็นตุลาการศาลรัฐธรรมนูญ และให้นำบทบัญญัติมาตรา ๒๖๑ มาใช้บังคับ</w:t>
+        <w:t>ในกรณีที่ที่ประชุมใหญ่ศาลฎีกา ที่ประชุมใหญ่ศาลปกครองสูงสุด หรือวุฒิสภา แล้วแต่กรณี เลือกบุคคลตาม (๑) (๒) (๓) หรือ (๔) โดยได้รับความยินยอมของบุคคลนั้น ผู้ได้รับเลือกจะเริ่มปฏิบัติหน้าที่ได้ต่อเมื่อตนได้ลาออกจากการเป็นบุคคลตาม (๑) (๒) หรือ (๓) หรือแสดงหลักฐานให้เป็นที่เชื่อได้ว่าตนได้เลิกประกอบวิชาชีพอิสระดังกล่าวแล้ว ซึ่งต้องกระทำภายในสิบห้าวันนับแต่วันที่ได้รับเลือก แต่ถ้าผู้นั้นมิได้ลาออกหรือเลิกประกอบวิชาชีพอิสระภายในเวลาที่กำหนด ให้ถือว่าผู้นั้นมิได้เคยรับเลือกให้เป็นตุลาการศาลรัฐธรรมนูญ และให้นำบทบัญญัติมาตรา ๒๔๘ มาใช้บังคับ</w:t>
       </w:r>
     </w:p>
     <w:p>
@@ -7445,7 +7445,7 @@
       <w:r>
         <w:t>(๔)</w:t>
         <w:tab/>
-        <w:t>ขาดคุณสมบัติหรือมีลักษณะต้องห้ามตามมาตรา ๒๕๖</w:t>
+        <w:t>ขาดคุณสมบัติหรือมีลักษณะต้องห้ามตามมาตรา ๒๔๓</w:t>
       </w:r>
     </w:p>
     <w:p>
@@ -7455,7 +7455,7 @@
       <w:r>
         <w:t>(๕)</w:t>
         <w:tab/>
-        <w:t>กระทำการอันเป็นการฝ่าฝืนมาตรา ๒๕๘</w:t>
+        <w:t>กระทำการอันเป็นการฝ่าฝืนมาตรา ๒๔๕</w:t>
       </w:r>
     </w:p>
     <w:p>
@@ -7465,7 +7465,7 @@
       <w:r>
         <w:t>(๖)</w:t>
         <w:tab/>
-        <w:t>วุฒิสภามีมติตามมาตรา ๓๐๘ ให้ถอดถอนออกจากตำแหน่ง</w:t>
+        <w:t>วุฒิสภามีมติตามมาตรา ๒๘๙ ให้ถอดถอนออกจากตำแหน่ง</w:t>
       </w:r>
     </w:p>
     <w:p>
@@ -7483,7 +7483,7 @@
         <w:pStyle w:val="วรรค"/>
       </w:pPr>
       <w:r>
-        <w:t>เมื่อมีกรณีตามวรรคหนึ่ง ให้ตุลาการศาลรัฐธรรมนูญที่เหลืออยู่ปฏิบัติหน้าที่ต่อไปได้ภายใต้บังคับมาตรา ๒๖๗</w:t>
+        <w:t>เมื่อมีกรณีตามวรรคหนึ่ง ให้ตุลาการศาลรัฐธรรมนูญที่เหลืออยู่ปฏิบัติหน้าที่ต่อไปได้ภายใต้บังคับมาตรา ๒๕๔</w:t>
       </w:r>
     </w:p>
     <w:p>
@@ -7498,7 +7498,7 @@
         <w:t>มาตรา ๒๔๘</w:t>
       </w:r>
       <w:r>
-        <w:t xml:space="preserve">  ในกรณีที่ประธานศาลรัฐธรรมนูญและตุลาการศาลรัฐธรรมนูญพ้นจากตำแหน่งตามวาระพร้อมกันทั้งหมด ให้เริ่มดำเนินการตามมาตรา ๒๕๕ และมาตรา ๒๕๗ ภายในสามสิบวันนับแต่วันที่พ้นจากตำแหน่ง</w:t>
+        <w:t xml:space="preserve">  ในกรณีที่ประธานศาลรัฐธรรมนูญและตุลาการศาลรัฐธรรมนูญพ้นจากตำแหน่งตามวาระพร้อมกันทั้งหมด ให้เริ่มดำเนินการตามมาตรา ๒๔๒ และมาตรา ๒๔๔ ภายในสามสิบวันนับแต่วันที่พ้นจากตำแหน่ง</w:t>
       </w:r>
     </w:p>
     <w:p>
@@ -7516,7 +7516,7 @@
       <w:r>
         <w:t>(๑)</w:t>
         <w:tab/>
-        <w:t>ในกรณีที่เป็นตุลาการศาลรัฐธรรมนูญซึ่งได้รับเลือกโดยที่ประชุมใหญ่ศาลฎีกา ให้นำมาตรา ๒๕๕ (๑) มาใช้บังคับโดยอนุโลม ทั้งนี้ ให้ดำเนินการเลือกให้แล้วเสร็จภายในสามสิบวันนับแต่วันที่พ้นจากตำแหน่ง</w:t>
+        <w:t>ในกรณีที่เป็นตุลาการศาลรัฐธรรมนูญซึ่งได้รับเลือกโดยที่ประชุมใหญ่ศาลฎีกา ให้นำมาตรา ๒๔๒ (๑) มาใช้บังคับโดยอนุโลม ทั้งนี้ ให้ดำเนินการเลือกให้แล้วเสร็จภายในสามสิบวันนับแต่วันที่พ้นจากตำแหน่ง</w:t>
       </w:r>
     </w:p>
     <w:p>
@@ -7526,7 +7526,7 @@
       <w:r>
         <w:t>(๒)</w:t>
         <w:tab/>
-        <w:t>ในกรณีที่เป็นตุลาการศาลรัฐธรรมนูญซึ่งได้รับเลือกโดยที่ประชุมใหญ่ศาลปกครองสูงสุด ให้นำมาตรา ๒๕๕ (๒) มาใช้บังคับโดยอนุโลม ทั้งนี้ ให้ดำเนินการเลือกให้แล้วเสร็จภายในสามสิบวันนับแต่วันที่พ้นจากตำแหน่ง</w:t>
+        <w:t>ในกรณีที่เป็นตุลาการศาลรัฐธรรมนูญซึ่งได้รับเลือกโดยที่ประชุมใหญ่ศาลปกครองสูงสุด ให้นำมาตรา ๒๔๒ (๒) มาใช้บังคับโดยอนุโลม ทั้งนี้ ให้ดำเนินการเลือกให้แล้วเสร็จภายในสามสิบวันนับแต่วันที่พ้นจากตำแหน่ง</w:t>
       </w:r>
     </w:p>
     <w:p>
@@ -7536,7 +7536,7 @@
       <w:r>
         <w:t>(๓)</w:t>
         <w:tab/>
-        <w:t>ในกรณีที่เป็นตุลาการศาลรัฐธรรมนูญตามมาตรา ๒๕๕ (๓) หรือ (๔) ให้นำมาตรา ๒๕๗ มาใช้บังคับโดยอนุโลม ในกรณีนี้ ให้เสนอชื่อผู้สมควรเป็นตุลาการศาลรัฐธรรมนูญผู้ทรงคุณวุฒิตามมาตรา ๒๕๕ (๓) หรือ (๔) เป็นจำนวนสองเท่าของผู้ซึ่งพ้นจากตำแหน่งต่อประธานวุฒิสภา และให้วุฒิสภามีมติเลือก ทั้งนี้ ให้ดำเนินการเลือกให้แล้วเสร็จภายในสามสิบวันนับแต่วันที่พ้นจากตำแหน่ง</w:t>
+        <w:t>ในกรณีที่เป็นตุลาการศาลรัฐธรรมนูญตามมาตรา ๒๔๒ (๓) หรือ (๔) ให้นำมาตรา ๒๔๔ มาใช้บังคับโดยอนุโลม ในกรณีนี้ ให้เสนอชื่อผู้สมควรเป็นตุลาการศาลรัฐธรรมนูญผู้ทรงคุณวุฒิตามมาตรา ๒๔๒ (๓) หรือ (๔) เป็นจำนวนสองเท่าของผู้ซึ่งพ้นจากตำแหน่งต่อประธานวุฒิสภา และให้วุฒิสภามีมติเลือก ทั้งนี้ ให้ดำเนินการเลือกให้แล้วเสร็จภายในสามสิบวันนับแต่วันที่พ้นจากตำแหน่ง</w:t>
       </w:r>
     </w:p>
     <w:p>
@@ -7544,7 +7544,7 @@
         <w:pStyle w:val="วรรค"/>
       </w:pPr>
       <w:r>
-        <w:t>ในกรณีที่ตุลาการศาลรัฐธรรมนูญพ้นจากตำแหน่งไม่ว่าทั้งหมดหรือบางส่วนในระหว่างที่อยู่นอกสมัยประชุมของรัฐสภา ให้ดำเนินการตามมาตรา ๒๕๗ ภายในสามสิบวันนับแต่วันเปิดสมัยประชุมของรัฐสภา</w:t>
+        <w:t>ในกรณีที่ตุลาการศาลรัฐธรรมนูญพ้นจากตำแหน่งไม่ว่าทั้งหมดหรือบางส่วนในระหว่างที่อยู่นอกสมัยประชุมของรัฐสภา ให้ดำเนินการตามมาตรา ๒๔๔ ภายในสามสิบวันนับแต่วันเปิดสมัยประชุมของรัฐสภา</w:t>
       </w:r>
     </w:p>
     <w:p>
@@ -7552,7 +7552,7 @@
         <w:pStyle w:val="วรรค"/>
       </w:pPr>
       <w:r>
-        <w:t>ในกรณีที่ประธานศาลรัฐธรรมนูญพ้นจากตำแหน่ง ให้นำบทบัญญัติมาตรา ๒๕๕ วรรคสอง มาใช้บังคับ</w:t>
+        <w:t>ในกรณีที่ประธานศาลรัฐธรรมนูญพ้นจากตำแหน่ง ให้นำบทบัญญัติมาตรา ๒๔๒ วรรคสอง มาใช้บังคับ</w:t>
       </w:r>
     </w:p>
     <w:p>
@@ -7567,7 +7567,7 @@
         <w:t>มาตรา ๒๔๙</w:t>
       </w:r>
       <w:r>
-        <w:t xml:space="preserve">  ร่างพระราชบัญญัติหรือร่างพระราชบัญญัติประกอบรัฐธรรมนูญใดที่รัฐสภาให้ความเห็นชอบแล้ว ก่อนที่นายกรัฐมนตรีจะนำร่างพระราชบัญญัติหรือร่างพระราชบัญญัติประกอบรัฐธรรมนูญนั้นขึ้นทูลเกล้าทูลกระหม่อมถวายเพื่อพระมหากษัตริย์ทรงลงพระปรมาภิไธยตามมาตรา ๙๓ หรือร่างพระราชบัญญัติหรือร่างพระราชบัญญัติประกอบรัฐธรรมนูญใดที่รัฐสภาลงมติยืนยันตามมาตรา ๙๔ ก่อนที่นายกรัฐมนตรีจะนำร่างพระราชบัญญัติหรือร่างพระราชบัญญัติประกอบรัฐธรรมนูญนั้นขึ้นทูลเกล้าทูลกระหม่อมถวายอีกครั้งหนึ่ง</w:t>
+        <w:t xml:space="preserve">  ร่างพระราชบัญญัติหรือร่างพระราชบัญญัติประกอบรัฐธรรมนูญใดที่รัฐสภาให้ความเห็นชอบแล้ว ก่อนที่นายกรัฐมนตรีจะนำร่างพระราชบัญญัติหรือร่างพระราชบัญญัติประกอบรัฐธรรมนูญนั้นขึ้นทูลเกล้าทูลกระหม่อมถวายเพื่อพระมหากษัตริย์ทรงลงพระปรมาภิไธยตามมาตรา ๙๔ หรือร่างพระราชบัญญัติหรือร่างพระราชบัญญัติประกอบรัฐธรรมนูญใดที่รัฐสภาลงมติยืนยันตามมาตรา ๙๕ ก่อนที่นายกรัฐมนตรีจะนำร่างพระราชบัญญัติหรือร่างพระราชบัญญัติประกอบรัฐธรรมนูญนั้นขึ้นทูลเกล้าทูลกระหม่อมถวายอีกครั้งหนึ่ง</w:t>
       </w:r>
     </w:p>
     <w:p>
@@ -7621,7 +7621,7 @@
         <w:pStyle w:val="วรรค"/>
       </w:pPr>
       <w:r>
-        <w:t>ถ้าศาลรัฐธรรมนูญวินิจฉัยว่าร่างพระราชบัญญัติหรือร่างพระราชบัญญัติประกอบรัฐธรรมนูญนั้นมีข้อความขัดหรือแย้งต่อรัฐธรรมนูญนี้แต่มิใช่กรณีตามวรรคสาม ให้ข้อความที่ขัดหรือแย้งนั้นเป็นอันตกไป และให้นายกรัฐมนตรีดำเนินการตามมาตรา ๙๓ หรือมาตรา ๙๔ แล้วแต่กรณี ต่อไป</w:t>
+        <w:t>ถ้าศาลรัฐธรรมนูญวินิจฉัยว่าร่างพระราชบัญญัติหรือร่างพระราชบัญญัติประกอบรัฐธรรมนูญนั้นมีข้อความขัดหรือแย้งต่อรัฐธรรมนูญนี้แต่มิใช่กรณีตามวรรคสาม ให้ข้อความที่ขัดหรือแย้งนั้นเป็นอันตกไป และให้นายกรัฐมนตรีดำเนินการตามมาตรา ๙๔ หรือมาตรา ๙๕ แล้วแต่กรณี ต่อไป</w:t>
       </w:r>
     </w:p>
     <w:p>
@@ -7636,7 +7636,7 @@
         <w:t>มาตรา ๒๕๐</w:t>
       </w:r>
       <w:r>
-        <w:t xml:space="preserve">  บทบัญญัติมาตรา ๒๖๒ (๒) ให้นำมาใช้บังคับกับร่างข้อบังคับการประชุมสภาผู้แทนราษฎร ร่างข้อบังคับการประชุมวุฒิสภา และร่างข้อบังคับการประชุมรัฐสภา ที่สภาผู้แทนราษฎร วุฒิสภา หรือรัฐสภา แล้วแต่กรณี ให้ความเห็นชอบแล้ว แต่ยังมิได้ประกาศในราชกิจจานุเบกษา ด้วย โดยอนุโลม</w:t>
+        <w:t xml:space="preserve">  บทบัญญัติมาตรา ๒๔๙ (๒) ให้นำมาใช้บังคับกับร่างข้อบังคับการประชุมสภาผู้แทนราษฎร ร่างข้อบังคับการประชุมวุฒิสภา และร่างข้อบังคับการประชุมรัฐสภา ที่สภาผู้แทนราษฎร วุฒิสภา หรือรัฐสภา แล้วแต่กรณี ให้ความเห็นชอบแล้ว แต่ยังมิได้ประกาศในราชกิจจานุเบกษา ด้วย โดยอนุโลม</w:t>
       </w:r>
     </w:p>
     <w:p>
@@ -8376,7 +8376,7 @@
         <w:pStyle w:val="วรรค"/>
       </w:pPr>
       <w:r>
-        <w:t>ในกรณีที่มีการยุบสภาท้องถิ่น หรือในกรณีที่สมาชิกสภาท้องถิ่นพ้นจากตำแหน่งทั้งคณะตามมาตรา ๒๘๖ และต้องมีการแต่งตั้งคณะผู้บริหารท้องถิ่นหรือผู้บริหารท้องถิ่นเป็นการชั่วคราว มิให้นำบทบัญญัติวรรคสอง วรรคสาม และวรรคหก มาใช้บังคับ ทั้งนี้ ตามที่กฎหมายบัญญัติ</w:t>
+        <w:t>ในกรณีที่มีการยุบสภาท้องถิ่น หรือในกรณีที่สมาชิกสภาท้องถิ่นพ้นจากตำแหน่งทั้งคณะตามมาตรา ๒๗๓ และต้องมีการแต่งตั้งคณะผู้บริหารท้องถิ่นหรือผู้บริหารท้องถิ่นเป็นการชั่วคราว มิให้นำบทบัญญัติวรรคสอง วรรคสาม และวรรคหก มาใช้บังคับ ทั้งนี้ ตามที่กฎหมายบัญญัติ</w:t>
       </w:r>
     </w:p>
     <w:p>
@@ -8484,7 +8484,7 @@
         <w:pStyle w:val="วรรค"/>
       </w:pPr>
       <w:r>
-        <w:t>องค์กรปกครองส่วนท้องถิ่นย่อมมีสิทธิที่จะจัดการศึกษาอบรมและการฝึกอาชีพตามความเหมาะสมและความต้องการภายในท้องถิ่นนั้น และเข้าไปมีส่วนร่วมในการจัดการศึกษาอบรมของรัฐ แต่ต้องไม่ขัดต่อมาตรา ๔๓ และมาตรา ๘๑ ทั้งนี้ ตามที่กฎหมายบัญญัติ</w:t>
+        <w:t>องค์กรปกครองส่วนท้องถิ่นย่อมมีสิทธิที่จะจัดการศึกษาอบรมและการฝึกอาชีพตามความเหมาะสมและความต้องการภายในท้องถิ่นนั้น และเข้าไปมีส่วนร่วมในการจัดการศึกษาอบรมของรัฐ แต่ต้องไม่ขัดต่อมาตรา ๔๒ และมาตรา ๘๒ ทั้งนี้ ตามที่กฎหมายบัญญัติ</w:t>
       </w:r>
     </w:p>
     <w:p>
@@ -8667,7 +8667,7 @@
         <w:t>มาตรา ๒๗๙</w:t>
       </w:r>
       <w:r>
-        <w:t xml:space="preserve">  บัญชีแสดงรายการทรัพย์สินและหนี้สินตามมาตรา ๒๙๑ ให้แสดงรายการทรัพย์สินและหนี้สินที่มีอยู่จริงในวันที่ยื่นบัญชีดังกล่าว และต้องยื่นภายในกำหนดเวลาดังต่อไปนี้</w:t>
+        <w:t xml:space="preserve">  บัญชีแสดงรายการทรัพย์สินและหนี้สินตามมาตรา ๒๗๘ ให้แสดงรายการทรัพย์สินและหนี้สินที่มีอยู่จริงในวันที่ยื่นบัญชีดังกล่าว และต้องยื่นภายในกำหนดเวลาดังต่อไปนี้</w:t>
       </w:r>
     </w:p>
     <w:p>
@@ -8697,7 +8697,7 @@
       <w:r>
         <w:t>(๓)</w:t>
         <w:tab/>
-        <w:t>ในกรณีที่บุคคลตามมาตรา ๒๙๑ ซึ่งได้ยื่นบัญชีไว้แล้ว ตายในระหว่างดำรงตำแหน่งหรือก่อนยื่นบัญชีหลังจากพ้นจากตำแหน่ง ให้ทายาทหรือผู้จัดการมรดก ยื่นบัญชีแสดงรายการทรัพย์สินและหนี้สินที่มีอยู่ในวันที่ผู้ดำรงตำแหน่งนั้นตาย ภายในเก้าสิบวันนับแต่วันที่ผู้ดำรงตำแหน่งตาย</w:t>
+        <w:t>ในกรณีที่บุคคลตามมาตรา ๒๗๘ ซึ่งได้ยื่นบัญชีไว้แล้ว ตายในระหว่างดำรงตำแหน่งหรือก่อนยื่นบัญชีหลังจากพ้นจากตำแหน่ง ให้ทายาทหรือผู้จัดการมรดก ยื่นบัญชีแสดงรายการทรัพย์สินและหนี้สินที่มีอยู่ในวันที่ผู้ดำรงตำแหน่งนั้นตาย ภายในเก้าสิบวันนับแต่วันที่ผู้ดำรงตำแหน่งตาย</w:t>
       </w:r>
     </w:p>
     <w:p>
@@ -8767,7 +8767,7 @@
         <w:pStyle w:val="วรรค"/>
       </w:pPr>
       <w:r>
-        <w:t>ให้นำบทบัญญัติมาตรา ๓๐๖ วรรคห้า มาใช้บังคับโดยอนุโลม</w:t>
+        <w:t>ให้นำบทบัญญัติมาตรา ๒๘๗ วรรคห้า มาใช้บังคับโดยอนุโลม</w:t>
       </w:r>
     </w:p>
     <w:p>
@@ -8782,7 +8782,7 @@
         <w:t>มาตรา ๒๘๒</w:t>
       </w:r>
       <w:r>
-        <w:t xml:space="preserve">  ผู้ดำรงตำแหน่งทางการเมืองผู้ใดจงใจไม่ยื่นบัญชีแสดงรายการทรัพย์สินและหนี้สินและเอกสารประกอบตามที่กำหนดไว้ในรัฐธรรมนูญนี้ หรือจงใจยื่นบัญชีแสดงรายการทรัพย์สินและหนี้สินและเอกสารประกอบด้วยข้อความอันเป็นเท็จ หรือปกปิดข้อเท็จจริงที่ควรแจ้งให้ทราบ ให้ผู้นั้นพ้นจากตำแหน่งนับแต่วันที่ครบกำหนดต้องยื่นตามมาตรา ๒๙๒ หรือนับแต่วันที่ตรวจพบว่ามีการกระทำดังกล่าว แล้วแต่กรณี และผู้นั้นต้องห้ามมิให้ดำรงตำแหน่งทางการเมืองใด ๆ เป็นเวลาห้าปีนับแต่วันที่พ้นจากตำแหน่ง</w:t>
+        <w:t xml:space="preserve">  ผู้ดำรงตำแหน่งทางการเมืองผู้ใดจงใจไม่ยื่นบัญชีแสดงรายการทรัพย์สินและหนี้สินและเอกสารประกอบตามที่กำหนดไว้ในรัฐธรรมนูญนี้ หรือจงใจยื่นบัญชีแสดงรายการทรัพย์สินและหนี้สินและเอกสารประกอบด้วยข้อความอันเป็นเท็จ หรือปกปิดข้อเท็จจริงที่ควรแจ้งให้ทราบ ให้ผู้นั้นพ้นจากตำแหน่งนับแต่วันที่ครบกำหนดต้องยื่นตามมาตรา ๒๗๙ หรือนับแต่วันที่ตรวจพบว่ามีการกระทำดังกล่าว แล้วแต่กรณี และผู้นั้นต้องห้ามมิให้ดำรงตำแหน่งทางการเมืองใด ๆ เป็นเวลาห้าปีนับแต่วันที่พ้นจากตำแหน่ง</w:t>
       </w:r>
     </w:p>
     <w:p>
@@ -8790,7 +8790,7 @@
         <w:pStyle w:val="วรรค"/>
       </w:pPr>
       <w:r>
-        <w:t>เมื่อมีกรณีตามวรรคหนึ่ง ให้คณะกรรมการป้องกันและปราบปรามการทุจริตแห่งชาติเสนอเรื่องให้ศาลรัฐธรรมนูญวินิจฉัยชี้ขาดต่อไป และเมื่อศาลรัฐธรรมนูญวินิจฉัยชี้ขาดแล้ว ให้นำบทบัญญัติมาตรา ๙๗ มาใช้บังคับโดยอนุโลม</w:t>
+        <w:t>เมื่อมีกรณีตามวรรคหนึ่ง ให้คณะกรรมการป้องกันและปราบปรามการทุจริตแห่งชาติเสนอเรื่องให้ศาลรัฐธรรมนูญวินิจฉัยชี้ขาดต่อไป และเมื่อศาลรัฐธรรมนูญวินิจฉัยชี้ขาดแล้ว ให้นำบทบัญญัติมาตรา ๙๘ มาใช้บังคับโดยอนุโลม</w:t>
       </w:r>
     </w:p>
     <w:p>
@@ -8805,7 +8805,7 @@
         <w:t>มาตรา ๒๘๓</w:t>
       </w:r>
       <w:r>
-        <w:t xml:space="preserve">  บทบัญญัติมาตรา ๒๙๑ มาตรา ๒๙๒ มาตรา ๒๙๓ วรรคหนึ่งและวรรคสาม และมาตรา ๒๙๕ วรรคหนึ่ง ให้ใช้บังคับกับเจ้าหน้าที่อื่นของรัฐตามที่บัญญัติในกฎหมายประกอบรัฐธรรมนูญว่าด้วยการป้องกันและปราบปรามการทุจริตด้วยโดยอนุโลม</w:t>
+        <w:t xml:space="preserve">  บทบัญญัติมาตรา ๒๗๘ มาตรา ๒๗๙ มาตรา ๒๘๐ วรรคหนึ่งและวรรคสาม และมาตรา ๒๘๒ วรรคหนึ่ง ให้ใช้บังคับกับเจ้าหน้าที่อื่นของรัฐตามที่บัญญัติในกฎหมายประกอบรัฐธรรมนูญว่าด้วยการป้องกันและปราบปรามการทุจริตด้วยโดยอนุโลม</w:t>
       </w:r>
     </w:p>
     <w:p>
@@ -8832,7 +8832,7 @@
         <w:t>มาตรา ๒๘๔</w:t>
       </w:r>
       <w:r>
-        <w:t xml:space="preserve">  ถึง มาตรา ๓๐๓ (ย้ายไปบัญญัติไว้ในหมวด ๑๖ องค์กรอิสระ)</w:t>
+        <w:t xml:space="preserve">  (ย้ายไปบัญญัติไว้ในหมวด ๑๖ องค์กรอิสระ)</w:t>
       </w:r>
     </w:p>
     <w:p>
@@ -8902,7 +8902,7 @@
         <w:t>มาตรา ๒๘๖</w:t>
       </w:r>
       <w:r>
-        <w:t xml:space="preserve">  สมาชิกสภาผู้แทนราษฎรจำนวนไม่น้อยกว่าหนึ่งในสี่ของจำนวนสมาชิกทั้งหมดเท่าที่มีอยู่ของสภาผู้แทนราษฎร หรือประชาชนผู้มีสิทธิเลือกตั้งจำนวนไม่น้อยกว่าห้าพันคน มีสิทธิเข้าชื่อร้องขอต่อประธานวุฒิสภาเพื่อให้วุฒิสภามีมติตามมาตรา ๓๐๘ ให้ถอดถอนบุคคลตามมาตรา ๓๐๔ ออกจากตำแหน่งได้ คำร้องขอดังกล่าวต้องระบุพฤติการณ์ที่กล่าวหาว่าผู้ดำรงตำแหน่งดังกล่าวกระทำความผิดเป็นข้อ ๆ ให้ชัดเจน</w:t>
+        <w:t xml:space="preserve">  สมาชิกสภาผู้แทนราษฎรจำนวนไม่น้อยกว่าหนึ่งในสี่ของจำนวนสมาชิกทั้งหมดเท่าที่มีอยู่ของสภาผู้แทนราษฎร หรือประชาชนผู้มีสิทธิเลือกตั้งจำนวนไม่น้อยกว่าห้าพันคน มีสิทธิเข้าชื่อร้องขอต่อประธานวุฒิสภาเพื่อให้วุฒิสภามีมติตามมาตรา ๒๘๙ ให้ถอดถอนบุคคลตามมาตรา ๒๘๕ ออกจากตำแหน่งได้ คำร้องขอดังกล่าวต้องระบุพฤติการณ์ที่กล่าวหาว่าผู้ดำรงตำแหน่งดังกล่าวกระทำความผิดเป็นข้อ ๆ ให้ชัดเจน</w:t>
       </w:r>
     </w:p>
     <w:p>
@@ -8910,7 +8910,7 @@
         <w:pStyle w:val="วรรค"/>
       </w:pPr>
       <w:r>
-        <w:t>สมาชิกวุฒิสภาจำนวนไม่น้อยกว่าหนึ่งในสี่ของจำนวนสมาชิกทั้งหมดเท่าที่มีอยู่ของวุฒิสภา มีสิทธิเข้าชื่อร้องขอต่อประธานวุฒิสภาเพื่อให้วุฒิสภามีมติตามมาตรา ๓๐๘ ให้ถอดถอนสมาชิกวุฒิสภาออกจากตำแหน่งได้</w:t>
+        <w:t>สมาชิกวุฒิสภาจำนวนไม่น้อยกว่าหนึ่งในสี่ของจำนวนสมาชิกทั้งหมดเท่าที่มีอยู่ของวุฒิสภา มีสิทธิเข้าชื่อร้องขอต่อประธานวุฒิสภาเพื่อให้วุฒิสภามีมติตามมาตรา ๒๘๙ ให้ถอดถอนสมาชิกวุฒิสภาออกจากตำแหน่งได้</w:t>
       </w:r>
     </w:p>
     <w:p>
@@ -8933,7 +8933,7 @@
         <w:t>มาตรา ๒๘๗</w:t>
       </w:r>
       <w:r>
-        <w:t xml:space="preserve">  เมื่อได้รับคำร้องขอตามมาตรา ๓๐๕ แล้ว ให้ประธานวุฒิสภาส่งเรื่องให้คณะกรรมการป้องกันและปราบปรามการทุจริตแห่งชาติดำเนินการไต่สวนโดยเร็ว</w:t>
+        <w:t xml:space="preserve">  เมื่อได้รับคำร้องขอตามมาตรา ๒๘๖ แล้ว ให้ประธานวุฒิสภาส่งเรื่องให้คณะกรรมการป้องกันและปราบปรามการทุจริตแห่งชาติดำเนินการไต่สวนโดยเร็ว</w:t>
       </w:r>
     </w:p>
     <w:p>
@@ -8957,7 +8957,7 @@
         <w:pStyle w:val="วรรค"/>
       </w:pPr>
       <w:r>
-        <w:t>ถ้าคณะกรรมการป้องกันและปราบปรามการทุจริตแห่งชาติมีมติว่าข้อกล่าวหาใดมีมูล นับแต่วันดังกล่าว ผู้ดำรงตำแหน่งที่ถูกกล่าวหาจะปฏิบัติหน้าที่ต่อไปมิได้จนกว่าวุฒิสภาจะมีมติ และให้ประธานกรรมการป้องกันและปราบปรามการทุจริตแห่งชาติส่งรายงานและเอกสารที่มีอยู่พร้อมทั้งความเห็นไปยังประธานวุฒิสภาเพื่อดำเนินการตามมาตรา ๓๐๗ และอัยการสูงสุดเพื่อดำเนินการฟ้องคดีต่อศาลฎีกาแผนกคดีอาญาของผู้ดำรงตำแหน่งทางการเมืองต่อไป แต่ถ้าคณะกรรมการป้องกันและปราบปรามการทุจริตแห่งชาติเห็นว่าข้อกล่าวหาใดไม่มีมูล ให้ข้อกล่าวหาข้อนั้นเป็นอันตกไป</w:t>
+        <w:t>ถ้าคณะกรรมการป้องกันและปราบปรามการทุจริตแห่งชาติมีมติว่าข้อกล่าวหาใดมีมูล นับแต่วันดังกล่าว ผู้ดำรงตำแหน่งที่ถูกกล่าวหาจะปฏิบัติหน้าที่ต่อไปมิได้จนกว่าวุฒิสภาจะมีมติ และให้ประธานกรรมการป้องกันและปราบปรามการทุจริตแห่งชาติส่งรายงานและเอกสารที่มีอยู่พร้อมทั้งความเห็นไปยังประธานวุฒิสภาเพื่อดำเนินการตามมาตรา ๒๘๘ และอัยการสูงสุดเพื่อดำเนินการฟ้องคดีต่อศาลฎีกาแผนกคดีอาญาของผู้ดำรงตำแหน่งทางการเมืองต่อไป แต่ถ้าคณะกรรมการป้องกันและปราบปรามการทุจริตแห่งชาติเห็นว่าข้อกล่าวหาใดไม่มีมูล ให้ข้อกล่าวหาข้อนั้นเป็นอันตกไป</w:t>
       </w:r>
     </w:p>
     <w:p>
@@ -8980,7 +8980,7 @@
         <w:t>มาตรา ๒๘๘</w:t>
       </w:r>
       <w:r>
-        <w:t xml:space="preserve">  เมื่อได้รับรายงานตามมาตรา ๓๐๖ แล้ว ให้ประธานวุฒิสภาจัดให้มีการประชุมวุฒิสภาเพื่อพิจารณากรณีดังกล่าวโดยเร็ว</w:t>
+        <w:t xml:space="preserve">  เมื่อได้รับรายงานตามมาตรา ๒๘๗ แล้ว ให้ประธานวุฒิสภาจัดให้มีการประชุมวุฒิสภาเพื่อพิจารณากรณีดังกล่าวโดยเร็ว</w:t>
       </w:r>
     </w:p>
     <w:p>
@@ -9069,7 +9069,7 @@
         <w:t>มาตรา ๒๙๑</w:t>
       </w:r>
       <w:r>
-        <w:t xml:space="preserve">  ผู้เสียหายจากการกระทำตามมาตรา ๓๐๙ มีสิทธิยื่นคำร้องต่อคณะกรรมการป้องกันและปราบปรามการทุจริตแห่งชาติเพื่อให้ดำเนินการตามมาตรา ๓๐๒ (๒) ได้ตามกฎหมายประกอบรัฐธรรมนูญว่าด้วยการป้องกันและปราบปรามการทุจริต</w:t>
+        <w:t xml:space="preserve">  ผู้เสียหายจากการกระทำตามมาตรา ๒๙๐ มีสิทธิยื่นคำร้องต่อคณะกรรมการป้องกันและปราบปรามการทุจริตแห่งชาติเพื่อให้ดำเนินการตามมาตรา ๓๓๕ (๒) ได้ตามกฎหมายประกอบรัฐธรรมนูญว่าด้วยการป้องกันและปราบปรามการทุจริต</w:t>
       </w:r>
     </w:p>
     <w:p>
@@ -9077,7 +9077,7 @@
         <w:pStyle w:val="วรรค"/>
       </w:pPr>
       <w:r>
-        <w:t>ให้นำบทบัญญัติมาตรา ๓๐๖ วรรคหนึ่ง วรรคสี่ และวรรคห้า มาใช้บังคับโดยอนุโลม</w:t>
+        <w:t>ให้นำบทบัญญัติมาตรา ๒๘๗ วรรคหนึ่ง วรรคสี่ และวรรคห้า มาใช้บังคับโดยอนุโลม</w:t>
       </w:r>
     </w:p>
     <w:p>
@@ -9100,7 +9100,7 @@
         <w:pStyle w:val="วรรค"/>
       </w:pPr>
       <w:r>
-        <w:t>ให้นำบทบัญญัติมาตรา ๒๖๕ มาใช้บังคับกับการปฏิบัติหน้าที่ของศาลฎีกาแผนกคดีอาญาของผู้ดำรงตำแหน่งทางการเมืองด้วยโดยอนุโลม</w:t>
+        <w:t>ให้นำบทบัญญัติมาตรา ๒๕๒ มาใช้บังคับกับการปฏิบัติหน้าที่ของศาลฎีกาแผนกคดีอาญาของผู้ดำรงตำแหน่งทางการเมืองด้วยโดยอนุโลม</w:t>
       </w:r>
     </w:p>
     <w:p>
@@ -9108,7 +9108,7 @@
         <w:pStyle w:val="วรรค"/>
       </w:pPr>
       <w:r>
-        <w:t>บทบัญญัติว่าด้วยความคุ้มกันของสมาชิกสภาผู้แทนราษฎรและสมาชิกวุฒิสภาตามมาตรา ๑๖๖ และมาตรา ๑๖๗ มิให้นำมาใช้บังคับกับการพิจารณาคดีของศาลฎีกาแผนกคดีอาญาของผู้ดำรงตำแหน่งทางการเมือง</w:t>
+        <w:t>บทบัญญัติว่าด้วยความคุ้มกันของสมาชิกสภาผู้แทนราษฎรและสมาชิกวุฒิสภาตามมาตรา ๑๕๕ และมาตรา ๑๕๖ มิให้นำมาใช้บังคับกับการพิจารณาคดีของศาลฎีกาแผนกคดีอาญาของผู้ดำรงตำแหน่งทางการเมือง</w:t>
       </w:r>
     </w:p>
     <w:p>
@@ -9502,7 +9502,7 @@
         <w:t>มาตรา ๒๙๘</w:t>
       </w:r>
       <w:r>
-        <w:t xml:space="preserve">  ผู้ดำรงตำแหน่งตามมาตรา ๓๑๔/๑ และข้าราชการระดับสูง ต้องแสดงบัญชีแสดงรายการทรัพย์สินและหนี้สิน ตลอดจนแบบแสดงรายการภาษีเงินได้บุคคลธรรมดาย้อนหลังห้าปี โดยให้เปิดเผยข้อมูลดังกล่าวต่อสาธารณะทางระบบเครือข่ายสารสนเทศอย่างโปร่งใส เพื่อให้ประชาชนทั่วไปสามารถเข้าถึง ตรวจสอบ และดาวน์โหลดข้อมูลได้โดยสะดวกโดยไม่มีค่าใช้จ่าย</w:t>
+        <w:t xml:space="preserve">  ผู้ดำรงตำแหน่งตามมาตรา ๒๗๘ และข้าราชการระดับสูง ต้องแสดงบัญชีแสดงรายการทรัพย์สินและหนี้สิน ตลอดจนแบบแสดงรายการภาษีเงินได้บุคคลธรรมดาย้อนหลังห้าปี โดยให้เปิดเผยข้อมูลดังกล่าวต่อสาธารณะทางระบบเครือข่ายสารสนเทศอย่างโปร่งใส เพื่อให้ประชาชนทั่วไปสามารถเข้าถึง ตรวจสอบ และดาวน์โหลดข้อมูลได้โดยสะดวกโดยไม่มีค่าใช้จ่าย</w:t>
       </w:r>
     </w:p>
     <w:p>
@@ -9898,7 +9898,7 @@
       <w:r>
         <w:t>(๔)</w:t>
         <w:tab/>
-        <w:t>ไม่มีลักษณะต้องห้ามตามมาตรา ๑๐๖ หรือมาตรา ๑๐๙ (๑) (๒) (๔) (๕) (๖) (๗) (๑๓) หรือ (๑๔)</w:t>
+        <w:t>ไม่มีลักษณะต้องห้ามตามมาตรา ๑๐๗ หรือมาตรา ๑๑๐ (๑) (๒) (๔) (๕) (๖) (๗) (๑๓) หรือ (๑๔)</w:t>
       </w:r>
     </w:p>
     <w:p>
@@ -9953,7 +9953,7 @@
       <w:r>
         <w:t>(๑)</w:t>
         <w:tab/>
-        <w:t>ให้มีคณะกรรมการสรรหากรรมการการเลือกตั้งจำนวนสิบคน ซึ่งประกอบด้วยประธานศาลรัฐธรรมนูญ ประธานศาลปกครองสูงสุด อธิการบดีของสถาบันอุดมศึกษาของรัฐที่เป็นนิติบุคคลทุกแห่งซึ่งเลือกกันเองให้เหลือสี่คน ผู้แทนพรรคการเมืองทุกพรรคที่มีสมาชิกเป็นสมาชิกสภาผู้แทนราษฎรพรรคละหนึ่งคน ซึ่งเลือกกันเองให้เหลือสี่คน ทำหน้าที่พิจารณาสรรหาผู้มีคุณสมบัติตามมาตรา ๑๓๗ ซึ่งสมควรเป็นกรรมการการเลือกตั้ง จำนวนห้าคน เสนอต่อประธานวุฒิสภา โดยต้องเสนอพร้อมความยินยอมของผู้ได้รับการเสนอชื่อนั้น มติในการเสนอชื่อดังกล่าวต้องมีคะแนนเสียงไม่น้อยกว่าสามในสี่ของจำนวนกรรมการสรรหาทั้งหมดเท่าที่มีอยู่</w:t>
+        <w:t>ให้มีคณะกรรมการสรรหากรรมการการเลือกตั้งจำนวนสิบคน ซึ่งประกอบด้วยประธานศาลรัฐธรรมนูญ ประธานศาลปกครองสูงสุด อธิการบดีของสถาบันอุดมศึกษาของรัฐที่เป็นนิติบุคคลทุกแห่งซึ่งเลือกกันเองให้เหลือสี่คน ผู้แทนพรรคการเมืองทุกพรรคที่มีสมาชิกเป็นสมาชิกสภาผู้แทนราษฎรพรรคละหนึ่งคน ซึ่งเลือกกันเองให้เหลือสี่คน ทำหน้าที่พิจารณาสรรหาผู้มีคุณสมบัติตามมาตรา ๓๑๔ ซึ่งสมควรเป็นกรรมการการเลือกตั้ง จำนวนห้าคน เสนอต่อประธานวุฒิสภา โดยต้องเสนอพร้อมความยินยอมของผู้ได้รับการเสนอชื่อนั้น มติในการเสนอชื่อดังกล่าวต้องมีคะแนนเสียงไม่น้อยกว่าสามในสี่ของจำนวนกรรมการสรรหาทั้งหมดเท่าที่มีอยู่</w:t>
       </w:r>
     </w:p>
     <w:p>
@@ -10056,7 +10056,7 @@
         <w:pStyle w:val="วรรค"/>
       </w:pPr>
       <w:r>
-        <w:t>ในกรณีที่วุฒิสภาเลือกบุคคลตาม (๑) (๒) (๓) หรือ (๔) โดยได้รับความยินยอมของผู้นั้น ผู้ได้รับเลือกจะเริ่มปฏิบัติหน้าที่ได้ต่อเมื่อผู้นั้นได้ลาออกจากตำแหน่งตาม (๑) (๒) หรือ (๓) หรือแสดงให้เป็นที่เชื่อได้ว่าตนได้เลิกประกอบวิชาชีพอิสระดังกล่าวแล้ว ซึ่งต้องกระทำภายในสิบห้าวันนับแต่วันที่ได้รับเลือก แต่ถ้าผู้นั้นมิได้ลาออกหรือเลิกประกอบวิชาชีพอิสระภายในเวลาที่กำหนด ให้ถือว่าผู้นั้นไม่เคยได้รับเลือกให้เป็นกรรมการการเลือกตั้ง และให้นำบทบัญญัติมาตรา ๑๓๘ มาใช้บังคับโดยอนุโลม</w:t>
+        <w:t>ในกรณีที่วุฒิสภาเลือกบุคคลตาม (๑) (๒) (๓) หรือ (๔) โดยได้รับความยินยอมของผู้นั้น ผู้ได้รับเลือกจะเริ่มปฏิบัติหน้าที่ได้ต่อเมื่อผู้นั้นได้ลาออกจากตำแหน่งตาม (๑) (๒) หรือ (๓) หรือแสดงให้เป็นที่เชื่อได้ว่าตนได้เลิกประกอบวิชาชีพอิสระดังกล่าวแล้ว ซึ่งต้องกระทำภายในสิบห้าวันนับแต่วันที่ได้รับเลือก แต่ถ้าผู้นั้นมิได้ลาออกหรือเลิกประกอบวิชาชีพอิสระภายในเวลาที่กำหนด ให้ถือว่าผู้นั้นไม่เคยได้รับเลือกให้เป็นกรรมการการเลือกตั้ง และให้นำบทบัญญัติมาตรา ๓๑๕ มาใช้บังคับโดยอนุโลม</w:t>
       </w:r>
     </w:p>
     <w:p>
@@ -10124,7 +10124,7 @@
       <w:r>
         <w:t>(๓)</w:t>
         <w:tab/>
-        <w:t>ขาดคุณสมบัติหรือมีลักษณะต้องห้ามตามมาตรา ๑๓๗ หรือมาตรา ๑๓๙</w:t>
+        <w:t>ขาดคุณสมบัติหรือมีลักษณะต้องห้ามตามมาตรา ๓๑๔ หรือมาตรา ๓๑๖</w:t>
       </w:r>
     </w:p>
     <w:p>
@@ -10144,7 +10144,7 @@
       <w:r>
         <w:t>(๕)</w:t>
         <w:tab/>
-        <w:t>วุฒิสภามีมติตามมาตรา ๓๐๘ ให้ถอดถอนออกจากตำแหน่ง</w:t>
+        <w:t>วุฒิสภามีมติตามมาตรา ๒๘๙ ให้ถอดถอนออกจากตำแหน่ง</w:t>
       </w:r>
     </w:p>
     <w:p>
@@ -10167,7 +10167,7 @@
         <w:t>มาตรา ๓๑๙</w:t>
       </w:r>
       <w:r>
-        <w:t xml:space="preserve">  สมาชิกสภาผู้แทนราษฎร สมาชิกวุฒิสภา หรือสมาชิกของทั้งสองสภารวมกัน มีจำนวนไม่น้อยกว่าหนึ่งในสิบของจำนวนสมาชิกทั้งหมดเท่าที่มีอยู่ของทั้งสองสภา มีสิทธิเข้าชื่อร้องขอต่อประธานรัฐสภาว่ากรรมการการเลือกตั้งคนใดคนหนึ่งขาดคุณสมบัติหรือมีลักษณะต้องห้ามตามมาตรา ๑๓๗ หรือกระทำการอันต้องห้ามตามมาตรา ๑๓๙ และให้ประธานรัฐสภาส่งคำร้องนั้นไปยังศาลรัฐธรรมนูญเพื่อวินิจฉัยว่ากรรมการการเลือกตั้งผู้นั้นพ้นจากตำแหน่งหรือไม่</w:t>
+        <w:t xml:space="preserve">  สมาชิกสภาผู้แทนราษฎร สมาชิกวุฒิสภา หรือสมาชิกของทั้งสองสภารวมกัน มีจำนวนไม่น้อยกว่าหนึ่งในสิบของจำนวนสมาชิกทั้งหมดเท่าที่มีอยู่ของทั้งสองสภา มีสิทธิเข้าชื่อร้องขอต่อประธานรัฐสภาว่ากรรมการการเลือกตั้งคนใดคนหนึ่งขาดคุณสมบัติหรือมีลักษณะต้องห้ามตามมาตรา ๓๑๔ หรือกระทำการอันต้องห้ามตามมาตรา ๓๑๖ และให้ประธานรัฐสภาส่งคำร้องนั้นไปยังศาลรัฐธรรมนูญเพื่อวินิจฉัยว่ากรรมการการเลือกตั้งผู้นั้นพ้นจากตำแหน่งหรือไม่</w:t>
       </w:r>
     </w:p>
     <w:p>
@@ -10183,7 +10183,7 @@
         <w:pStyle w:val="วรรค"/>
       </w:pPr>
       <w:r>
-        <w:t>ให้นำบทบัญญัติมาตรา ๙๗ มาใช้บังคับกับการพ้นจากตำแหน่งของกรรมการการเลือกตั้งด้วย โดยอนุโลม</w:t>
+        <w:t>ให้นำบทบัญญัติมาตรา ๙๘ มาใช้บังคับกับการพ้นจากตำแหน่งของกรรมการการเลือกตั้งด้วย โดยอนุโลม</w:t>
       </w:r>
     </w:p>
     <w:p>
@@ -10198,7 +10198,7 @@
         <w:t>มาตรา ๓๒๐</w:t>
       </w:r>
       <w:r>
-        <w:t xml:space="preserve">  ในกรณีที่กรรมการการเลือกตั้งพ้นจากตำแหน่งตามวาระพร้อมกันทั้งหมด ให้ดำเนินการตามมาตรา ๑๓๘ ภายในสี่สิบห้าวันนับแต่วันที่มีการพ้นจากตำแหน่ง</w:t>
+        <w:t xml:space="preserve">  ในกรณีที่กรรมการการเลือกตั้งพ้นจากตำแหน่งตามวาระพร้อมกันทั้งหมด ให้ดำเนินการตามมาตรา ๓๑๕ ภายในสี่สิบห้าวันนับแต่วันที่มีการพ้นจากตำแหน่ง</w:t>
       </w:r>
     </w:p>
     <w:p>
@@ -10206,7 +10206,7 @@
         <w:pStyle w:val="วรรค"/>
       </w:pPr>
       <w:r>
-        <w:t>ในกรณีที่กรรมการการเลือกตั้งพ้นจากตำแหน่งเพราะเหตุอื่นนอกจากถึงคราวออกตามวาระ ให้นำมาตรา ๑๓๘ มาใช้บังคับกับการสรรหาและการเลือกกรรมการการเลือกตั้งแทนตำแหน่งที่ว่างนั้นโดยอนุโลม ในกรณีนี้ ให้เสนอชื่อผู้สมควรเป็นกรรมการการเลือกตั้งต่อประธานวุฒิสภา เป็นจำนวนสองเท่าของผู้ซึ่งพ้นจากตำแหน่ง และให้วุฒิสภามีมติเลือก ทั้งนี้ ให้ดำเนินการให้แล้วเสร็จภายในสี่สิบห้าวันนับแต่วันที่มีการพ้นจากตำแหน่ง และให้ผู้ได้รับเลือกอยู่ในตำแหน่งเพียงเท่าวาระที่เหลืออยู่ของผู้ซึ่งตนแทน</w:t>
+        <w:t>ในกรณีที่กรรมการการเลือกตั้งพ้นจากตำแหน่งเพราะเหตุอื่นนอกจากถึงคราวออกตามวาระ ให้นำมาตรา ๓๑๕ มาใช้บังคับกับการสรรหาและการเลือกกรรมการการเลือกตั้งแทนตำแหน่งที่ว่างนั้นโดยอนุโลม ในกรณีนี้ ให้เสนอชื่อผู้สมควรเป็นกรรมการการเลือกตั้งต่อประธานวุฒิสภา เป็นจำนวนสองเท่าของผู้ซึ่งพ้นจากตำแหน่ง และให้วุฒิสภามีมติเลือก ทั้งนี้ ให้ดำเนินการให้แล้วเสร็จภายในสี่สิบห้าวันนับแต่วันที่มีการพ้นจากตำแหน่ง และให้ผู้ได้รับเลือกอยู่ในตำแหน่งเพียงเท่าวาระที่เหลืออยู่ของผู้ซึ่งตนแทน</w:t>
       </w:r>
     </w:p>
     <w:p>
@@ -10254,7 +10254,7 @@
       <w:r>
         <w:t>(๑)</w:t>
         <w:tab/>
-        <w:t>ออกประกาศกำหนดการทั้งหลายอันจำเป็นแก่การปฏิบัติตามกฎหมายตามมาตรา ๑๔๔ วรรคสอง</w:t>
+        <w:t>ออกประกาศกำหนดการทั้งหลายอันจำเป็นแก่การปฏิบัติตามกฎหมายตามมาตรา ๓๒๑ วรรคสอง</w:t>
       </w:r>
     </w:p>
     <w:p>
@@ -10264,7 +10264,7 @@
       <w:r>
         <w:t>(๒)</w:t>
         <w:tab/>
-        <w:t>มีคำสั่งให้ข้าราชการ พนักงาน หรือลูกจ้างของหน่วยราชการ หน่วยงานของรัฐ รัฐวิสาหกิจ หรือราชการส่วนท้องถิ่น หรือเจ้าหน้าที่อื่นของรัฐ ปฏิบัติการทั้งหลายอันจำเป็นตามกฎหมายตามมาตรา ๑๔๔ วรรคสอง</w:t>
+        <w:t>มีคำสั่งให้ข้าราชการ พนักงาน หรือลูกจ้างของหน่วยราชการ หน่วยงานของรัฐ รัฐวิสาหกิจ หรือราชการส่วนท้องถิ่น หรือเจ้าหน้าที่อื่นของรัฐ ปฏิบัติการทั้งหลายอันจำเป็นตามกฎหมายตามมาตรา ๓๒๑ วรรคสอง</w:t>
       </w:r>
     </w:p>
     <w:p>
@@ -10274,7 +10274,7 @@
       <w:r>
         <w:t>(๓)</w:t>
         <w:tab/>
-        <w:t>สืบสวนสอบสวนเพื่อหาข้อเท็จจริงและวินิจฉัยชี้ขาดปัญหาหรือข้อโต้แย้งที่เกิดขึ้นตามกฎหมายตามมาตรา ๑๔๔ วรรคสอง</w:t>
+        <w:t>สืบสวนสอบสวนเพื่อหาข้อเท็จจริงและวินิจฉัยชี้ขาดปัญหาหรือข้อโต้แย้งที่เกิดขึ้นตามกฎหมายตามมาตรา ๓๒๑ วรรคสอง</w:t>
       </w:r>
     </w:p>
     <w:p>
@@ -10335,7 +10335,7 @@
         <w:t>มาตรา ๓๒๓</w:t>
       </w:r>
       <w:r>
-        <w:t xml:space="preserve">  ข้าราชการ พนักงาน หรือลูกจ้างของหน่วยราชการ หน่วยงานของรัฐ รัฐวิสาหกิจ หรือราชการส่วนท้องถิ่น หรือเจ้าหน้าที่อื่นของรัฐ มีหน้าที่ต้องปฏิบัติตามคำสั่งของคณะกรรมการการเลือกตั้งที่สั่งการตามมาตรา ๑๔๕</w:t>
+        <w:t xml:space="preserve">  ข้าราชการ พนักงาน หรือลูกจ้างของหน่วยราชการ หน่วยงานของรัฐ รัฐวิสาหกิจ หรือราชการส่วนท้องถิ่น หรือเจ้าหน้าที่อื่นของรัฐ มีหน้าที่ต้องปฏิบัติตามคำสั่งของคณะกรรมการการเลือกตั้งที่สั่งการตามมาตรา ๓๒๒</w:t>
       </w:r>
     </w:p>
     <w:p>
@@ -10423,7 +10423,7 @@
         <w:br/>
       </w:r>
       <w:r>
-        <w:t>ผู้ตรวจการแผ่นดิน</w:t>
+        <w:t>ผู้ตรวจการแผ่นดินของรัฐสภา</w:t>
       </w:r>
     </w:p>
     <w:p>
@@ -10536,7 +10536,7 @@
         <w:t>มาตรา ๓๒๘</w:t>
       </w:r>
       <w:r>
-        <w:t xml:space="preserve">  ในกรณีที่ผู้ตรวจการแผ่นดินของรัฐสภาเห็นว่าบทบัญญัติแห่งกฎหมาย กฎ ข้อบังคับ หรือการกระทำใดของบุคคลใดตามมาตรา ๑๙๗ (๑) มีปัญหาเกี่ยวกับความชอบด้วยรัฐธรรมนูญ ให้ผู้ตรวจการแผ่นดินของรัฐสภาเสนอเรื่องพร้อมความเห็นต่อศาลรัฐธรรมนูญหรือศาลปกครองเพื่อพิจารณาวินิจฉัย ทั้งนี้ ตามหลักเกณฑ์ว่าด้วยวิธีพิจารณาของศาลรัฐธรรมนูญ หรือกฎหมายว่าด้วยวิธีพิจารณาของศาลปกครอง แล้วแต่กรณี</w:t>
+        <w:t xml:space="preserve">  ในกรณีที่ผู้ตรวจการแผ่นดินของรัฐสภาเห็นว่าบทบัญญัติแห่งกฎหมาย กฎ ข้อบังคับ หรือการกระทำใดของบุคคลใดตามมาตรา ๓๒๗ (๑) มีปัญหาเกี่ยวกับความชอบด้วยรัฐธรรมนูญ ให้ผู้ตรวจการแผ่นดินของรัฐสภาเสนอเรื่องพร้อมความเห็นต่อศาลรัฐธรรมนูญหรือศาลปกครองเพื่อพิจารณาวินิจฉัย ทั้งนี้ ตามหลักเกณฑ์ว่าด้วยวิธีพิจารณาของศาลรัฐธรรมนูญ หรือกฎหมายว่าด้วยวิธีพิจารณาของศาลปกครอง แล้วแต่กรณี</w:t>
       </w:r>
     </w:p>
     <w:p>
@@ -10721,7 +10721,7 @@
         <w:pStyle w:val="วรรค"/>
       </w:pPr>
       <w:r>
-        <w:t>กรรมการป้องกันและปราบปรามการทุจริตแห่งชาติต้องเป็นผู้ซึ่งมีความซื่อสัตย์สุจริตเป็นที่ประจักษ์ มีคุณสมบัติและไม่มีลักษณะต้องห้ามตามมาตรา ๒๕๖</w:t>
+        <w:t>กรรมการป้องกันและปราบปรามการทุจริตแห่งชาติต้องเป็นผู้ซึ่งมีความซื่อสัตย์สุจริตเป็นที่ประจักษ์ มีคุณสมบัติและไม่มีลักษณะต้องห้ามตามมาตรา ๒๔๓</w:t>
       </w:r>
     </w:p>
     <w:p>
@@ -10729,7 +10729,7 @@
         <w:pStyle w:val="วรรค"/>
       </w:pPr>
       <w:r>
-        <w:t>การสรรหาและการเลือกกรรมการป้องกันและปราบปรามการทุจริตแห่งชาติ ให้นำบทบัญญัติมาตรา ๒๕๗ และมาตรา ๒๕๘ มาใช้บังคับโดยอนุโลม ทั้งนี้ โดยให้คณะกรรมการสรรหากรรมการป้องกันและปราบปรามการทุจริตแห่งชาติจำนวนสิบห้าคน ประกอบด้วย ประธานศาลฎีกา ประธานศาลรัฐธรรมนูญ ประธานศาลปกครองสูงสุด อธิการบดีของสถาบันอุดมศึกษาของรัฐที่เป็นนิติบุคคลทุกแห่ง ซึ่งเลือกกันเองให้เหลือเจ็ดคน ผู้แทนพรรคการเมืองทุกพรรคที่มีสมาชิกเป็นสมาชิกสภาผู้แทนราษฎร พรรคละหนึ่งคน ซึ่งเลือกกันเองให้เหลือห้าคน เป็นกรรมการ</w:t>
+        <w:t>การสรรหาและการเลือกกรรมการป้องกันและปราบปรามการทุจริตแห่งชาติ ให้นำบทบัญญัติมาตรา ๒๔๔ และมาตรา ๒๔๕ มาใช้บังคับโดยอนุโลม ทั้งนี้ โดยให้คณะกรรมการสรรหากรรมการป้องกันและปราบปรามการทุจริตแห่งชาติจำนวนสิบห้าคน ประกอบด้วย ประธานศาลฎีกา ประธานศาลรัฐธรรมนูญ ประธานศาลปกครองสูงสุด อธิการบดีของสถาบันอุดมศึกษาของรัฐที่เป็นนิติบุคคลทุกแห่ง ซึ่งเลือกกันเองให้เหลือเจ็ดคน ผู้แทนพรรคการเมืองทุกพรรคที่มีสมาชิกเป็นสมาชิกสภาผู้แทนราษฎร พรรคละหนึ่งคน ซึ่งเลือกกันเองให้เหลือห้าคน เป็นกรรมการ</w:t>
       </w:r>
     </w:p>
     <w:p>
@@ -10768,7 +10768,7 @@
         <w:pStyle w:val="วรรค"/>
       </w:pPr>
       <w:r>
-        <w:t>การพ้นจากตำแหน่ง การสรรหาและการเลือกกรรมการป้องกันและปราบปรามการทุจริตแห่งชาติแทนตำแหน่งที่ว่าง ให้นำบทบัญญัติมาตรา ๒๖๐ และมาตรา ๒๖๑ มาใช้บังคับโดยอนุโลม</w:t>
+        <w:t>การพ้นจากตำแหน่ง การสรรหาและการเลือกกรรมการป้องกันและปราบปรามการทุจริตแห่งชาติแทนตำแหน่งที่ว่าง ให้นำบทบัญญัติมาตรา ๒๔๗ และมาตรา ๒๔๘ มาใช้บังคับโดยอนุโลม</w:t>
       </w:r>
     </w:p>
     <w:p>
@@ -10847,7 +10847,7 @@
       <w:r>
         <w:t>(๑)</w:t>
         <w:tab/>
-        <w:t>ไต่สวนข้อเท็จจริงและสรุปสำนวนพร้อมทั้งทำความเห็นเสนอต่อวุฒิสภาตามมาตรา ๓๐๖</w:t>
+        <w:t>ไต่สวนข้อเท็จจริงและสรุปสำนวนพร้อมทั้งทำความเห็นเสนอต่อวุฒิสภาตามมาตรา ๒๘๗</w:t>
       </w:r>
     </w:p>
     <w:p>
@@ -10857,7 +10857,7 @@
       <w:r>
         <w:t>(๒)</w:t>
         <w:tab/>
-        <w:t>ไต่สวนข้อเท็จจริงและสรุปสำนวนพร้อมทั้งทำความเห็นส่งไปยังศาลฎีกาแผนกคดีอาญาของผู้ดำรงตำแหน่งทางการเมืองตามมาตรา ๓๐๙</w:t>
+        <w:t>ไต่สวนข้อเท็จจริงและสรุปสำนวนพร้อมทั้งทำความเห็นส่งไปยังศาลฎีกาแผนกคดีอาญาของผู้ดำรงตำแหน่งทางการเมืองตามมาตรา ๒๙๐</w:t>
       </w:r>
     </w:p>
     <w:p>
@@ -10877,7 +10877,7 @@
       <w:r>
         <w:t>(๔)</w:t>
         <w:tab/>
-        <w:t>ตรวจสอบความถูกต้องและความมีอยู่จริงรวมทั้งความเปลี่ยนแปลงของทรัพย์สินและหนี้สินของผู้ดำรงตำแหน่งตามมาตรา ๒๙๑ และมาตรา ๒๙๗ ตามบัญชีและเอกสารประกอบที่ได้ยื่นไว้</w:t>
+        <w:t>ตรวจสอบความถูกต้องและความมีอยู่จริงรวมทั้งความเปลี่ยนแปลงของทรัพย์สินและหนี้สินของผู้ดำรงตำแหน่งตามมาตรา ๒๗๘ และมาตรา ๒๘๓ ตามบัญชีและเอกสารประกอบที่ได้ยื่นไว้</w:t>
       </w:r>
     </w:p>
     <w:p>
@@ -10905,7 +10905,7 @@
         <w:pStyle w:val="วรรค"/>
       </w:pPr>
       <w:r>
-        <w:t>ให้นำบทบัญญัติมาตรา ๑๔๖ และมาตรา ๒๖๕ มาใช้บังคับกับการปฏิบัติหน้าที่ของคณะกรรมการป้องกันและปราบปรามการทุจริตแห่งชาติด้วย โดยอนุโลม</w:t>
+        <w:t>ให้นำบทบัญญัติมาตรา ๓๒๓ และมาตรา ๒๕๒ มาใช้บังคับกับการปฏิบัติหน้าที่ของคณะกรรมการป้องกันและปราบปรามการทุจริตแห่งชาติด้วย โดยอนุโลม</w:t>
       </w:r>
     </w:p>
     <w:p>
@@ -11050,7 +11050,7 @@
         <w:pStyle w:val="วรรค"/>
       </w:pPr>
       <w:r>
-        <w:t>ในระหว่างที่สมาชิกภาพของสมาชิกวุฒิสภาสิ้นสุดลงพร้อมกันทั้งหมดตามมาตรา ๓๒๔ ให้ประธานองคมนตรีทำหน้าที่คณะองคมนตรีด้วย และให้คณะองคมนตรีที่เหลืออยู่ทำหน้าที่รัฐสภาตามมาตรา ๑๙ มาตรา ๒๑ มาตรา ๒๒ มาตรา ๒๓ และมิให้นำมาตรา ๒๐ วรรคสาม และมาตรา ๒๔ วรรคสาม มาใช้บังคับ และให้คณะองคมนตรีเลือกองคมนตรีคนหนึ่งขึ้นทำหน้าที่ประธานเป็นการชั่วคราว</w:t>
+        <w:t>ในระหว่างที่สมาชิกภาพของสมาชิกวุฒิสภาสิ้นสุดลงพร้อมกันทั้งหมดตามมาตรา ๓๔๗ ให้ประธานองคมนตรีทำหน้าที่คณะองคมนตรีด้วย และให้คณะองคมนตรีที่เหลืออยู่ทำหน้าที่รัฐสภาตามมาตรา ๑๙ มาตรา ๒๑ มาตรา ๒๒ มาตรา ๒๓ และมิให้นำมาตรา ๒๐ วรรคสาม และมาตรา ๒๔ วรรคสาม มาใช้บังคับ และให้คณะองคมนตรีเลือกองคมนตรีคนหนึ่งขึ้นทำหน้าที่ประธานเป็นการชั่วคราว</w:t>
       </w:r>
     </w:p>
     <w:p>
@@ -11065,7 +11065,7 @@
         <w:t>มาตรา ๓๓๙</w:t>
       </w:r>
       <w:r>
-        <w:t xml:space="preserve">  นับแต่วันประกาศใช้รัฐธรรมนูญนี้ ให้สภาผู้แทนราษฎรตามรัฐธรรมนูญแห่งราชอาณาจักรไทย พุทธศักราช ๒๔๔๕ ซึ่งแก้ไขเพิ่มเติมครั้งสุดท้ายโดยรัฐธรรมนูญแห่งราชอาณาจักรไทย แก้ไขเพิ่มเติม (ฉบับที่ ๖) พุทธศักราช ๒๔๔๕ ทำหน้าที่สภาผู้แทนราษฎรตามรัฐธรรมนูญนี้จนถึงวันเลือกตั้งสมาชิกสภาผู้แทนราษฎรตามมาตรา ๓๒๕ และให้วุฒิสภาตามรัฐธรรมนูญแห่งราชอาณาจักรไทย พุทธศักราช ๒๔๔๕ ซึ่งแก้ไขเพิ่มเติมครั้งสุดท้ายโดยรัฐธรรมนูญแห่งราชอาณาจักรไทย แก้ไขเพิ่มเติม (ฉบับที่ ๖) พุทธศักราช ๒๔๔๕ ทำหน้าที่วุฒิสภาตามรัฐธรรมนูญนี้ จนถึงวันที่ครบสี่ปีนับแต่วันที่พระมหากษัตริย์ทรงแต่งตั้งสมาชิกวุฒิสภาตามวรรคห้า (๑) หรือวันเลือกตั้งสมาชิกวุฒิสภาตามวรรคห้า (๒) แล้วแต่กรณี</w:t>
+        <w:t xml:space="preserve">  นับแต่วันประกาศใช้รัฐธรรมนูญนี้ ให้สภาผู้แทนราษฎรตามรัฐธรรมนูญแห่งราชอาณาจักรไทย พุทธศักราช ๒๔๔๕ ซึ่งแก้ไขเพิ่มเติมครั้งสุดท้ายโดยรัฐธรรมนูญแห่งราชอาณาจักรไทย แก้ไขเพิ่มเติม (ฉบับที่ ๖) พุทธศักราช ๒๔๔๕ ทำหน้าที่สภาผู้แทนราษฎรตามรัฐธรรมนูญนี้จนถึงวันเลือกตั้งสมาชิกสภาผู้แทนราษฎรตามมาตรา ๓๔๘ และให้วุฒิสภาตามรัฐธรรมนูญแห่งราชอาณาจักรไทย พุทธศักราช ๒๔๔๕ ซึ่งแก้ไขเพิ่มเติมครั้งสุดท้ายโดยรัฐธรรมนูญแห่งราชอาณาจักรไทย แก้ไขเพิ่มเติม (ฉบับที่ ๖) พุทธศักราช ๒๔๔๕ ทำหน้าที่วุฒิสภาตามรัฐธรรมนูญนี้ จนถึงวันที่ครบสี่ปีนับแต่วันที่พระมหากษัตริย์ทรงแต่งตั้งสมาชิกวุฒิสภาตามวรรคห้า (๑) หรือวันเลือกตั้งสมาชิกวุฒิสภาตามวรรคห้า (๒) แล้วแต่กรณี</w:t>
       </w:r>
     </w:p>
     <w:p>
@@ -11073,7 +11073,7 @@
         <w:pStyle w:val="วรรค"/>
       </w:pPr>
       <w:r>
-        <w:t>ให้สมาชิกสภาผู้แทนราษฎรซึ่งดำรงตำแหน่งอยู่ในวันประกาศใช้รัฐธรรมนูญนี้ คงเป็นสมาชิกสภาผู้แทนราษฎรตามบทบัญญัติแห่งรัฐธรรมนูญนี้อยู่ต่อไปจนครบอายุของสภาผู้แทนราษฎร หรือเมื่อมีการยุบสภา หรือเมื่อสมาชิกภาพสิ้นสุดลงตามมาตรา ๓๒๔ แล้วแต่กรณี ในกรณีที่ตำแหน่งสมาชิกสภาผู้แทนราษฎรว่างลงไม่ว่าด้วยเหตุใด ๆ ให้สภาผู้แทนราษฎรประกอบด้วยสมาชิกสภาผู้แทนราษฎรเท่าที่มีอยู่</w:t>
+        <w:t>ให้สมาชิกสภาผู้แทนราษฎรซึ่งดำรงตำแหน่งอยู่ในวันประกาศใช้รัฐธรรมนูญนี้ คงเป็นสมาชิกสภาผู้แทนราษฎรตามบทบัญญัติแห่งรัฐธรรมนูญนี้อยู่ต่อไปจนครบอายุของสภาผู้แทนราษฎร หรือเมื่อมีการยุบสภา หรือเมื่อสมาชิกภาพสิ้นสุดลงตามมาตรา ๓๔๗ แล้วแต่กรณี ในกรณีที่ตำแหน่งสมาชิกสภาผู้แทนราษฎรว่างลงไม่ว่าด้วยเหตุใด ๆ ให้สภาผู้แทนราษฎรประกอบด้วยสมาชิกสภาผู้แทนราษฎรเท่าที่มีอยู่</w:t>
       </w:r>
     </w:p>
     <w:p>
@@ -11081,7 +11081,7 @@
         <w:pStyle w:val="วรรค"/>
       </w:pPr>
       <w:r>
-        <w:t>ให้สมาชิกวุฒิสภาซึ่งดำรงตำแหน่งอยู่ในวันประกาศใช้รัฐธรรมนูญนี้ คงเป็นสมาชิกวุฒิสภาตามบทบัญญัติแห่งรัฐธรรมนูญนี้จนกว่าสมาชิกภาพของสมาชิกวุฒิสภาจะสิ้นสุดลงตามรัฐธรรมนูญแห่งราชอาณาจักรไทย พุทธศักราช ๒๔๔๕ ซึ่งแก้ไขเพิ่มเติมครั้งสุดท้ายโดยรัฐธรรมนูญแห่งราชอาณาจักรไทย แก้ไขเพิ่มเติม (ฉบับที่ ๖) พุทธศักราช ๒๔๔๕ หรือสมาชิกภาพของสมาชิกวุฒิสภาสิ้นสุดลงตามมาตรา ๓๒๔ แล้วแต่กรณี ในกรณีที่ตำแหน่งสมาชิกวุฒิสภาว่างลงไม่ว่าด้วยเหตุใด ๆ ให้วุฒิสภาประกอบด้วยสมาชิกวุฒิสภาเท่าที่มีอยู่</w:t>
+        <w:t>ให้สมาชิกวุฒิสภาซึ่งดำรงตำแหน่งอยู่ในวันประกาศใช้รัฐธรรมนูญนี้ คงเป็นสมาชิกวุฒิสภาตามบทบัญญัติแห่งรัฐธรรมนูญนี้จนกว่าสมาชิกภาพของสมาชิกวุฒิสภาจะสิ้นสุดลงตามรัฐธรรมนูญแห่งราชอาณาจักรไทย พุทธศักราช ๒๔๔๕ ซึ่งแก้ไขเพิ่มเติมครั้งสุดท้ายโดยรัฐธรรมนูญแห่งราชอาณาจักรไทย แก้ไขเพิ่มเติม (ฉบับที่ ๖) พุทธศักราช ๒๔๔๕ หรือสมาชิกภาพของสมาชิกวุฒิสภาสิ้นสุดลงตามมาตรา ๓๔๗ แล้วแต่กรณี ในกรณีที่ตำแหน่งสมาชิกวุฒิสภาว่างลงไม่ว่าด้วยเหตุใด ๆ ให้วุฒิสภาประกอบด้วยสมาชิกวุฒิสภาเท่าที่มีอยู่</w:t>
       </w:r>
     </w:p>
     <w:p>
@@ -11089,7 +11089,7 @@
         <w:pStyle w:val="วรรค"/>
       </w:pPr>
       <w:r>
-        <w:t>มิให้นำบทบัญญัติมาตรา ๑๐๗ (๓) มาตรา ๑๑๘ (๗) มาตรา ๑๒๑ มาตรา ๑๒๕ (๒) และ (๓) มาตรา ๑๒๖ (๒) และ (๓) มาตรา ๑๒๗ มาตรา ๑๓๐ และมาตรา ๑๓๔ มาใช้บังคับกับสมาชิกสภาผู้แทนราษฎรตามวรรคสองและสมาชิกวุฒิสภาตามวรรคสาม</w:t>
+        <w:t>มิให้นำบทบัญญัติมาตรา ๑๐๘ (๓) มาตรา ๑๑๙ (๗) มาตรา ๑๒๒ มาตรา ๑๒๖ (๒) และ (๓) มาตรา ๑๒๗ (๒) และ (๓) มาตรา ๑๒๘ มาตรา ๑๓๑ และมาตรา ๑๓๕ มาใช้บังคับกับสมาชิกสภาผู้แทนราษฎรตามวรรคสองและสมาชิกวุฒิสภาตามวรรคสาม</w:t>
       </w:r>
     </w:p>
     <w:p>
@@ -11117,7 +11117,7 @@
       <w:r>
         <w:t>(๒)</w:t>
         <w:tab/>
-        <w:t>ในกรณีที่สมาชิกภาพของสมาชิกวุฒิสภาสิ้นสุดลงตามมาตรา ๓๒๔ ให้ดำเนินการเลือกตั้งตามกฎหมายประกอบรัฐธรรมนูญว่าด้วยการเลือกตั้งสมาชิกสภาผู้แทนราษฎรและสมาชิกวุฒิสภา แต่ถ้ายังไม่มีกฎหมายดังกล่าว ให้นำกฎหมายว่าด้วยการเลือกตั้งสมาชิกสภาผู้แทนราษฎรซึ่งมีผลใช้บังคับอยู่ในวันประกาศใช้รัฐธรรมนูญนี้ เท่าที่ไม่ขัดหรือแย้งต่อรัฐธรรมนูญนี้ มาใช้บังคับกับการเลือกตั้งสมาชิกวุฒิสภาด้วย โดยให้ใช้คำว่า “สมาชิกวุฒิสภา” แทนคำว่า “สมาชิกสภาผู้แทนราษฎร” ทุกแห่งและให้ประธานกรรมการการเลือกตั้งที่ตั้งขึ้นตามมาตรา ๓๒๐ เป็นผู้รักษาการตามกฎหมายดังกล่าว และในกรณีที่คณะกรรมการการเลือกตั้งเห็นว่าบทบัญญัติใดของกฎหมายว่าด้วยการเลือกตั้งสมาชิกสภาผู้แทนราษฎรขัดหรือแย้งหรือไม่สอดคล้องกับรัฐธรรมนูญนี้ คณะกรรมการการเลือกตั้งมีอำนาจกำหนดระเบียบที่จำเป็นขึ้นใช้แทนบทบัญญัตินั้นได้เพื่อให้การเลือกตั้งเป็นไปโดยสุจริตและเที่ยงธรรม ระเบียบดังกล่าวและความเห็นที่ว่าบทบัญญัติแห่งกฎหมายดังกล่าวนั้นขัดหรือแย้งหรือไม่สอดคล้องกับรัฐธรรมนูญนี้ ให้ส่งศาลรัฐธรรมนูญพิจารณาความชอบด้วยรัฐธรรมนูญก่อนประกาศใช้ในราชกิจจานุเบกษา</w:t>
+        <w:t>ในกรณีที่สมาชิกภาพของสมาชิกวุฒิสภาสิ้นสุดลงตามมาตรา ๓๔๗ ให้ดำเนินการเลือกตั้งตามกฎหมายประกอบรัฐธรรมนูญว่าด้วยการเลือกตั้งสมาชิกสภาผู้แทนราษฎรและสมาชิกวุฒิสภา แต่ถ้ายังไม่มีกฎหมายดังกล่าว ให้นำกฎหมายว่าด้วยการเลือกตั้งสมาชิกสภาผู้แทนราษฎรซึ่งมีผลใช้บังคับอยู่ในวันประกาศใช้รัฐธรรมนูญนี้ เท่าที่ไม่ขัดหรือแย้งต่อรัฐธรรมนูญนี้ มาใช้บังคับกับการเลือกตั้งสมาชิกวุฒิสภาด้วย โดยให้ใช้คำว่า “สมาชิกวุฒิสภา” แทนคำว่า “สมาชิกสภาผู้แทนราษฎร” ทุกแห่งและให้ประธานกรรมการการเลือกตั้งที่ตั้งขึ้นตามมาตรา ๓๔๓ เป็นผู้รักษาการตามกฎหมายดังกล่าว และในกรณีที่คณะกรรมการการเลือกตั้งเห็นว่าบทบัญญัติใดของกฎหมายว่าด้วยการเลือกตั้งสมาชิกสภาผู้แทนราษฎรขัดหรือแย้งหรือไม่สอดคล้องกับรัฐธรรมนูญนี้ คณะกรรมการการเลือกตั้งมีอำนาจกำหนดระเบียบที่จำเป็นขึ้นใช้แทนบทบัญญัตินั้นได้เพื่อให้การเลือกตั้งเป็นไปโดยสุจริตและเที่ยงธรรม ระเบียบดังกล่าวและความเห็นที่ว่าบทบัญญัติแห่งกฎหมายดังกล่าวนั้นขัดหรือแย้งหรือไม่สอดคล้องกับรัฐธรรมนูญนี้ ให้ส่งศาลรัฐธรรมนูญพิจารณาความชอบด้วยรัฐธรรมนูญก่อนประกาศใช้ในราชกิจจานุเบกษา</w:t>
       </w:r>
     </w:p>
     <w:p>
@@ -11125,7 +11125,7 @@
         <w:pStyle w:val="วรรค"/>
       </w:pPr>
       <w:r>
-        <w:t>การเลือกตั้งสมาชิกวุฒิสภาตาม (๒) ให้กระทำภายในเก้าสิบวันนับแต่วันครบสองร้อยสี่สิบวันนับแต่วันประกาศใช้รัฐธรรมนูญนี้ และมิให้ดำเนินการเลือกตั้งในวันเดียวกันกับการเลือกตั้งสมาชิกสภาผู้แทนราษฎรตามมาตรา ๓๒๕</w:t>
+        <w:t>การเลือกตั้งสมาชิกวุฒิสภาตาม (๒) ให้กระทำภายในเก้าสิบวันนับแต่วันครบสองร้อยสี่สิบวันนับแต่วันประกาศใช้รัฐธรรมนูญนี้ และมิให้ดำเนินการเลือกตั้งในวันเดียวกันกับการเลือกตั้งสมาชิกสภาผู้แทนราษฎรตามมาตรา ๓๔๘</w:t>
       </w:r>
     </w:p>
     <w:p>
@@ -11148,7 +11148,7 @@
         <w:pStyle w:val="วรรค"/>
       </w:pPr>
       <w:r>
-        <w:t>ให้ประธานวุฒิสภาและรองประธานวุฒิสภาซึ่งดำรงตำแหน่งอยู่ในวันประกาศใช้รัฐธรรมนูญนี้ คงเป็นประธานวุฒิสภาและรองประธานวุฒิสภาตามบทบัญญัติแห่งรัฐธรรมนูญนี้ จนกว่าอายุของวุฒิสภาตามมาตรา ๓๑๖ จะสิ้นสุดลงหรือพ้นจากตำแหน่งก่อนถึงวาระตามมาตรา ๓๒๔</w:t>
+        <w:t>ให้ประธานวุฒิสภาและรองประธานวุฒิสภาซึ่งดำรงตำแหน่งอยู่ในวันประกาศใช้รัฐธรรมนูญนี้ คงเป็นประธานวุฒิสภาและรองประธานวุฒิสภาตามบทบัญญัติแห่งรัฐธรรมนูญนี้ จนกว่าอายุของวุฒิสภาตามมาตรา ๓๓๙ จะสิ้นสุดลงหรือพ้นจากตำแหน่งก่อนถึงวาระตามมาตรา ๓๔๗</w:t>
       </w:r>
     </w:p>
     <w:p>
@@ -11174,7 +11174,7 @@
       <w:r>
         <w:t>(๑)</w:t>
         <w:tab/>
-        <w:t>เมื่อสภาผู้แทนราษฎรตามมาตรา ๓๑๖ วรรคหนึ่ง สิ้นอายุหรือถูกยุบ หรือเป็นกรณีตามมาตรา ๓๒๔</w:t>
+        <w:t>เมื่อสภาผู้แทนราษฎรตามมาตรา ๓๓๙ วรรคหนึ่ง สิ้นอายุหรือถูกยุบ หรือเป็นกรณีตามมาตรา ๓๔๗</w:t>
       </w:r>
     </w:p>
     <w:p>
@@ -11217,7 +11217,7 @@
         <w:pStyle w:val="วรรค"/>
       </w:pPr>
       <w:r>
-        <w:t>ให้นำบทบัญญัติมาตรา ๑๕๖ ของรัฐธรรมนูญแห่งราชอาณาจักรไทย พุทธศักราช ๒๔๔๕ ซึ่งแก้ไขเพิ่มเติมครั้งสุดท้ายโดยรัฐธรรมนูญแห่งราชอาณาจักรไทย แก้ไขเพิ่มเติม (ฉบับที่ ๖) พุทธศักราช ๒๔๔๕ มาใช้บังคับกับการอภิปรายไม่ไว้วางใจรัฐมนตรีเป็นรายบุคคลและคณะรัฐมนตรีตามวรรคหนึ่งหรือกับการอภิปรายไม่ไว้วางใจรัฐมนตรีเป็นรายบุคคลและคณะรัฐมนตรีที่จัดตั้งขึ้นใหม่ในระหว่างที่ยังไม่มีการเลือกตั้งสมาชิกสภาผู้แทนราษฎรตามมาตรา ๓๒๕ แล้วแต่กรณี และถ้ามติไม่ไว้วางใจมีคะแนนเสียงตามที่กำหนด ก็ให้รัฐมนตรีหรือคณะรัฐมนตรีดังกล่าว พ้นจากตำแหน่ง</w:t>
+        <w:t>ให้นำบทบัญญัติมาตรา ๑๔๕ ของรัฐธรรมนูญแห่งราชอาณาจักรไทย พุทธศักราช ๒๔๔๕ ซึ่งแก้ไขเพิ่มเติมครั้งสุดท้ายโดยรัฐธรรมนูญแห่งราชอาณาจักรไทย แก้ไขเพิ่มเติม (ฉบับที่ ๖) พุทธศักราช ๒๔๔๕ มาใช้บังคับกับการอภิปรายไม่ไว้วางใจรัฐมนตรีเป็นรายบุคคลและคณะรัฐมนตรีตามวรรคหนึ่งหรือกับการอภิปรายไม่ไว้วางใจรัฐมนตรีเป็นรายบุคคลและคณะรัฐมนตรีที่จัดตั้งขึ้นใหม่ในระหว่างที่ยังไม่มีการเลือกตั้งสมาชิกสภาผู้แทนราษฎรตามมาตรา ๓๔๘ แล้วแต่กรณี และถ้ามติไม่ไว้วางใจมีคะแนนเสียงตามที่กำหนด ก็ให้รัฐมนตรีหรือคณะรัฐมนตรีดังกล่าว พ้นจากตำแหน่ง</w:t>
       </w:r>
     </w:p>
     <w:p>
@@ -11225,7 +11225,7 @@
         <w:pStyle w:val="วรรค"/>
       </w:pPr>
       <w:r>
-        <w:t>เมื่อมีการเลือกตั้งสมาชิกสภาผู้แทนราษฎรตามมาตรา ๓๒๕ แล้ว ให้คณะรัฐมนตรีตามวรรคหนึ่งหรือคณะรัฐมนตรีที่จัดตั้งขึ้นใหม่ก่อนการเลือกตั้งสมาชิกสภาผู้แทนราษฎรตามมาตรา ๓๒๕ แล้วแต่กรณี พ้นจากตำแหน่ง แต่ต้องอยู่ในตำแหน่งเพื่อปฏิบัติหน้าที่ไปจนกว่าคณะรัฐมนตรีที่จัดตั้งขึ้นใหม่จะเข้ารับหน้าที่</w:t>
+        <w:t>เมื่อมีการเลือกตั้งสมาชิกสภาผู้แทนราษฎรตามมาตรา ๓๔๘ แล้ว ให้คณะรัฐมนตรีตามวรรคหนึ่งหรือคณะรัฐมนตรีที่จัดตั้งขึ้นใหม่ก่อนการเลือกตั้งสมาชิกสภาผู้แทนราษฎรตามมาตรา ๓๔๘ แล้วแต่กรณี พ้นจากตำแหน่ง แต่ต้องอยู่ในตำแหน่งเพื่อปฏิบัติหน้าที่ไปจนกว่าคณะรัฐมนตรีที่จัดตั้งขึ้นใหม่จะเข้ารับหน้าที่</w:t>
       </w:r>
     </w:p>
     <w:p>
@@ -11233,7 +11233,7 @@
         <w:pStyle w:val="วรรค"/>
       </w:pPr>
       <w:r>
-        <w:t>มิให้นำบทบัญญัติมาตรา ๑๑๘ (๗) มาตรา ๑๒๗ มาตรา ๒๐๑ มาตรา ๒๐๒ มาตรา ๒๐๓ มาตรา ๒๐๔ มาตรา ๒๐๖ (๒) (๓) และ (๖) มาตรา ๒๐๙ มาตรา ๒๑๕ วรรคสี่ และมาตรา ๒๑๖ (๕) มาใช้บังคับกับการดำรงตำแหน่งและการพ้นจากตำแหน่งของนายกรัฐมนตรีและรัฐมนตรีตามมาตรานี้</w:t>
+        <w:t>มิให้นำบทบัญญัติมาตรา ๑๑๙ (๗) มาตรา ๑๒๘ มาตรา ๑๘๘ มาตรา ๑๘๙ มาตรา ๑๙๐ มาตรา ๑๙๑ มาตรา ๑๙๓ (๒) (๓) และ (๖) มาตรา ๑๙๖ มาตรา ๒๐๒ วรรคสี่ และมาตรา ๒๐๓ (๕) มาใช้บังคับกับการดำรงตำแหน่งและการพ้นจากตำแหน่งของนายกรัฐมนตรีและรัฐมนตรีตามมาตรานี้</w:t>
       </w:r>
     </w:p>
     <w:p>
@@ -11248,7 +11248,7 @@
         <w:t>มาตรา ๓๔๒</w:t>
       </w:r>
       <w:r>
-        <w:t xml:space="preserve">  ในวาระเริ่มแรก ให้คณะกรรมการตุลาการตามกฎหมายว่าด้วยระเบียบข้าราชการฝ่ายตุลาการ เป็นคณะกรรมการตุลาการศาลยุติธรรมตามรัฐธรรมนูญนี้ จนกว่าจะมีคณะกรรมการตุลาการศาลยุติธรรมตามมาตรา ๒๗๔ และการเลือกตั้งกรรมการตุลาการให้เป็นไปตามกฎหมายว่าด้วยระเบียบข้าราชการฝ่ายตุลาการ</w:t>
+        <w:t xml:space="preserve">  ในวาระเริ่มแรก ให้คณะกรรมการตุลาการตามกฎหมายว่าด้วยระเบียบข้าราชการฝ่ายตุลาการ เป็นคณะกรรมการตุลาการศาลยุติธรรมตามรัฐธรรมนูญนี้ จนกว่าจะมีคณะกรรมการตุลาการศาลยุติธรรมตามมาตรา ๒๖๑ และการเลือกตั้งกรรมการตุลาการให้เป็นไปตามกฎหมายว่าด้วยระเบียบข้าราชการฝ่ายตุลาการ</w:t>
       </w:r>
     </w:p>
     <w:p>
@@ -11256,7 +11256,7 @@
         <w:pStyle w:val="วรรค"/>
       </w:pPr>
       <w:r>
-        <w:t>ภายในสามปีนับแต่วันประกาศใช้รัฐธรรมนูญนี้ ให้ดำเนินการทั้งหลายอันจำเป็นเพื่อให้การเป็นไปตามมาตรา ๒๗๔ ของรัฐธรรมนูญนี้</w:t>
+        <w:t>ภายในสามปีนับแต่วันประกาศใช้รัฐธรรมนูญนี้ ให้ดำเนินการทั้งหลายอันจำเป็นเพื่อให้การเป็นไปตามมาตรา ๒๖๑ ของรัฐธรรมนูญนี้</w:t>
       </w:r>
     </w:p>
     <w:p>
@@ -11271,7 +11271,7 @@
         <w:t>มาตรา ๓๔๓</w:t>
       </w:r>
       <w:r>
-        <w:t xml:space="preserve">  ในวาระเริ่มแรก ให้วุฒิสภาดำเนินการเลือกกรรมการการเลือกตั้งตามมาตรา ๑๓๖ ภายในสามสิบวันนับแต่วันประกาศใช้รัฐธรรมนูญนี้ และมิให้นำกำหนดเวลาตามมาตรา ๑๓๘ มาใช้บังคับ</w:t>
+        <w:t xml:space="preserve">  ในวาระเริ่มแรก ให้วุฒิสภาดำเนินการเลือกกรรมการการเลือกตั้งตามมาตรา ๓๑๓ ภายในสามสิบวันนับแต่วันประกาศใช้รัฐธรรมนูญนี้ และมิให้นำกำหนดเวลาตามมาตรา ๓๑๕ มาใช้บังคับ</w:t>
       </w:r>
     </w:p>
     <w:p>
@@ -11310,7 +11310,7 @@
         <w:pStyle w:val="วรรค"/>
       </w:pPr>
       <w:r>
-        <w:t>ในวาระเริ่มแรกให้ดำเนินการเลือกตุลาการศาลรัฐธรรมนูญตามมาตรา ๒๕๕ และมาตรา ๒๕๗ ภายในสี่สิบห้าวันนับแต่วันประกาศใช้รัฐธรรมนูญนี้</w:t>
+        <w:t>ในวาระเริ่มแรกให้ดำเนินการเลือกตุลาการศาลรัฐธรรมนูญตามมาตรา ๒๔๒ และมาตรา ๒๔๔ ภายในสี่สิบห้าวันนับแต่วันประกาศใช้รัฐธรรมนูญนี้</w:t>
       </w:r>
     </w:p>
     <w:p>
@@ -11318,7 +11318,7 @@
         <w:pStyle w:val="วรรค"/>
       </w:pPr>
       <w:r>
-        <w:t>ในระหว่างที่ยังไม่มีศาลปกครองสูงสุด มิให้นำมาตรา ๒๕๕ (๒) มาใช้บังคับ และให้ศาลรัฐธรรมนูญประกอบด้วยประธานศาลรัฐธรรมนูญคนหนึ่งและตุลาการศาลรัฐธรรมนูญอื่นอีกสิบสองคนซึ่งพระมหากษัตริย์ทรงแต่งตั้งจากบุคคลตามมาตรา ๒๕๕ (๑) (๓) และ (๔)</w:t>
+        <w:t>ในระหว่างที่ยังไม่มีศาลปกครองสูงสุด มิให้นำมาตรา ๒๔๒ (๒) มาใช้บังคับ และให้ศาลรัฐธรรมนูญประกอบด้วยประธานศาลรัฐธรรมนูญคนหนึ่งและตุลาการศาลรัฐธรรมนูญอื่นอีกสิบสองคนซึ่งพระมหากษัตริย์ทรงแต่งตั้งจากบุคคลตามมาตรา ๒๔๒ (๑) (๓) และ (๔)</w:t>
       </w:r>
     </w:p>
     <w:p>
@@ -11349,7 +11349,7 @@
         <w:pStyle w:val="วรรค"/>
       </w:pPr>
       <w:r>
-        <w:t>ในวาระเริ่มแรก ในระหว่างที่ยังไม่มีประธานศาลปกครองสูงสุด ให้คณะกรรมการสรรหากรรมการป้องกันและปราบปรามการทุจริตแห่งชาติตามมาตรา ๒๙๘ วรรคสาม มีจำนวนสิบสี่คน ประกอบด้วย ประธานศาลฎีกา ประธานศาลรัฐธรรมนูญ อธิการบดีของสถาบันอุดมศึกษาของรัฐที่เป็นนิติบุคคลทุกแห่งซึ่งเลือกกันเองให้เหลือเจ็ดคน และผู้แทนพรรคการเมืองทุกพรรคที่มีสมาชิกเป็นสมาชิกสภาผู้แทนราษฎร พรรคละหนึ่งคน ซึ่งเลือกกันเองให้เหลือห้าคนเป็นกรรมการ</w:t>
+        <w:t>ในวาระเริ่มแรก ในระหว่างที่ยังไม่มีประธานศาลปกครองสูงสุด ให้คณะกรรมการสรรหากรรมการป้องกันและปราบปรามการทุจริตแห่งชาติตามมาตรา ๓๓๑ วรรคสาม มีจำนวนสิบสี่คน ประกอบด้วย ประธานศาลฎีกา ประธานศาลรัฐธรรมนูญ อธิการบดีของสถาบันอุดมศึกษาของรัฐที่เป็นนิติบุคคลทุกแห่งซึ่งเลือกกันเองให้เหลือเจ็ดคน และผู้แทนพรรคการเมืองทุกพรรคที่มีสมาชิกเป็นสมาชิกสภาผู้แทนราษฎร พรรคละหนึ่งคน ซึ่งเลือกกันเองให้เหลือห้าคนเป็นกรรมการ</w:t>
       </w:r>
     </w:p>
     <w:p>
@@ -11364,7 +11364,7 @@
         <w:t>มาตรา ๓๔๖</w:t>
       </w:r>
       <w:r>
-        <w:t xml:space="preserve">  ในวาระเริ่มแรก กรรมการการเลือกตั้ง ผู้ตรวจการแผ่นดินของรัฐสภา กรรมการสิทธิมนุษยชนแห่งชาติ ตุลาการศาลรัฐธรรมนูญ กรรมการป้องกันและปราบปรามการทุจริตแห่งชาติ และกรรมการตรวจเงินแผ่นดิน ที่วุฒิสภาตามมาตรา ๓๑๖ วรรคสาม มีมติเลือก ให้มีระยะเวลาดำรงตำแหน่งเพียงกึ่งหนึ่งของวาระที่กำหนดไว้สำหรับตำแหน่งดังกล่าว และเพื่อประโยชน์ในการเลือกผู้ดำรงตำแหน่งดังกล่าวเป็นคราวแรกโดยวุฒิสภาซึ่งเลือกตั้งขึ้นตามรัฐธรรมนูญนี้ มิให้นำบทบัญญัติที่ให้ดำรงตำแหน่งดังกล่าวได้เพียงวาระเดียวมาใช้บังคับ</w:t>
+        <w:t xml:space="preserve">  ในวาระเริ่มแรก กรรมการการเลือกตั้ง ผู้ตรวจการแผ่นดินของรัฐสภา กรรมการสิทธิมนุษยชนแห่งชาติ ตุลาการศาลรัฐธรรมนูญ กรรมการป้องกันและปราบปรามการทุจริตแห่งชาติ และกรรมการตรวจเงินแผ่นดิน ที่วุฒิสภาตามมาตรา ๓๓๙ วรรคสาม มีมติเลือก ให้มีระยะเวลาดำรงตำแหน่งเพียงกึ่งหนึ่งของวาระที่กำหนดไว้สำหรับตำแหน่งดังกล่าว และเพื่อประโยชน์ในการเลือกผู้ดำรงตำแหน่งดังกล่าวเป็นคราวแรกโดยวุฒิสภาซึ่งเลือกตั้งขึ้นตามรัฐธรรมนูญนี้ มิให้นำบทบัญญัติที่ให้ดำรงตำแหน่งดังกล่าวได้เพียงวาระเดียวมาใช้บังคับ</w:t>
       </w:r>
     </w:p>
     <w:p>
@@ -11372,7 +11372,7 @@
         <w:pStyle w:val="วรรค"/>
       </w:pPr>
       <w:r>
-        <w:t>ก่อนที่จะมีการเลือกตั้งสมาชิกวุฒิสภาตามรัฐธรรมนูญนี้ การถอดถอนผู้ดำรงตำแหน่งต่าง ๆ ตามรัฐธรรมนูญนี้ ให้เป็นมติของที่ประชุมร่วมของสภาผู้แทนราษฎรกับวุฒิสภาตามมาตรา ๓๑๖ และให้นำบทบัญญัติมาตรา ๑๐๙ (๑๔) มาตรา ๑๑๘ (๑๐) มาตรา ๑๓๓ (๘) มาตรา ๑๔๑ (๕) มาตรา ๑๖๘ (๓) มาตรา ๒๑๖ (๘) มาตรา ๒๖๐ (๖) มาตรา ๓๐๐ มาตรา ๓๐๔ มาตรา ๓๐๕ และมาตรา ๓๐๘ มาใช้บังคับโดยอนุโลม</w:t>
+        <w:t>ก่อนที่จะมีการเลือกตั้งสมาชิกวุฒิสภาตามรัฐธรรมนูญนี้ การถอดถอนผู้ดำรงตำแหน่งต่าง ๆ ตามรัฐธรรมนูญนี้ ให้เป็นมติของที่ประชุมร่วมของสภาผู้แทนราษฎรกับวุฒิสภาตามมาตรา ๓๓๙ และให้นำบทบัญญัติมาตรา ๑๑๐ (๑๔) มาตรา ๑๑๙ (๑๐) มาตรา ๑๓๔ (๘) มาตรา ๓๑๘ (๕) มาตรา ๑๕๗ (๓) มาตรา ๒๐๓ (๘) มาตรา ๒๔๗ (๖) มาตรา ๓๓๓ มาตรา ๒๘๕ มาตรา ๒๘๖ และมาตรา ๒๘๙ มาใช้บังคับโดยอนุโลม</w:t>
       </w:r>
     </w:p>
     <w:p>
@@ -11405,7 +11405,7 @@
       <w:r>
         <w:t>(๑)</w:t>
         <w:tab/>
-        <w:t>ให้สภาผู้แทนราษฎรพิจารณาร่างพระราชบัญญัติประกอบรัฐธรรมนูญตามวรรคหนึ่งให้แล้วเสร็จภายในหนึ่งร้อยยี่สิบวันนับแต่วันประกาศใช้รัฐธรรมนูญนี้ ในกรณีที่พ้นกำหนดเวลาดังกล่าวแต่การพิจารณาร่างพระราชบัญญัติประกอบรัฐธรรมนูญตามวรรคหนึ่งยังไม่แล้วเสร็จทุกฉบับ ให้สมาชิกภาพของสมาชิกสภาผู้แทนราษฎรสิ้นสุดลงพร้อมกันทั้งหมด และห้ามมิให้มีการดำเนินการเลือกตั้งทั่วไปตามรัฐธรรมนูญนี้ จนกว่าจะมีการให้ความเห็นชอบร่างพระราชบัญญัติประกอบรัฐธรรมนูญตามวรรคหนึ่งแล้วเสร็จทุกฉบับ หรือเป็นกรณีตามมาตรา ๓๒๕ ในกรณีนี้ ให้วุฒิสภาทำหน้าที่รัฐสภาและดำเนินการเสนอและพิจารณาร่างพระราชบัญญัติประกอบรัฐธรรมนูญดังกล่าวให้แล้วเสร็จภายในเก้าสิบวันนับแต่วันถัดจากวันที่ครบกำหนดหนึ่งร้อยยี่สิบวันนับแต่วันประกาศใช้รัฐธรรมนูญนี้</w:t>
+        <w:t>ให้สภาผู้แทนราษฎรพิจารณาร่างพระราชบัญญัติประกอบรัฐธรรมนูญตามวรรคหนึ่งให้แล้วเสร็จภายในหนึ่งร้อยยี่สิบวันนับแต่วันประกาศใช้รัฐธรรมนูญนี้ ในกรณีที่พ้นกำหนดเวลาดังกล่าวแต่การพิจารณาร่างพระราชบัญญัติประกอบรัฐธรรมนูญตามวรรคหนึ่งยังไม่แล้วเสร็จทุกฉบับ ให้สมาชิกภาพของสมาชิกสภาผู้แทนราษฎรสิ้นสุดลงพร้อมกันทั้งหมด และห้ามมิให้มีการดำเนินการเลือกตั้งทั่วไปตามรัฐธรรมนูญนี้ จนกว่าจะมีการให้ความเห็นชอบร่างพระราชบัญญัติประกอบรัฐธรรมนูญตามวรรคหนึ่งแล้วเสร็จทุกฉบับ หรือเป็นกรณีตามมาตรา ๓๔๘ ในกรณีนี้ ให้วุฒิสภาทำหน้าที่รัฐสภาและดำเนินการเสนอและพิจารณาร่างพระราชบัญญัติประกอบรัฐธรรมนูญดังกล่าวให้แล้วเสร็จภายในเก้าสิบวันนับแต่วันถัดจากวันที่ครบกำหนดหนึ่งร้อยยี่สิบวันนับแต่วันประกาศใช้รัฐธรรมนูญนี้</w:t>
       </w:r>
     </w:p>
     <w:p>
@@ -11425,7 +11425,7 @@
       <w:r>
         <w:t>(๓)</w:t>
         <w:tab/>
-        <w:t>ในกรณีที่วุฒิสภาไม่สามารถพิจารณาร่างพระราชบัญญัติประกอบรัฐธรรมนูญตามวรรคหนึ่งทุกฉบับให้แล้วเสร็จภายในกำหนดเวลาตาม (๑) หรือ (๒) ให้สมาชิกภาพของสมาชิกวุฒิสภาสิ้นสุดลงพร้อมกันทั้งหมด ในกรณีที่ร่างพระราชบัญญัติประกอบรัฐธรรมนูญใดได้รับความเห็นชอบจากสภาผู้แทนราษฎรแล้ว ให้ถือว่าร่างพระราชบัญญัติประกอบรัฐธรรมนูญนั้นได้รับความเห็นชอบจากรัฐสภาแล้ว และให้นำมาตรา ๙๓ และมาตรา ๙๔ มาใช้บังคับกับร่างพระราชบัญญัติประกอบรัฐธรรมนูญดังกล่าวโดยอนุโลม</w:t>
+        <w:t>ในกรณีที่วุฒิสภาไม่สามารถพิจารณาร่างพระราชบัญญัติประกอบรัฐธรรมนูญตามวรรคหนึ่งทุกฉบับให้แล้วเสร็จภายในกำหนดเวลาตาม (๑) หรือ (๒) ให้สมาชิกภาพของสมาชิกวุฒิสภาสิ้นสุดลงพร้อมกันทั้งหมด ในกรณีที่ร่างพระราชบัญญัติประกอบรัฐธรรมนูญใดได้รับความเห็นชอบจากสภาผู้แทนราษฎรแล้ว ให้ถือว่าร่างพระราชบัญญัติประกอบรัฐธรรมนูญนั้นได้รับความเห็นชอบจากรัฐสภาแล้ว และให้นำมาตรา ๙๔ และมาตรา ๙๕ มาใช้บังคับกับร่างพระราชบัญญัติประกอบรัฐธรรมนูญดังกล่าวโดยอนุโลม</w:t>
       </w:r>
     </w:p>
     <w:p>
@@ -11433,7 +11433,7 @@
         <w:pStyle w:val="วรรค"/>
       </w:pPr>
       <w:r>
-        <w:t>ร่างพระราชบัญญัติประกอบรัฐธรรมนูญที่รัฐสภาให้ความเห็นชอบแล้วหรือถือว่ารัฐสภาให้ความเห็นชอบแล้วตามมาตรานี้ ให้นายกรัฐมนตรีดำเนินการตามมาตรา ๙๓ โดยพลัน และมิให้นำกำหนดเวลาตามมาตรา ๙๓ มาใช้บังคับ</w:t>
+        <w:t>ร่างพระราชบัญญัติประกอบรัฐธรรมนูญที่รัฐสภาให้ความเห็นชอบแล้วหรือถือว่ารัฐสภาให้ความเห็นชอบแล้วตามมาตรานี้ ให้นายกรัฐมนตรีดำเนินการตามมาตรา ๙๔ โดยพลัน และมิให้นำกำหนดเวลาตามมาตรา ๙๔ มาใช้บังคับ</w:t>
       </w:r>
     </w:p>
     <w:p>
@@ -11441,7 +11441,7 @@
         <w:pStyle w:val="วรรค"/>
       </w:pPr>
       <w:r>
-        <w:t>มิให้นำบทบัญญัติมาตรา ๑๖๙ เฉพาะส่วนที่ว่าด้วยร่างพระราชบัญญัติเกี่ยวด้วยการเงิน มาใช้บังคับกับการเสนอและการพิจารณาร่างพระราชบัญญัติประกอบรัฐธรรมนูญตามวรรคหนึ่งของสมาชิกสภาผู้แทนราษฎรหรือสมาชิกวุฒิสภาตามวรรคสอง (๑) และ (๒)</w:t>
+        <w:t>มิให้นำบทบัญญัติมาตรา ๑๕๘ เฉพาะส่วนที่ว่าด้วยร่างพระราชบัญญัติเกี่ยวด้วยการเงิน มาใช้บังคับกับการเสนอและการพิจารณาร่างพระราชบัญญัติประกอบรัฐธรรมนูญตามวรรคหนึ่งของสมาชิกสภาผู้แทนราษฎรหรือสมาชิกวุฒิสภาตามวรรคสอง (๑) และ (๒)</w:t>
       </w:r>
     </w:p>
     <w:p>
@@ -11449,7 +11449,7 @@
         <w:pStyle w:val="วรรค"/>
       </w:pPr>
       <w:r>
-        <w:t>ในการดำเนินการตามมาตรานี้ มิให้นำบทบัญญัติมาตรา ๑๖๘ มาใช้บังคับ</w:t>
+        <w:t>ในการดำเนินการตามมาตรานี้ มิให้นำบทบัญญัติมาตรา ๑๕๗ มาใช้บังคับ</w:t>
       </w:r>
     </w:p>
     <w:p>
@@ -11474,7 +11474,7 @@
       <w:r>
         <w:t>(๑)</w:t>
         <w:tab/>
-        <w:t>ในกรณีที่รัฐสภาให้ความเห็นชอบร่างพระราชบัญญัติประกอบรัฐธรรมนูญทุกฉบับแล้วเสร็จภายในกำหนดเวลาตามมาตรา ๓๒๔ วรรคหนึ่ง หรือในกรณีที่สภาผู้แทนราษฎรหรือวุฒิสภาซึ่งทำหน้าที่รัฐสภาตามมาตรา ๓๒๔ พิจารณาให้ความเห็นชอบร่างพระราชบัญญัติประกอบรัฐธรรมนูญดังกล่าวทุกฉบับภายในกำหนดเวลาตามมาตรา ๓๒๔ ให้คณะกรรมการการเลือกตั้งตามมาตรา ๓๒๐ ดำเนินการเลือกตั้งสมาชิกสภาผู้แทนราษฎรตามรัฐธรรมนูญนี้ภายในหกสิบวันนับแต่วันที่สภาผู้แทนราษฎรสิ้นอายุหรือถูกยุบ หรือเมื่อมีกรณีตามมาตรา ๓๒๔</w:t>
+        <w:t>ในกรณีที่รัฐสภาให้ความเห็นชอบร่างพระราชบัญญัติประกอบรัฐธรรมนูญทุกฉบับแล้วเสร็จภายในกำหนดเวลาตามมาตรา ๓๔๗ วรรคหนึ่ง หรือในกรณีที่สภาผู้แทนราษฎรหรือวุฒิสภาซึ่งทำหน้าที่รัฐสภาตามมาตรา ๓๔๗ พิจารณาให้ความเห็นชอบร่างพระราชบัญญัติประกอบรัฐธรรมนูญดังกล่าวทุกฉบับภายในกำหนดเวลาตามมาตรา ๓๔๗ ให้คณะกรรมการการเลือกตั้งตามมาตรา ๓๔๓ ดำเนินการเลือกตั้งสมาชิกสภาผู้แทนราษฎรตามรัฐธรรมนูญนี้ภายในหกสิบวันนับแต่วันที่สภาผู้แทนราษฎรสิ้นอายุหรือถูกยุบ หรือเมื่อมีกรณีตามมาตรา ๓๔๗</w:t>
       </w:r>
     </w:p>
     <w:p>
@@ -11484,7 +11484,7 @@
       <w:r>
         <w:t>(๒)</w:t>
         <w:tab/>
-        <w:t>ในกรณีที่ทั้งสภาผู้แทนราษฎรและวุฒิสภาไม่สามารถพิจารณาและให้ความเห็นชอบร่างพระราชบัญญัติประกอบรัฐธรรมนูญตามมาตรา ๓๒๔ วรรคหนึ่ง ให้แล้วเสร็จภายในกำหนด ให้มีการเลือกตั้งสมาชิกสภาผู้แทนราษฎรตามรัฐธรรมนูญนี้ภายในเก้าสิบวันนับแต่วันที่พ้นกำหนดเวลาตามมาตรา ๓๒๔ วรรคหนึ่ง และให้นำกฎหมายว่าด้วยการเลือกตั้งสมาชิกสภาผู้แทนราษฎรซึ่งมีผลใช้บังคับอยู่ในวันประกาศใช้รัฐธรรมนูญนี้ เท่าที่ไม่ขัดหรือแย้งต่อรัฐธรรมนูญนี้ มาใช้บังคับกับการเลือกตั้งดังกล่าว โดยให้ประธานกรรมการการเลือกตั้งที่ตั้งขึ้นตามมาตรา ๓๒๐ เป็นผู้รักษาการตามกฎหมายดังกล่าวและในกรณีที่คณะกรรมการการเลือกตั้งเห็นว่าบทบัญญัติใดของกฎหมายว่าด้วยการเลือกตั้งสมาชิกสภาผู้แทนราษฎร ขัดหรือแย้งหรือไม่สอดคล้องกับรัฐธรรมนูญนี้ คณะกรรมการการเลือกตั้งมีอำนาจกำหนดระเบียบที่จำเป็นขึ้นใช้แทนบทบัญญัตินั้นได้เพื่อให้การเลือกตั้งเป็นไปโดยสุจริตและเที่ยงธรรม ระเบียบดังกล่าวและความเห็นที่ว่าบทบัญญัติแห่งกฎหมายดังกล่าวนั้นขัดหรือแย้งหรือไม่สอดคล้องกับรัฐธรรมนูญนี้ ให้ส่งศาลรัฐธรรมนูญพิจารณาวินิจฉัยความชอบด้วยรัฐธรรมนูญก่อนประกาศใช้ในราชกิจจานุเบกษา</w:t>
+        <w:t>ในกรณีที่ทั้งสภาผู้แทนราษฎรและวุฒิสภาไม่สามารถพิจารณาและให้ความเห็นชอบร่างพระราชบัญญัติประกอบรัฐธรรมนูญตามมาตรา ๓๔๗ วรรคหนึ่ง ให้แล้วเสร็จภายในกำหนด ให้มีการเลือกตั้งสมาชิกสภาผู้แทนราษฎรตามรัฐธรรมนูญนี้ภายในเก้าสิบวันนับแต่วันที่พ้นกำหนดเวลาตามมาตรา ๓๔๗ วรรคหนึ่ง และให้นำกฎหมายว่าด้วยการเลือกตั้งสมาชิกสภาผู้แทนราษฎรซึ่งมีผลใช้บังคับอยู่ในวันประกาศใช้รัฐธรรมนูญนี้ เท่าที่ไม่ขัดหรือแย้งต่อรัฐธรรมนูญนี้ มาใช้บังคับกับการเลือกตั้งดังกล่าว โดยให้ประธานกรรมการการเลือกตั้งที่ตั้งขึ้นตามมาตรา ๓๔๓ เป็นผู้รักษาการตามกฎหมายดังกล่าวและในกรณีที่คณะกรรมการการเลือกตั้งเห็นว่าบทบัญญัติใดของกฎหมายว่าด้วยการเลือกตั้งสมาชิกสภาผู้แทนราษฎร ขัดหรือแย้งหรือไม่สอดคล้องกับรัฐธรรมนูญนี้ คณะกรรมการการเลือกตั้งมีอำนาจกำหนดระเบียบที่จำเป็นขึ้นใช้แทนบทบัญญัตินั้นได้เพื่อให้การเลือกตั้งเป็นไปโดยสุจริตและเที่ยงธรรม ระเบียบดังกล่าวและความเห็นที่ว่าบทบัญญัติแห่งกฎหมายดังกล่าวนั้นขัดหรือแย้งหรือไม่สอดคล้องกับรัฐธรรมนูญนี้ ให้ส่งศาลรัฐธรรมนูญพิจารณาวินิจฉัยความชอบด้วยรัฐธรรมนูญก่อนประกาศใช้ในราชกิจจานุเบกษา</w:t>
       </w:r>
     </w:p>
     <w:p>
@@ -11492,7 +11492,7 @@
         <w:pStyle w:val="วรรค"/>
       </w:pPr>
       <w:r>
-        <w:t>เมื่อได้มีการเลือกตั้งสมาชิกสภาผู้แทนราษฎรและสมาชิกวุฒิสภาขึ้นใหม่ตามรัฐธรรมนูญนี้แล้ว และยังไม่มีพระราชบัญญัติประกอบรัฐธรรมนูญตามมาตรา ๓๒๔ วรรคหนึ่ง ครบทุกฉบับ ให้สภาผู้แทนราษฎรและวุฒิสภาดำเนินการพิจารณาและให้ความเห็นชอบร่างพระราชบัญญัติประกอบรัฐธรรมนูญที่ยังไม่ได้ตราขึ้นตามมาตรา ๓๒๔ โดยให้เริ่มนับกำหนดเวลานับแต่วันเลือกตั้งสมาชิกสภาผู้แทนราษฎรอันเป็นการเลือกตั้งทั่วไป เป็นต้นไป และให้นำความใน (๒) และมาตรา ๓๑๖ วรรคห้า (๒) มาใช้บังคับโดยอนุโลม</w:t>
+        <w:t>เมื่อได้มีการเลือกตั้งสมาชิกสภาผู้แทนราษฎรและสมาชิกวุฒิสภาขึ้นใหม่ตามรัฐธรรมนูญนี้แล้ว และยังไม่มีพระราชบัญญัติประกอบรัฐธรรมนูญตามมาตรา ๓๔๗ วรรคหนึ่ง ครบทุกฉบับ ให้สภาผู้แทนราษฎรและวุฒิสภาดำเนินการพิจารณาและให้ความเห็นชอบร่างพระราชบัญญัติประกอบรัฐธรรมนูญที่ยังไม่ได้ตราขึ้นตามมาตรา ๓๔๗ โดยให้เริ่มนับกำหนดเวลานับแต่วันเลือกตั้งสมาชิกสภาผู้แทนราษฎรอันเป็นการเลือกตั้งทั่วไป เป็นต้นไป และให้นำความใน (๒) และมาตรา ๓๓๙ วรรคห้า (๒) มาใช้บังคับโดยอนุโลม</w:t>
       </w:r>
     </w:p>
     <w:p>
@@ -11507,7 +11507,7 @@
         <w:t>มาตรา ๓๔๙</w:t>
       </w:r>
       <w:r>
-        <w:t xml:space="preserve">  ในการเลือกตั้งสมาชิกสภาผู้แทนราษฎรอันเป็นการเลือกตั้งทั่วไปครั้งแรกภายหลังการประกาศใช้รัฐธรรมนูญนี้ มิให้นำกำหนดเวลาตามมาตรา ๑๐๗ (๔) มาใช้บังคับ</w:t>
+        <w:t xml:space="preserve">  ในการเลือกตั้งสมาชิกสภาผู้แทนราษฎรอันเป็นการเลือกตั้งทั่วไปครั้งแรกภายหลังการประกาศใช้รัฐธรรมนูญนี้ มิให้นำกำหนดเวลาตามมาตรา ๑๐๘ (๔) มาใช้บังคับ</w:t>
       </w:r>
     </w:p>
     <w:p>
@@ -11542,7 +11542,7 @@
       <w:r>
         <w:t>(๒)</w:t>
         <w:tab/>
-        <w:t>การให้ผู้มีสิทธิเลือกตั้งตามมาตรา ๑๐๕ วรรคสอง ออกเสียงลงคะแนน</w:t>
+        <w:t>การให้ผู้มีสิทธิเลือกตั้งตามมาตรา ๑๐๖ วรรคสอง ออกเสียงลงคะแนน</w:t>
       </w:r>
     </w:p>
     <w:p>
@@ -12047,7 +12047,7 @@
       <w:r>
         <w:t>(๑๑)</w:t>
         <w:tab/>
-        <w:t>การดำเนินการตามมาตรา ๓๐๖ วรรคห้า เพื่อฟ้องคดี รวมทั้งอำนาจในการนำตัวผู้ถูกกล่าวหามาดำเนินคดีต่อไป</w:t>
+        <w:t>การดำเนินการตามมาตรา ๒๘๗ วรรคห้า เพื่อฟ้องคดี รวมทั้งอำนาจในการนำตัวผู้ถูกกล่าวหามาดำเนินคดีต่อไป</w:t>
       </w:r>
     </w:p>
     <w:p>
@@ -12132,7 +12132,7 @@
       <w:r>
         <w:t>(๕)</w:t>
         <w:tab/>
-        <w:t>การแต่งตั้งบุคคลให้ดำเนินคดีตามมาตรา ๓๐๖</w:t>
+        <w:t>การแต่งตั้งบุคคลให้ดำเนินคดีตามมาตรา ๒๘๗</w:t>
       </w:r>
     </w:p>
     <w:p>
@@ -12222,7 +12222,7 @@
       <w:r>
         <w:t>(๑)</w:t>
         <w:tab/>
-        <w:t>ให้ตรากฎหมายตามมาตรา ๖๘ มาตรา ๑๙๙ มาตรา ๒๐๐ มาตรา ๒๔๘ มาตรา ๒๗๐ มาตรา ๒๗๕ และมาตรา ๒๘๔ วรรคสองและวรรคสาม ให้แล้วเสร็จภายในสองปีนับแต่วันประกาศใช้รัฐธรรมนูญนี้</w:t>
+        <w:t>ให้ตรากฎหมายตามมาตรา ๖๙ มาตรา ๓๒๙ มาตรา ๓๓๐ มาตรา ๒๓๕ มาตรา ๒๕๗ มาตรา ๒๖๒ และมาตรา ๒๗๑ วรรคสองและวรรคสาม ให้แล้วเสร็จภายในสองปีนับแต่วันประกาศใช้รัฐธรรมนูญนี้</w:t>
       </w:r>
     </w:p>
     <w:p>
@@ -12242,7 +12242,7 @@
       <w:r>
         <w:t>(๓)</w:t>
         <w:tab/>
-        <w:t>ให้ดำเนินการจัดตั้งศาลปกครองตามมาตรา ๒๗๖ ให้แล้วเสร็จภายในสองปีนับแต่วันประกาศใช้รัฐธรรมนูญนี้</w:t>
+        <w:t>ให้ดำเนินการจัดตั้งศาลปกครองตามมาตรา ๒๖๓ ให้แล้วเสร็จภายในสองปีนับแต่วันประกาศใช้รัฐธรรมนูญนี้</w:t>
       </w:r>
     </w:p>
     <w:p>
@@ -12252,7 +12252,7 @@
       <w:r>
         <w:t>(๔)</w:t>
         <w:tab/>
-        <w:t>ให้ดำเนินการให้มีคณะผู้บริหารท้องถิ่นหรือผู้บริหารท้องถิ่นที่มาจากการเลือกตั้งโดยตรงของประชาชนหรือมาจากความเห็นชอบของสภาท้องถิ่นตามมาตรา ๒๘๕ วรรคสาม ให้ครบถ้วนภายในสองปีนับแต่วันประกาศใช้รัฐธรรมนูญนี้ ทั้งนี้ เว้นแต่เป็นกรณีตามมาตรา ๓๓๖ (๗)</w:t>
+        <w:t>ให้ดำเนินการให้มีคณะผู้บริหารท้องถิ่นหรือผู้บริหารท้องถิ่นที่มาจากการเลือกตั้งโดยตรงของประชาชนหรือมาจากความเห็นชอบของสภาท้องถิ่นตามมาตรา ๒๗๒ วรรคสาม ให้ครบถ้วนภายในสองปีนับแต่วันประกาศใช้รัฐธรรมนูญนี้ ทั้งนี้ เว้นแต่เป็นกรณีตามมาตรา ๓๕๙ (๗)</w:t>
       </w:r>
     </w:p>
     <w:p>
@@ -12287,7 +12287,7 @@
       <w:r>
         <w:t>(๒)</w:t>
         <w:tab/>
-        <w:t>มิให้นำบทบัญญัติมาตรา ๔๐ มาใช้บังคับ จนกว่าจะมีการตรากฎหมายอนุวัตการให้เป็นไปตามบทบัญญัติดังกล่าว ซึ่งต้องไม่เกินสามปีนับแต่วันประกาศใช้รัฐธรรมนูญนี้ ทั้งนี้ กฎหมายที่จะตราขึ้นจะต้องไม่กระทบกระเทือนถึงการอนุญาต สัมปทาน หรือสัญญา ซึ่งมีผลสมบูรณ์อยู่ในขณะที่กฎหมายดังกล่าวมีผลใช้บังคับ จนกว่าการอนุญาต สัมปทาน หรือสัญญานั้น จะสิ้นผล</w:t>
+        <w:t>มิให้นำบทบัญญัติมาตรา ๓๙ มาใช้บังคับ จนกว่าจะมีการตรากฎหมายอนุวัตการให้เป็นไปตามบทบัญญัติดังกล่าว ซึ่งต้องไม่เกินสามปีนับแต่วันประกาศใช้รัฐธรรมนูญนี้ ทั้งนี้ กฎหมายที่จะตราขึ้นจะต้องไม่กระทบกระเทือนถึงการอนุญาต สัมปทาน หรือสัญญา ซึ่งมีผลสมบูรณ์อยู่ในขณะที่กฎหมายดังกล่าวมีผลใช้บังคับ จนกว่าการอนุญาต สัมปทาน หรือสัญญานั้น จะสิ้นผล</w:t>
       </w:r>
     </w:p>
     <w:p>
@@ -12297,7 +12297,7 @@
       <w:r>
         <w:t>(๓)</w:t>
         <w:tab/>
-        <w:t>มิให้นำบทบัญญัติมาตรา ๔๓ วรรคหนึ่ง มาใช้บังคับ จนกว่าจะได้ดำเนินการให้เป็นไปตามบทบัญญัติดังกล่าว ซึ่งต้องไม่เกินห้าปีนับแต่วันประกาศใช้รัฐธรรมนูญนี้</w:t>
+        <w:t>มิให้นำบทบัญญัติมาตรา ๔๒ วรรคหนึ่ง มาใช้บังคับ จนกว่าจะได้ดำเนินการให้เป็นไปตามบทบัญญัติดังกล่าว ซึ่งต้องไม่เกินห้าปีนับแต่วันประกาศใช้รัฐธรรมนูญนี้</w:t>
       </w:r>
     </w:p>
     <w:p>
@@ -12307,7 +12307,7 @@
       <w:r>
         <w:t>(๔)</w:t>
         <w:tab/>
-        <w:t>มิให้นำบทบัญญัติมาตรา ๑๗๐ และมาตรา ๒๐๙ มาใช้บังคับ จนกว่าจะมีการตรากฎหมายอนุวัตการให้เป็นไปตามบทบัญญัติดังกล่าว ซึ่งต้องไม่เกินสองปีนับแต่วันประกาศใช้รัฐธรรมนูญนี้</w:t>
+        <w:t>มิให้นำบทบัญญัติมาตรา ๑๕๙ และมาตรา ๑๙๖ มาใช้บังคับ จนกว่าจะมีการตรากฎหมายอนุวัตการให้เป็นไปตามบทบัญญัติดังกล่าว ซึ่งต้องไม่เกินสองปีนับแต่วันประกาศใช้รัฐธรรมนูญนี้</w:t>
       </w:r>
     </w:p>
     <w:p>
@@ -12317,7 +12317,7 @@
       <w:r>
         <w:t>(๕)</w:t>
         <w:tab/>
-        <w:t>มิให้นำบทบัญญัติมาตรา ๒๓๖ และมาตรา ๒๔๙ วรรคสามและวรรคห้า มาใช้บังคับกับการพิจารณาคดีของศาลยุติธรรม และมิให้นำมาตรา ๒๗๓ วรรคสอง มาใช้บังคับกับคณะกรรมการตุลาการตามมาตรา ๓๑๙ แต่ทั้งนี้จะต้องดำเนินการเพื่อให้การเป็นไปตามบทบัญญัติดังกล่าว ซึ่งต้องไม่เกินห้าปีนับแต่วันประกาศใช้รัฐธรรมนูญนี้</w:t>
+        <w:t>มิให้นำบทบัญญัติมาตรา ๒๒๓ และมาตรา ๒๓๖ วรรคสามและวรรคห้า มาใช้บังคับกับการพิจารณาคดีของศาลยุติธรรม และมิให้นำมาตรา ๒๖๐ วรรคสอง มาใช้บังคับกับคณะกรรมการตุลาการตามมาตรา ๓๔๒ แต่ทั้งนี้จะต้องดำเนินการเพื่อให้การเป็นไปตามบทบัญญัติดังกล่าว ซึ่งต้องไม่เกินห้าปีนับแต่วันประกาศใช้รัฐธรรมนูญนี้</w:t>
       </w:r>
     </w:p>
     <w:p>
@@ -12327,7 +12327,7 @@
       <w:r>
         <w:t>(๖)</w:t>
         <w:tab/>
-        <w:t>มิให้นำบทบัญญัติมาตรา ๒๓๗ มาใช้บังคับ จนกว่าจะมีการแก้ไขเพิ่มเติมบทบัญญัติแห่งกฎหมายเพื่อให้การเป็นไปตามบทบัญญัติดังกล่าว ซึ่งต้องไม่เกินห้าปีนับแต่วันประกาศใช้รัฐธรรมนูญนี้</w:t>
+        <w:t>มิให้นำบทบัญญัติมาตรา ๒๒๔ มาใช้บังคับ จนกว่าจะมีการแก้ไขเพิ่มเติมบทบัญญัติแห่งกฎหมายเพื่อให้การเป็นไปตามบทบัญญัติดังกล่าว ซึ่งต้องไม่เกินห้าปีนับแต่วันประกาศใช้รัฐธรรมนูญนี้</w:t>
       </w:r>
     </w:p>
     <w:p>
@@ -12337,7 +12337,7 @@
       <w:r>
         <w:t>(๗)</w:t>
         <w:tab/>
-        <w:t>มิให้นำบทบัญญัติมาตรา ๒๘๕ วรรคสองและวรรคสาม มาใช้บังคับกับสมาชิกหรือผู้บริหารขององค์การบริหารส่วนตำบลซึ่งเป็นสมาชิกหรือผู้บริหารโดยตำแหน่ง และดำรงตำแหน่งอยู่ในวันประกาศใช้รัฐธรรมนูญนี้ จนกว่าจะครบวาระการดำรงตำแหน่งของสมาชิกซึ่งมาจากการเลือกตั้งของสภาองค์การบริหารส่วนตำบลดังกล่าว</w:t>
+        <w:t>มิให้นำบทบัญญัติมาตรา ๒๗๒ วรรคสองและวรรคสาม มาใช้บังคับกับสมาชิกหรือผู้บริหารขององค์การบริหารส่วนตำบลซึ่งเป็นสมาชิกหรือผู้บริหารโดยตำแหน่ง และดำรงตำแหน่งอยู่ในวันประกาศใช้รัฐธรรมนูญนี้ จนกว่าจะครบวาระการดำรงตำแหน่งของสมาชิกซึ่งมาจากการเลือกตั้งของสภาองค์การบริหารส่วนตำบลดังกล่าว</w:t>
       </w:r>
     </w:p>
     <w:p>
@@ -12347,7 +12347,7 @@
       <w:r>
         <w:t>(๘)</w:t>
         <w:tab/>
-        <w:t>มิให้นำบทบัญญัติมาตรา ๒๘๘ วรรคสอง มาใช้บังคับกับองค์ประกอบคณะกรรมการพนักงานส่วนท้องถิ่น จนกว่าจะมีการแก้ไขเพิ่มเติมหรือตรากฎหมายขึ้นใหม่เพื่ออนุวัตการให้เป็นไปตามบทบัญญัติดังกล่าว ซึ่งต้องไม่เกินสองปีนับแต่วันประกาศใช้รัฐธรรมนูญนี้</w:t>
+        <w:t>มิให้นำบทบัญญัติมาตรา ๒๗๕ วรรคสอง มาใช้บังคับกับองค์ประกอบคณะกรรมการพนักงานส่วนท้องถิ่น จนกว่าจะมีการแก้ไขเพิ่มเติมหรือตรากฎหมายขึ้นใหม่เพื่ออนุวัตการให้เป็นไปตามบทบัญญัติดังกล่าว ซึ่งต้องไม่เกินสองปีนับแต่วันประกาศใช้รัฐธรรมนูญนี้</w:t>
       </w:r>
     </w:p>
     <w:p>
@@ -12434,7 +12434,7 @@
         <w:t>มาตรา ๓๖๔</w:t>
       </w:r>
       <w:r>
-        <w:t xml:space="preserve">  ประชาชนในท้องถิ่นย่อมมีสิทธิร่วมกำหนดการใช้จ่ายงบประมาณขององค์กรปกครองส่วนท้องถิ่น โดยงบลงทุนไม่น้อยกว่าร้อยละสิบในแต่ละปีต้องจัดสรรตามผลการลงมติของที่ประชุมประชาคมหมู่บ้านหรือชุมชน</w:t>
+        <w:t xml:space="preserve">  นอกจากงบประมาณภาคประชาชนตามมาตรา ๓๐๔ แล้ว ประชาชนในท้องถิ่นย่อมมีสิทธิร่วมกำหนดการใช้จ่ายงบประมาณขององค์กรปกครองส่วนท้องถิ่นเอง โดยงบลงทุนไม่น้อยกว่าร้อยละสิบในแต่ละปีต้องจัดสรรตามผลการลงมติของที่ประชุมประชาคมหมู่บ้านหรือชุมชน</w:t>
       </w:r>
     </w:p>
     <w:p>
@@ -12599,7 +12599,7 @@
         <w:t>มาตรา ๓๗๕</w:t>
       </w:r>
       <w:r>
-        <w:t xml:space="preserve">  ให้ผู้ตรวจการแผ่นดินมีหน้าที่รับเรื่องคัดค้านโครงการตามมาตรา ๓๖๗ และมีอำนาจเสนอให้หน่วยงานเจ้าของโครงการระงับการดำเนินการไว้ก่อนจนกว่าจะมีการตรวจสอบข้อเท็จจริงแล้วเสร็จ</w:t>
+        <w:t xml:space="preserve">  ให้ผู้ตรวจการแผ่นดินของรัฐสภามีหน้าที่รับเรื่องคัดค้านโครงการตามมาตรา ๓๖๗ และมีอำนาจเสนอให้หน่วยงานเจ้าของโครงการระงับการดำเนินการไว้ก่อนจนกว่าจะมีการตรวจสอบข้อเท็จจริงแล้วเสร็จ</w:t>
       </w:r>
     </w:p>
     <w:p>
@@ -15899,7 +15899,7 @@
         <w:t>มาตรา ๕๙๑</w:t>
       </w:r>
       <w:r>
-        <w:t xml:space="preserve">  เด็กในความดูแลของรัฐย่อมมีสิทธิแสดงความคิดเห็นในเรื่องที่เกี่ยวกับตน และมีสิทธิร้องเรียนต่อผู้ตรวจการแผ่นดินโดยตรงโดยไม่ต้องผ่านผู้ดูแล</w:t>
+        <w:t xml:space="preserve">  เด็กในความดูแลของรัฐย่อมมีสิทธิแสดงความคิดเห็นในเรื่องที่เกี่ยวกับตน และมีสิทธิร้องเรียนต่อผู้ตรวจการแผ่นดินของรัฐสภาโดยตรงโดยไม่ต้องผ่านผู้ดูแล</w:t>
       </w:r>
     </w:p>
     <w:p>
@@ -17285,7 +17285,7 @@
         <w:t>มาตรา ๖๘๑</w:t>
       </w:r>
       <w:r>
-        <w:t xml:space="preserve">  รัฐต้องรับรองหลักการว่าผู้ดำรงตำแหน่งทางการเมืองตามมาตรา ๒๗๘ ผู้บริหารองค์กรอิสระ ตุลาการ และข้าราชการระดับสูง ต้องเปิดเผยบัญชีแสดงรายการทรัพย์สินและหนี้สินของตน คู่สมรส และบุตรที่ยังไม่บรรลุนิติภาวะต่อสาธารณะ ทั้งเมื่อเข้ารับตำแหน่ง ทุกปีระหว่างดำรงตำแหน่ง และเมื่อพ้นจากตำแหน่ง</w:t>
+        <w:t xml:space="preserve">  รัฐต้องรับรองหลักการว่า นอกจากการยื่นและเปิดเผยบัญชีตามมาตรา ๒๗๘ และมาตรา ๒๙๘ แล้ว ผู้ดำรงตำแหน่งทางการเมือง ผู้บริหารองค์กรอิสระ ตุลาการ และข้าราชการระดับสูง ต้องยื่นบัญชีแสดงรายการทรัพย์สินและหนี้สินของตน คู่สมรส และบุตรที่ยังไม่บรรลุนิติภาวะเพิ่มเติมเป็นประจำทุกปีระหว่างดำรงตำแหน่ง และบัญชีรายปีดังกล่าวต้องเปิดเผยต่อสาธารณะเช่นเดียวกัน</w:t>
       </w:r>
     </w:p>
     <w:p>
@@ -20840,7 +20840,7 @@
         <w:t>มาตรา ๙๑๔</w:t>
       </w:r>
       <w:r>
-        <w:t xml:space="preserve">  ให้ผู้ตรวจการแผ่นดินมีอำนาจตรวจสอบและเสนอให้ระงับโครงการที่ละเมิดสิทธิในเขตวัฒนธรรมพิเศษ หรือการจับกุมชาวบ้านที่ทำกินตามจารีตภายในเขตนั้น</w:t>
+        <w:t xml:space="preserve">  ให้ผู้ตรวจการแผ่นดินของรัฐสภามีอำนาจตรวจสอบและเสนอให้ระงับโครงการที่ละเมิดสิทธิในเขตวัฒนธรรมพิเศษ หรือการจับกุมชาวบ้านที่ทำกินตามจารีตภายในเขตนั้น</w:t>
       </w:r>
     </w:p>
     <w:p>
@@ -24032,7 +24032,7 @@
         <w:t>มาตรา ๑๑๒๒</w:t>
       </w:r>
       <w:r>
-        <w:t xml:space="preserve">  ให้ผู้ตรวจการแผ่นดินมีอำนาจไต่สวนเจ้าหน้าที่ของรัฐที่ถูกกล่าวหาว่ากระทำการตามมาตรา ๑๑๑๔ และส่งสำนวนให้ผู้บังคับบัญชาลงโทษทางวินัยภายในเวลาที่กำหนด และส่งให้อัยการสูงสุดฟ้องคดีอาญา</w:t>
+        <w:t xml:space="preserve">  ให้ผู้ตรวจการแผ่นดินของรัฐสภามีอำนาจไต่สวนเจ้าหน้าที่ของรัฐที่ถูกกล่าวหาว่ากระทำการตามมาตรา ๑๑๑๔ และส่งสำนวนให้ผู้บังคับบัญชาลงโทษทางวินัยภายในเวลาที่กำหนด และส่งให้อัยการสูงสุดฟ้องคดีอาญา</w:t>
       </w:r>
     </w:p>
     <w:p>
@@ -24272,7 +24272,7 @@
         <w:t>มาตรา ๑๑๓๘</w:t>
       </w:r>
       <w:r>
-        <w:t xml:space="preserve">  ผู้เสียหายย่อมมีสิทธิร้องเรียนต่อผู้ตรวจการแผ่นดินตามมาตรา ๑๑๒๒ หรือฟ้องคดีต่อศาลโดยตรง และมีสิทธิได้รับแจ้งความคืบหน้าของการดำเนินการ</w:t>
+        <w:t xml:space="preserve">  ผู้เสียหายย่อมมีสิทธิร้องเรียนต่อผู้ตรวจการแผ่นดินของรัฐสภาตามมาตรา ๑๑๒๒ หรือฟ้องคดีต่อศาลโดยตรง และมีสิทธิได้รับแจ้งความคืบหน้าของการดำเนินการ</w:t>
       </w:r>
     </w:p>
     <w:p>

</xml_diff>

<commit_message>
Promulgate the 2525 charter on 5 December 2525
The gazette header and "ตราไว้ ณ วันที่" now read ๕ ธันวาคม ๒๕๒๕, and the
preamble's lunar date is recomputed for that day: Sunday, แรม ๕ ค่ำ
เดือนอ้าย ปีจอ (สุนักขสมพัตสร มิคสิรมาส กาฬปักษ์ ปัญจมีดิถี ...
ปัญจมสุรทิน อาทิตยวาร). The old line was copied from the 2540 preamble.
build_charter_files.py's read-back check no longer hard-codes the old date.

Co-Authored-By: Claude Opus 5.5 <noreply@anthropic.com>
Claude-Session: https://claude.ai/code/session_01GWidoSqKEDFLRmf2kvfPx4
</commit_message>
<xml_diff>
--- a/files/รัฐธรรมนูญ_๒๕๒๕_แก้ไขเพิ่มเติม.docx
+++ b/files/รัฐธรรมนูญ_๒๕๒๕_แก้ไขเพิ่มเติม.docx
@@ -62,7 +62,7 @@
         <w:br/>
       </w:r>
       <w:r>
-        <w:t>ตราไว้ ณ วันที่ ๑๑ ตุลาคม พุทธศักราช ๒๕๒๕</w:t>
+        <w:t>ตราไว้ ณ วันที่ ๕ ธันวาคม พุทธศักราช ๒๕๒๕</w:t>
       </w:r>
     </w:p>
     <w:p>
@@ -70,7 +70,7 @@
         <w:pStyle w:val="ย่อหน้า"/>
       </w:pPr>
       <w:r>
-        <w:t>ศุภมัสดุ พระพุทธศาสนกาลเป็นอดีตภาค ๒๕๒๕ พรรษา ปัจจุบันสมัย จันทรคตินิยม พฤษภสมพัตสร อัสสยุชมาส ศุกลปักษ์ ทสมีดิถี สุริยคติกาล ตุลาคมมาส เอกาทสมสุรทิน โสรวาร โดยกาลบริเฉท</w:t>
+        <w:t>ศุภมัสดุ พระพุทธศาสนกาลเป็นอดีตภาค ๒๕๒๕ พรรษา ปัจจุบันสมัย จันทรคตินิยม สุนักขสมพัตสร มิคสิรมาส กาฬปักษ์ ปัญจมีดิถี สุริยคติกาล ธันวาคมมาส ปัญจมสุรทิน อาทิตยวาร โดยกาลบริเฉท</w:t>
       </w:r>
     </w:p>
     <w:p>
@@ -24671,7 +24671,7 @@
     </w:r>
     <w:r>
       <w:tab/>
-      <w:t>๑๑ ตุลาคม ๒๕๒๕</w:t>
+      <w:t>๕ ธันวาคม ๒๕๒๕</w:t>
     </w:r>
   </w:p>
 </w:hdr>

</xml_diff>

<commit_message>
Expelled MPs keep their seat, ม.๑๑๖๐ became the later article, PM 14 countersigns
- ม.๑๑๙ (๘): an MP expelled by the party keeps the seat by joining another
  party within 30 days; the 2737 defections (อะตอม, the 35 MPs of อุดมการณ์ใหม่,
  ทักษิณ) are now told as expulsions under that clause.
- ม.๑๑๖๐ is the article added after promulgation, in the time of PM 33; ม.๒๙๖
  belonged to the charter from the start, so round 5 passed 7 special articles.
- Promulgated 5 Dec 2525, in force from 1 Jan 2526; the countersignature names
  สุวัจน์ ลิปตพัลลภ.
- The card of ม.๑๑๕๙ was labelled "มาตรา ๑๑๖๐" (stray since ม.๒๙๖ was inserted).

Co-Authored-By: Claude Opus 5.5 <noreply@anthropic.com>
Claude-Session: https://claude.ai/code/session_01GWidoSqKEDFLRmf2kvfPx4
</commit_message>
<xml_diff>
--- a/files/รัฐธรรมนูญ_๒๕๒๕_แก้ไขเพิ่มเติม.docx
+++ b/files/รัฐธรรมนูญ_๒๕๒๕_แก้ไขเพิ่มเติม.docx
@@ -94,7 +94,7 @@
         <w:pStyle w:val="ย่อหน้า"/>
       </w:pPr>
       <w:r>
-        <w:t>จึงมีพระบรมราชโองการดำรัสเหนือเกล้าเหนือกระหม่อมให้ตรารัฐธรรมนูญแห่งราชอาณาจักรไทยฉบับนี้ขึ้นไว้ให้ใช้แทนรัฐธรรมนูญแห่งราชอาณาจักรไทย พุทธศักราช ๒๔๔๕ ซึ่งได้ตราไว้ ณ วันที่ ๙ ธันวาคม พุทธศักราช ๒๔๔๕ ตั้งแต่วันประกาศนี้เป็นต้นไป</w:t>
+        <w:t>จึงมีพระบรมราชโองการดำรัสเหนือเกล้าเหนือกระหม่อมให้ตรารัฐธรรมนูญแห่งราชอาณาจักรไทยฉบับนี้ขึ้นไว้ให้ใช้แทนรัฐธรรมนูญแห่งราชอาณาจักรไทย พุทธศักราช ๒๔๔๕ ซึ่งได้ตราไว้ ณ วันที่ ๙ ธันวาคม พุทธศักราช ๒๔๔๕ ตั้งแต่วันที่ ๑ มกราคม พุทธศักราช ๒๕๒๖ เป็นต้นไป</w:t>
       </w:r>
     </w:p>
     <w:p>
@@ -3297,7 +3297,7 @@
       <w:r>
         <w:t>(๘)</w:t>
         <w:tab/>
-        <w:t>ลาออกจากพรรคการเมืองที่ตนเป็นสมาชิก หรือพรรคการเมืองที่ตนเป็นสมาชิกมีมติด้วยคะแนนเสียงไม่น้อยกว่าสามในสี่ของที่ประชุมร่วมของคณะกรรมการบริหารของพรรคการเมืองและสมาชิกสภาผู้แทนราษฎรที่สังกัดพรรคการเมืองนั้น ให้พ้นจากการเป็นสมาชิกของพรรคการเมืองที่ตนเป็นสมาชิก ในกรณีเช่นนี้ ให้ถือว่าสิ้นสุดสมาชิกภาพนับแต่วันที่ลาออกหรือพรรคการเมืองมีมติ เว้นแต่สมาชิกสภาผู้แทนราษฎรผู้นั้นได้อุทธรณ์ต่อศาลรัฐธรรมนูญภายในสามสิบวันนับแต่วันที่พรรคการเมืองมีมติคัดค้านว่ามติดังกล่าวมีลักษณะตามมาตรา ๔๖ วรรคสาม ถ้าศาลรัฐธรรมนูญวินิจฉัยว่ามติดังกล่าวมิได้มีลักษณะตามมาตรา ๔๖ วรรคสาม ให้ถือว่าสมาชิกภาพสิ้นสุดลงนับแต่วันที่ศาลรัฐธรรมนูญวินิจฉัย แต่ถ้าศาลรัฐธรรมนูญวินิจฉัยว่ามติดังกล่าวมีลักษณะตามมาตรา ๔๖ วรรคสาม สมาชิกสภาผู้แทนราษฎรผู้นั้นอาจเข้าเป็นสมาชิกของพรรคการเมืองอื่นได้ภายในสามสิบวันนับแต่วันที่ศาลรัฐธรรมนูญวินิจฉัย</w:t>
+        <w:t>ลาออกจากพรรคการเมืองที่ตนเป็นสมาชิก ในกรณีเช่นนี้ ให้ถือว่าสิ้นสุดสมาชิกภาพนับแต่วันที่ลาออก หรือพรรคการเมืองที่ตนเป็นสมาชิกมีมติด้วยคะแนนเสียงไม่น้อยกว่าสามในสี่ของที่ประชุมร่วมของคณะกรรมการบริหารของพรรคการเมืองและสมาชิกสภาผู้แทนราษฎรที่สังกัดพรรคการเมืองนั้น ให้พ้นจากการเป็นสมาชิกของพรรคการเมืองที่ตนเป็นสมาชิก และสมาชิกสภาผู้แทนราษฎรผู้นั้นมิได้เข้าเป็นสมาชิกของพรรคการเมืองอื่นภายในสามสิบวันนับแต่วันที่พรรคการเมืองมีมติ ในกรณีเช่นนี้ ให้ถือว่าสิ้นสุดสมาชิกภาพนับแต่วันถัดจากวันที่ครบกำหนดสามสิบวันนั้น ทั้งนี้ สมาชิกสภาผู้แทนราษฎรผู้นั้นยังมีสิทธิอุทธรณ์ต่อศาลรัฐธรรมนูญภายในสามสิบวันนับแต่วันที่พรรคการเมืองมีมติ คัดค้านว่ามติดังกล่าวมีลักษณะตามมาตรา ๔๖ วรรคสาม</w:t>
       </w:r>
     </w:p>
     <w:p>
@@ -24624,6 +24624,18 @@
       </w:pPr>
       <w:r>
         <w:t>ผู้รับสนองพระบรมราชโองการ</w:t>
+      </w:r>
+    </w:p>
+    <w:p>
+      <w:pPr>
+        <w:pStyle w:val="ผู้รับสนอง"/>
+      </w:pPr>
+      <w:r>
+        <w:rPr>
+          <w:b/>
+          <w:bCs/>
+        </w:rPr>
+        <w:t>สุวัจน์ ลิปตพัลลภ</w:t>
       </w:r>
     </w:p>
     <w:p>

</xml_diff>

<commit_message>
Rebuild the charter Word/PDF/TOC with บทเฉพาะกาล before หมวดพิเศษ
Files regenerated from the site and verified character by character
(Word, print page and the 258-page PDF). The countersignature now stays
on the page of the last article instead of sitting alone; the build no
longer crashes on Windows when it looks for npm.

Co-Authored-By: Claude Opus 5.5 <noreply@anthropic.com>
</commit_message>
<xml_diff>
--- a/files/รัฐธรรมนูญ_๒๕๒๕_แก้ไขเพิ่มเติม.docx
+++ b/files/รัฐธรรมนูญ_๒๕๒๕_แก้ไขเพิ่มเติม.docx
@@ -16287,7 +16287,7 @@
         <w:t>มาตรา ๖๘๑</w:t>
       </w:r>
       <w:r>
-        <w:t xml:space="preserve">  ทรัพย์สินที่ริบคืนได้ตามหมวดนี้ให้นำเข้ากองทุนต่อต้านการทุจริตภาคประชาชนตามมาตรา ๑๑๓๕ เพื่อใช้ตามวัตถุประสงค์ของกองทุนนั้น</w:t>
+        <w:t xml:space="preserve">  ทรัพย์สินที่ริบคืนได้ตามหมวดนี้ให้นำเข้ากองทุนต่อต้านการทุจริตภาคประชาชนตามมาตรา ๑๑๕๘ เพื่อใช้ตามวัตถุประสงค์ของกองทุนนั้น</w:t>
       </w:r>
     </w:p>
     <w:p>
@@ -18273,7 +18273,7 @@
         <w:t>มาตรา ๘๑๑</w:t>
       </w:r>
       <w:r>
-        <w:t xml:space="preserve">  ผู้ใดร่วมวางแผน สนับสนุน หรือให้ความช่วยเหลือในการทำรัฐประหารหรือยกเลิกรัฐธรรมนูญ ให้ได้รับโทษตามมาตรา ๑๑๓๗ และผู้ที่แจ้งเหตุหรือปฏิเสธคำสั่งตามมาตรา ๗๗๙ ย่อมได้รับความคุ้มครองตามกฎหมายว่าด้วยการคุ้มครองผู้แจ้งเบาะแส</w:t>
+        <w:t xml:space="preserve">  ผู้ใดร่วมวางแผน สนับสนุน หรือให้ความช่วยเหลือในการทำรัฐประหารหรือยกเลิกรัฐธรรมนูญ ให้ได้รับโทษตามมาตรา ๑๑๖๐ และผู้ที่แจ้งเหตุหรือปฏิเสธคำสั่งตามมาตรา ๗๗๙ ย่อมได้รับความคุ้มครองตามกฎหมายว่าด้วยการคุ้มครองผู้แจ้งเบาะแส</w:t>
       </w:r>
     </w:p>
     <w:p>
@@ -22584,7 +22584,7 @@
         <w:t>มาตรา ๑๐๙๒</w:t>
       </w:r>
       <w:r>
-        <w:t xml:space="preserve">  รัฐต้องรับรองหลักการว่าผู้ก่อการ หัวหน้า และผู้สั่งการในการทำรัฐประหารหรือลบล้างรัฐธรรมนูญ ต้องระวางโทษตามมาตรา ๑๑๓๗ ส่วนผู้สนับสนุน ผู้ให้ความช่วยเหลือ และผู้ที่รับตำแหน่งจากคณะรัฐประหารโดยรู้ว่าเป็นการยึดอำนาจโดยมิชอบ ต้องระวางโทษจำคุกตลอดชีวิต</w:t>
+        <w:t xml:space="preserve">  รัฐต้องรับรองหลักการว่าผู้ก่อการ หัวหน้า และผู้สั่งการในการทำรัฐประหารหรือลบล้างรัฐธรรมนูญ ต้องระวางโทษตามมาตรา ๑๑๖๐ ส่วนผู้สนับสนุน ผู้ให้ความช่วยเหลือ และผู้ที่รับตำแหน่งจากคณะรัฐประหารโดยรู้ว่าเป็นการยึดอำนาจโดยมิชอบ ต้องระวางโทษจำคุกตลอดชีวิต</w:t>
       </w:r>
     </w:p>
     <w:p>
@@ -22854,7 +22854,7 @@
         <w:t>มาตรา ๑๑๑๐</w:t>
       </w:r>
       <w:r>
-        <w:t xml:space="preserve">  ทรัพย์สินที่ริบได้ตามมาตรา ๑๐๙๔ ให้นำเข้ากองทุนต่อต้านการทุจริตภาคประชาชนตามมาตรา ๑๑๓๕</w:t>
+        <w:t xml:space="preserve">  ทรัพย์สินที่ริบได้ตามมาตรา ๑๐๙๔ ให้นำเข้ากองทุนต่อต้านการทุจริตภาคประชาชนตามมาตรา ๑๑๕๘</w:t>
       </w:r>
     </w:p>
     <w:p>
@@ -22884,7 +22884,7 @@
         <w:t>มาตรา ๑๑๑๒</w:t>
       </w:r>
       <w:r>
-        <w:t xml:space="preserve">  เงินค่าเสียหายที่ได้รับชดใช้ตามมาตรา ๑๐๙๖ ในส่วนที่เกิดจากการทุจริต ให้นำเข้ากองทุนต่อต้านการทุจริตภาคประชาชนตามมาตรา ๑๑๓๕ เพื่อเยียวยาผู้ได้รับผลกระทบ</w:t>
+        <w:t xml:space="preserve">  เงินค่าเสียหายที่ได้รับชดใช้ตามมาตรา ๑๐๙๖ ในส่วนที่เกิดจากการทุจริต ให้นำเข้ากองทุนต่อต้านการทุจริตภาคประชาชนตามมาตรา ๑๑๕๘ เพื่อเยียวยาผู้ได้รับผลกระทบ</w:t>
       </w:r>
     </w:p>
     <w:p>
@@ -23147,11 +23147,7 @@
         <w:pStyle w:val="หมวด"/>
       </w:pPr>
       <w:r>
-        <w:t>หมวดพิเศษ</w:t>
-        <w:br/>
-      </w:r>
-      <w:r>
-        <w:t>อำนาจสูงสุดพิทักษ์ประชาชน (The Supreme People's Power)</w:t>
+        <w:t>บทเฉพาะกาล</w:t>
       </w:r>
     </w:p>
     <w:p>
@@ -23166,7 +23162,15 @@
         <w:t>มาตรา ๑๑๓๐</w:t>
       </w:r>
       <w:r>
-        <w:t xml:space="preserve">  สภาประชาชนสูงสุด (Supreme Citizen Assembly): ให้มีสภาประชาชนสูงสุดประกอบด้วยประชาชนที่ได้จากการสุ่มเลือก (Sortition) จำนวนห้าร้อยคน หมุนเวียนวาระละหนึ่งปี มีอำนาจในฐานะตัวแทนปวงชนชาวไทยโดยตรง สภานี้มีอำนาจยับยั้ง (Veto) กฎหมาย มติคณะรัฐมนตรี หรือคำพิพากษาศาลฎีกาที่ขัดต่อประโยชน์สาธารณะได้</w:t>
+        <w:t xml:space="preserve">  ให้คณะองคมนตรีซึ่งดำรงตำแหน่งอยู่ในวันประกาศใช้รัฐธรรมนูญนี้ เป็นคณะองคมนตรีตามบทบัญญัติแห่งรัฐธรรมนูญนี้</w:t>
+      </w:r>
+    </w:p>
+    <w:p>
+      <w:pPr>
+        <w:pStyle w:val="วรรค"/>
+      </w:pPr>
+      <w:r>
+        <w:t>ในระหว่างที่สมาชิกภาพของสมาชิกวุฒิสภาสิ้นสุดลงพร้อมกันทั้งหมดตามมาตรา ๑๑๓๙ ให้ประธานองคมนตรีทำหน้าที่คณะองคมนตรีด้วย และให้คณะองคมนตรีที่เหลืออยู่ทำหน้าที่รัฐสภาตามมาตรา ๑๙ มาตรา ๒๑ มาตรา ๒๒ มาตรา ๒๓ และมิให้นำมาตรา ๒๐ วรรคสาม และมาตรา ๒๔ วรรคสาม มาใช้บังคับ และให้คณะองคมนตรีเลือกองคมนตรีคนหนึ่งขึ้นทำหน้าที่ประธานเป็นการชั่วคราว</w:t>
       </w:r>
     </w:p>
     <w:p>
@@ -23181,120 +23185,7 @@
         <w:t>มาตรา ๑๑๓๑</w:t>
       </w:r>
       <w:r>
-        <w:t xml:space="preserve">  ระบบประชาธิปไตยทางตรงดิจิทัล: รัฐต้องจัดตั้งระบบออกเสียงผ่านแอปพลิเคชันที่มีความปลอดภัยสูงสุด ให้ประชาชนทุกคนสามารถเสนอกฎหมายและร่วมโหวตผ่านโทรศัพท์มือถือได้ หากกฎหมายใดที่ประชาชนโหวตเห็นชอบเกินกึ่งหนึ่งของผู้มีสิทธิเลือกตั้งทั้งประเทศ ให้มีผลบังคับใช้เป็นกฎหมายทันทีโดยไม่ต้องผ่านรัฐสภา</w:t>
-      </w:r>
-    </w:p>
-    <w:p>
-      <w:pPr>
-        <w:pStyle w:val="มาตรา"/>
-      </w:pPr>
-      <w:r>
-        <w:rPr>
-          <w:b/>
-          <w:bCs/>
-        </w:rPr>
-        <w:t>มาตรา ๑๑๓๒</w:t>
-      </w:r>
-      <w:r>
-        <w:t xml:space="preserve">  การถอดถอนข้าราชการระดับสูง: สิทธิในการถอดถอน (Recall)ถอดถอนผู้แทนราษฎรหรือผู้ดำรงตำแหน่งทางการเมือง มิได้จำกัดเพียงแค่นักการเมือง ประชาชนจำนวนหนึ่งหมื่นคนสามารถเข้าชื่อเพื่อจัดให้มีการลงประชามติถอดถอน ผู้พิพากษา อัยการสูงสุด ผบ.ตร. ผบ.ทบ. หรือข้าราชการระดับปลัดกระทรวง ได้ทุกเมื่อหากพบว่าทุจริตหรือปฏิบัติหน้าที่โดยมิชอบ</w:t>
-      </w:r>
-    </w:p>
-    <w:p>
-      <w:pPr>
-        <w:pStyle w:val="มาตรา"/>
-      </w:pPr>
-      <w:r>
-        <w:rPr>
-          <w:b/>
-          <w:bCs/>
-        </w:rPr>
-        <w:t>มาตรา ๑๑๓๓</w:t>
-      </w:r>
-      <w:r>
-        <w:t xml:space="preserve">  รายได้พื้นฐานถ้วนหน้า (Universal Basic Income - UBI): รัฐต้องประกันรายได้พื้นฐานให้แก่ประชาชนชาวไทยทุกคนตั้งแต่เกิดจนตาย ในอัตราไม่ต่ำกว่าเส้นความยากจน โดยห้ามนำข้ออ้างด้านงบประมาณมาลิดรอนสิทธินี้</w:t>
-      </w:r>
-    </w:p>
-    <w:p>
-      <w:pPr>
-        <w:pStyle w:val="มาตรา"/>
-      </w:pPr>
-      <w:r>
-        <w:rPr>
-          <w:b/>
-          <w:bCs/>
-        </w:rPr>
-        <w:t>มาตรา ๑๑๓๔</w:t>
-      </w:r>
-      <w:r>
-        <w:t xml:space="preserve">  สิทธิการเข้าควบคุมกิจการ (Worker's Control): ในกรณีที่กลุ่มทุนขนาดใหญ่หรือองค์กรเอกชนกระทำการเอาเปรียบประชาชนอย่างร้ายแรง สหภาพแรงงานและสมาคมผู้บริโภคมีสิทธิเข้าควบคุมและยึดกิจการนั้นมาดำเนินการในรูปแบบสหกรณ์ที่ประชาชนเป็นเจ้าของร่วมกันได้</w:t>
-      </w:r>
-    </w:p>
-    <w:p>
-      <w:pPr>
-        <w:pStyle w:val="มาตรา"/>
-      </w:pPr>
-      <w:r>
-        <w:rPr>
-          <w:b/>
-          <w:bCs/>
-        </w:rPr>
-        <w:t>มาตรา ๑๑๓๕</w:t>
-      </w:r>
-      <w:r>
-        <w:t xml:space="preserve">  กองทุนต่อต้านการทุจริตภาคประชาชน: ทรัพย์สินที่ยึดได้จากนักการเมืองและข้าราชการที่ทุจริตทั้งหมด ต้องถูกนำเข้ากองทุนนี้ และให้สภาประชาชนสูงสุดเป็นผู้จัดสรรเพื่อนำไปใช้เยียวยาผู้ได้รับผลกระทบ หรือลงทุนในโครงสร้างพื้นฐานของชุมชนท้องถิ่น</w:t>
-      </w:r>
-    </w:p>
-    <w:p>
-      <w:pPr>
-        <w:pStyle w:val="มาตรา"/>
-      </w:pPr>
-      <w:r>
-        <w:rPr>
-          <w:b/>
-          <w:bCs/>
-        </w:rPr>
-        <w:t>มาตรา ๑๑๓๖</w:t>
-      </w:r>
-      <w:r>
-        <w:t xml:space="preserve">  บทสรุปแห่งความศักดิ์สิทธิ์: รัฐธรรมนูญฉบับนี้ร่างขึ้นจากเจตจำนงของประชาชน การตีความเพื่อลดทอนสิทธิและอำนาจของประชาชนตามรัฐธรรมนูญนี้ จะกระทำมิได้โดยเด็ดขาด องค์กรหรือบุคคลใดฝ่าฝืน ให้ถือว่าเป็นการทรยศต่อชาติและประชาชน</w:t>
-      </w:r>
-    </w:p>
-    <w:p>
-      <w:pPr>
-        <w:pStyle w:val="มาตรา"/>
-      </w:pPr>
-      <w:r>
-        <w:rPr>
-          <w:b/>
-          <w:bCs/>
-        </w:rPr>
-        <w:t>มาตรา ๑๑๓๗</w:t>
-      </w:r>
-      <w:r>
-        <w:t xml:space="preserve">  ข้อห้ามในการยกเลิกรัฐธรรมนูญและความผิดฐานกบฏแผ่นดิน: รัฐธรรมนูญฉบับนี้ไม่สามารถยกเลิกได้หากไม่ผ่านความเห็นชอบของประชาชนผ่านการออกเสียงประชามติ ไม่มีอำนาจหรือคณะบุคคลใดๆ ที่จะมีอำนาจยกเลิกรัฐธรรมนูญนี้ได้ ยกเว้นอำนาจของประชาชนผ่านการออกเสียงประชามติเท่านั้น ในกรณีที่คณะรัฐประหารหรือคณะบุคคลใดประกาศยกเลิกหรือลบล้างรัฐธรรมนูญนี้ ให้ถือว่าสมาชิกคณะบุคคลหรือคณะรัฐประหารดังกล่าวทั้งหมดมีความผิดฐานเป็นกบฏแผ่นดิน มีโทษสูงสุดโดยไม่มีอายุความ และห้ามมิให้มีการนิรโทษกรรมแก่คณะบุคคลดังกล่าวไม่ว่าด้วยวิธีการหรือทางใดๆ ก็ตาม ในกรณีที่คณะรัฐประหารคุมอำนาจไว้และทำการยกเลิกหรือเปลี่ยนแปลงรัฐธรรมนูญนี้จนทำให้บทบัญญัติการป้องกันไม่สามารถใช้บังคับได้ในทางปฏิบัติ เมื่อคณะรัฐประหารดังกล่าวพ้นจากอำนาจลงไม่ว่าในเวลาใด ให้ถือว่ารัฐธรรมนูญฉบับอื่นใดที่ถูกร่างขึ้นใหม่ในช่วงเวลาดังกล่าวไม่ว่าจะเป็นฉบับชั่วคราวหรือถาวรเป็นโมฆะและไม่มีผลบังคับใช้ โดยให้รัฐธรรมนูญฉบับนี้มีผลบังคับใช้กลับคืนมาโดยอัตโนมัติในฐานะกฎหมายสูงสุดของประเทศทันที สำหรับความผิดฐานกบฏแผ่นดินจากการยกเลิกหรือล้มล้างรัฐธรรมนูญนี้ ให้ถือว่าผู้กระทำความผิดเป็นอาชญากรข้ามชาติ หากหลบหนีออกนอกราชอาณาจักรให้ดำเนินการตามล่าตัวและส่งตัวกลับเพื่อดำเนินคดีจนกว่าจะเสียชีวิต โดยมีโทษทางอาญาในการล้มล้างหรือยกเลิกรัฐธรรมนูญนี้คือประหารชีวิตสถานเดียว เว้นแต่จะมีหลักฐานแน่ชัดว่ากระทำไปเนื่องจากถูกบังคับหรือข่มขู่ ให้ลดโทษลงเป็นจำคุกห้าสิบปี</w:t>
-      </w:r>
-    </w:p>
-    <w:p>
-      <w:pPr>
-        <w:pStyle w:val="หมวด"/>
-      </w:pPr>
-      <w:r>
-        <w:t>บทเฉพาะกาล</w:t>
-      </w:r>
-    </w:p>
-    <w:p>
-      <w:pPr>
-        <w:pStyle w:val="มาตรา"/>
-      </w:pPr>
-      <w:r>
-        <w:rPr>
-          <w:b/>
-          <w:bCs/>
-        </w:rPr>
-        <w:t>มาตรา ๑๑๓๘</w:t>
-      </w:r>
-      <w:r>
-        <w:t xml:space="preserve">  ให้คณะองคมนตรีซึ่งดำรงตำแหน่งอยู่ในวันประกาศใช้รัฐธรรมนูญนี้ เป็นคณะองคมนตรีตามบทบัญญัติแห่งรัฐธรรมนูญนี้</w:t>
+        <w:t xml:space="preserve">  นับแต่วันประกาศใช้รัฐธรรมนูญนี้ ให้สภาผู้แทนราษฎรตามรัฐธรรมนูญแห่งราชอาณาจักรไทย พุทธศักราช ๒๔๔๕ ซึ่งแก้ไขเพิ่มเติมครั้งสุดท้ายโดยรัฐธรรมนูญแห่งราชอาณาจักรไทย แก้ไขเพิ่มเติม (ฉบับที่ ๖) พุทธศักราช ๒๔๔๕ ทำหน้าที่สภาผู้แทนราษฎรตามรัฐธรรมนูญนี้จนถึงวันเลือกตั้งสมาชิกสภาผู้แทนราษฎรตามมาตรา ๑๑๔๐ และให้วุฒิสภาตามรัฐธรรมนูญแห่งราชอาณาจักรไทย พุทธศักราช ๒๔๔๕ ซึ่งแก้ไขเพิ่มเติมครั้งสุดท้ายโดยรัฐธรรมนูญแห่งราชอาณาจักรไทย แก้ไขเพิ่มเติม (ฉบับที่ ๖) พุทธศักราช ๒๔๔๕ ทำหน้าที่วุฒิสภาตามรัฐธรรมนูญนี้ จนถึงวันที่ครบสี่ปีนับแต่วันที่พระมหากษัตริย์ทรงแต่งตั้งสมาชิกวุฒิสภาตามวรรคห้า (๑) หรือวันเลือกตั้งสมาชิกวุฒิสภาตามวรรคห้า (๒) แล้วแต่กรณี</w:t>
       </w:r>
     </w:p>
     <w:p>
@@ -23302,22 +23193,7 @@
         <w:pStyle w:val="วรรค"/>
       </w:pPr>
       <w:r>
-        <w:t>ในระหว่างที่สมาชิกภาพของสมาชิกวุฒิสภาสิ้นสุดลงพร้อมกันทั้งหมดตามมาตรา ๑๑๔๗ ให้ประธานองคมนตรีทำหน้าที่คณะองคมนตรีด้วย และให้คณะองคมนตรีที่เหลืออยู่ทำหน้าที่รัฐสภาตามมาตรา ๑๙ มาตรา ๒๑ มาตรา ๒๒ มาตรา ๒๓ และมิให้นำมาตรา ๒๐ วรรคสาม และมาตรา ๒๔ วรรคสาม มาใช้บังคับ และให้คณะองคมนตรีเลือกองคมนตรีคนหนึ่งขึ้นทำหน้าที่ประธานเป็นการชั่วคราว</w:t>
-      </w:r>
-    </w:p>
-    <w:p>
-      <w:pPr>
-        <w:pStyle w:val="มาตรา"/>
-      </w:pPr>
-      <w:r>
-        <w:rPr>
-          <w:b/>
-          <w:bCs/>
-        </w:rPr>
-        <w:t>มาตรา ๑๑๓๙</w:t>
-      </w:r>
-      <w:r>
-        <w:t xml:space="preserve">  นับแต่วันประกาศใช้รัฐธรรมนูญนี้ ให้สภาผู้แทนราษฎรตามรัฐธรรมนูญแห่งราชอาณาจักรไทย พุทธศักราช ๒๔๔๕ ซึ่งแก้ไขเพิ่มเติมครั้งสุดท้ายโดยรัฐธรรมนูญแห่งราชอาณาจักรไทย แก้ไขเพิ่มเติม (ฉบับที่ ๖) พุทธศักราช ๒๔๔๕ ทำหน้าที่สภาผู้แทนราษฎรตามรัฐธรรมนูญนี้จนถึงวันเลือกตั้งสมาชิกสภาผู้แทนราษฎรตามมาตรา ๑๑๔๘ และให้วุฒิสภาตามรัฐธรรมนูญแห่งราชอาณาจักรไทย พุทธศักราช ๒๔๔๕ ซึ่งแก้ไขเพิ่มเติมครั้งสุดท้ายโดยรัฐธรรมนูญแห่งราชอาณาจักรไทย แก้ไขเพิ่มเติม (ฉบับที่ ๖) พุทธศักราช ๒๔๔๕ ทำหน้าที่วุฒิสภาตามรัฐธรรมนูญนี้ จนถึงวันที่ครบสี่ปีนับแต่วันที่พระมหากษัตริย์ทรงแต่งตั้งสมาชิกวุฒิสภาตามวรรคห้า (๑) หรือวันเลือกตั้งสมาชิกวุฒิสภาตามวรรคห้า (๒) แล้วแต่กรณี</w:t>
+        <w:t>ให้สมาชิกสภาผู้แทนราษฎรซึ่งดำรงตำแหน่งอยู่ในวันประกาศใช้รัฐธรรมนูญนี้ คงเป็นสมาชิกสภาผู้แทนราษฎรตามบทบัญญัติแห่งรัฐธรรมนูญนี้อยู่ต่อไปจนครบอายุของสภาผู้แทนราษฎร หรือเมื่อมีการยุบสภา หรือเมื่อสมาชิกภาพสิ้นสุดลงตามมาตรา ๑๑๓๙ แล้วแต่กรณี ในกรณีที่ตำแหน่งสมาชิกสภาผู้แทนราษฎรว่างลงไม่ว่าด้วยเหตุใด ๆ ให้สภาผู้แทนราษฎรประกอบด้วยสมาชิกสภาผู้แทนราษฎรเท่าที่มีอยู่</w:t>
       </w:r>
     </w:p>
     <w:p>
@@ -23325,15 +23201,7 @@
         <w:pStyle w:val="วรรค"/>
       </w:pPr>
       <w:r>
-        <w:t>ให้สมาชิกสภาผู้แทนราษฎรซึ่งดำรงตำแหน่งอยู่ในวันประกาศใช้รัฐธรรมนูญนี้ คงเป็นสมาชิกสภาผู้แทนราษฎรตามบทบัญญัติแห่งรัฐธรรมนูญนี้อยู่ต่อไปจนครบอายุของสภาผู้แทนราษฎร หรือเมื่อมีการยุบสภา หรือเมื่อสมาชิกภาพสิ้นสุดลงตามมาตรา ๑๑๔๗ แล้วแต่กรณี ในกรณีที่ตำแหน่งสมาชิกสภาผู้แทนราษฎรว่างลงไม่ว่าด้วยเหตุใด ๆ ให้สภาผู้แทนราษฎรประกอบด้วยสมาชิกสภาผู้แทนราษฎรเท่าที่มีอยู่</w:t>
-      </w:r>
-    </w:p>
-    <w:p>
-      <w:pPr>
-        <w:pStyle w:val="วรรค"/>
-      </w:pPr>
-      <w:r>
-        <w:t>ให้สมาชิกวุฒิสภาซึ่งดำรงตำแหน่งอยู่ในวันประกาศใช้รัฐธรรมนูญนี้ คงเป็นสมาชิกวุฒิสภาตามบทบัญญัติแห่งรัฐธรรมนูญนี้จนกว่าสมาชิกภาพของสมาชิกวุฒิสภาจะสิ้นสุดลงตามรัฐธรรมนูญแห่งราชอาณาจักรไทย พุทธศักราช ๒๔๔๕ ซึ่งแก้ไขเพิ่มเติมครั้งสุดท้ายโดยรัฐธรรมนูญแห่งราชอาณาจักรไทย แก้ไขเพิ่มเติม (ฉบับที่ ๖) พุทธศักราช ๒๔๔๕ หรือสมาชิกภาพของสมาชิกวุฒิสภาสิ้นสุดลงตามมาตรา ๑๑๔๗ แล้วแต่กรณี ในกรณีที่ตำแหน่งสมาชิกวุฒิสภาว่างลงไม่ว่าด้วยเหตุใด ๆ ให้วุฒิสภาประกอบด้วยสมาชิกวุฒิสภาเท่าที่มีอยู่</w:t>
+        <w:t>ให้สมาชิกวุฒิสภาซึ่งดำรงตำแหน่งอยู่ในวันประกาศใช้รัฐธรรมนูญนี้ คงเป็นสมาชิกวุฒิสภาตามบทบัญญัติแห่งรัฐธรรมนูญนี้จนกว่าสมาชิกภาพของสมาชิกวุฒิสภาจะสิ้นสุดลงตามรัฐธรรมนูญแห่งราชอาณาจักรไทย พุทธศักราช ๒๔๔๕ ซึ่งแก้ไขเพิ่มเติมครั้งสุดท้ายโดยรัฐธรรมนูญแห่งราชอาณาจักรไทย แก้ไขเพิ่มเติม (ฉบับที่ ๖) พุทธศักราช ๒๔๔๕ หรือสมาชิกภาพของสมาชิกวุฒิสภาสิ้นสุดลงตามมาตรา ๑๑๓๙ แล้วแต่กรณี ในกรณีที่ตำแหน่งสมาชิกวุฒิสภาว่างลงไม่ว่าด้วยเหตุใด ๆ ให้วุฒิสภาประกอบด้วยสมาชิกวุฒิสภาเท่าที่มีอยู่</w:t>
       </w:r>
     </w:p>
     <w:p>
@@ -23369,7 +23237,7 @@
       <w:r>
         <w:t>(๒)</w:t>
         <w:tab/>
-        <w:t>ในกรณีที่สมาชิกภาพของสมาชิกวุฒิสภาสิ้นสุดลงตามมาตรา ๑๑๔๗ ให้ดำเนินการเลือกตั้งตามกฎหมายประกอบรัฐธรรมนูญว่าด้วยการเลือกตั้งสมาชิกสภาผู้แทนราษฎรและสมาชิกวุฒิสภา แต่ถ้ายังไม่มีกฎหมายดังกล่าว ให้นำกฎหมายว่าด้วยการเลือกตั้งสมาชิกสภาผู้แทนราษฎรซึ่งมีผลใช้บังคับอยู่ในวันประกาศใช้รัฐธรรมนูญนี้ เท่าที่ไม่ขัดหรือแย้งต่อรัฐธรรมนูญนี้ มาใช้บังคับกับการเลือกตั้งสมาชิกวุฒิสภาด้วย โดยให้ใช้คำว่า “สมาชิกวุฒิสภา” แทนคำว่า “สมาชิกสภาผู้แทนราษฎร” ทุกแห่งและให้ประธานกรรมการการเลือกตั้งที่ตั้งขึ้นตามมาตรา ๑๑๔๓ เป็นผู้รักษาการตามกฎหมายดังกล่าว และในกรณีที่คณะกรรมการการเลือกตั้งเห็นว่าบทบัญญัติใดของกฎหมายว่าด้วยการเลือกตั้งสมาชิกสภาผู้แทนราษฎรขัดหรือแย้งหรือไม่สอดคล้องกับรัฐธรรมนูญนี้ คณะกรรมการการเลือกตั้งมีอำนาจกำหนดระเบียบที่จำเป็นขึ้นใช้แทนบทบัญญัตินั้นได้เพื่อให้การเลือกตั้งเป็นไปโดยสุจริตและเที่ยงธรรม ระเบียบดังกล่าวและความเห็นที่ว่าบทบัญญัติแห่งกฎหมายดังกล่าวนั้นขัดหรือแย้งหรือไม่สอดคล้องกับรัฐธรรมนูญนี้ ให้ส่งศาลรัฐธรรมนูญพิจารณาความชอบด้วยรัฐธรรมนูญก่อนประกาศใช้ในราชกิจจานุเบกษา</w:t>
+        <w:t>ในกรณีที่สมาชิกภาพของสมาชิกวุฒิสภาสิ้นสุดลงตามมาตรา ๑๑๓๙ ให้ดำเนินการเลือกตั้งตามกฎหมายประกอบรัฐธรรมนูญว่าด้วยการเลือกตั้งสมาชิกสภาผู้แทนราษฎรและสมาชิกวุฒิสภา แต่ถ้ายังไม่มีกฎหมายดังกล่าว ให้นำกฎหมายว่าด้วยการเลือกตั้งสมาชิกสภาผู้แทนราษฎรซึ่งมีผลใช้บังคับอยู่ในวันประกาศใช้รัฐธรรมนูญนี้ เท่าที่ไม่ขัดหรือแย้งต่อรัฐธรรมนูญนี้ มาใช้บังคับกับการเลือกตั้งสมาชิกวุฒิสภาด้วย โดยให้ใช้คำว่า “สมาชิกวุฒิสภา” แทนคำว่า “สมาชิกสภาผู้แทนราษฎร” ทุกแห่งและให้ประธานกรรมการการเลือกตั้งที่ตั้งขึ้นตามมาตรา ๑๑๓๕ เป็นผู้รักษาการตามกฎหมายดังกล่าว และในกรณีที่คณะกรรมการการเลือกตั้งเห็นว่าบทบัญญัติใดของกฎหมายว่าด้วยการเลือกตั้งสมาชิกสภาผู้แทนราษฎรขัดหรือแย้งหรือไม่สอดคล้องกับรัฐธรรมนูญนี้ คณะกรรมการการเลือกตั้งมีอำนาจกำหนดระเบียบที่จำเป็นขึ้นใช้แทนบทบัญญัตินั้นได้เพื่อให้การเลือกตั้งเป็นไปโดยสุจริตและเที่ยงธรรม ระเบียบดังกล่าวและความเห็นที่ว่าบทบัญญัติแห่งกฎหมายดังกล่าวนั้นขัดหรือแย้งหรือไม่สอดคล้องกับรัฐธรรมนูญนี้ ให้ส่งศาลรัฐธรรมนูญพิจารณาความชอบด้วยรัฐธรรมนูญก่อนประกาศใช้ในราชกิจจานุเบกษา</w:t>
       </w:r>
     </w:p>
     <w:p>
@@ -23377,19 +23245,19 @@
         <w:pStyle w:val="วรรค"/>
       </w:pPr>
       <w:r>
-        <w:t>การเลือกตั้งสมาชิกวุฒิสภาตาม (๒) ให้กระทำภายในเก้าสิบวันนับแต่วันครบสองร้อยสี่สิบวันนับแต่วันประกาศใช้รัฐธรรมนูญนี้ และมิให้ดำเนินการเลือกตั้งในวันเดียวกันกับการเลือกตั้งสมาชิกสภาผู้แทนราษฎรตามมาตรา ๑๑๔๘</w:t>
-      </w:r>
-    </w:p>
-    <w:p>
-      <w:pPr>
-        <w:pStyle w:val="มาตรา"/>
-      </w:pPr>
-      <w:r>
-        <w:rPr>
-          <w:b/>
-          <w:bCs/>
-        </w:rPr>
-        <w:t>มาตรา ๑๑๔๐</w:t>
+        <w:t>การเลือกตั้งสมาชิกวุฒิสภาตาม (๒) ให้กระทำภายในเก้าสิบวันนับแต่วันครบสองร้อยสี่สิบวันนับแต่วันประกาศใช้รัฐธรรมนูญนี้ และมิให้ดำเนินการเลือกตั้งในวันเดียวกันกับการเลือกตั้งสมาชิกสภาผู้แทนราษฎรตามมาตรา ๑๑๔๐</w:t>
+      </w:r>
+    </w:p>
+    <w:p>
+      <w:pPr>
+        <w:pStyle w:val="มาตรา"/>
+      </w:pPr>
+      <w:r>
+        <w:rPr>
+          <w:b/>
+          <w:bCs/>
+        </w:rPr>
+        <w:t>มาตรา ๑๑๓๒</w:t>
       </w:r>
       <w:r>
         <w:t xml:space="preserve">  ให้ประธานสภาผู้แทนราษฎร รองประธานสภาผู้แทนราษฎร และผู้นำฝ่ายค้านในสภาผู้แทนราษฎร ซึ่งดำรงตำแหน่งอยู่ในวันประกาศใช้รัฐธรรมนูญนี้ คงเป็นประธานสภาผู้แทนราษฎร รองประธานสภาผู้แทนราษฎร และผู้นำฝ่ายค้านในสภาผู้แทนราษฎร ตามบทบัญญัติแห่งรัฐธรรมนูญนี้</w:t>
@@ -23400,7 +23268,7 @@
         <w:pStyle w:val="วรรค"/>
       </w:pPr>
       <w:r>
-        <w:t>ให้ประธานวุฒิสภาและรองประธานวุฒิสภาซึ่งดำรงตำแหน่งอยู่ในวันประกาศใช้รัฐธรรมนูญนี้ คงเป็นประธานวุฒิสภาและรองประธานวุฒิสภาตามบทบัญญัติแห่งรัฐธรรมนูญนี้ จนกว่าอายุของวุฒิสภาตามมาตรา ๑๑๓๙ จะสิ้นสุดลงหรือพ้นจากตำแหน่งก่อนถึงวาระตามมาตรา ๑๑๔๗</w:t>
+        <w:t>ให้ประธานวุฒิสภาและรองประธานวุฒิสภาซึ่งดำรงตำแหน่งอยู่ในวันประกาศใช้รัฐธรรมนูญนี้ คงเป็นประธานวุฒิสภาและรองประธานวุฒิสภาตามบทบัญญัติแห่งรัฐธรรมนูญนี้ จนกว่าอายุของวุฒิสภาตามมาตรา ๑๑๓๑ จะสิ้นสุดลงหรือพ้นจากตำแหน่งก่อนถึงวาระตามมาตรา ๑๑๓๙</w:t>
       </w:r>
     </w:p>
     <w:p>
@@ -23426,7 +23294,7 @@
       <w:r>
         <w:t>(๑)</w:t>
         <w:tab/>
-        <w:t>เมื่อสภาผู้แทนราษฎรตามมาตรา ๑๑๓๙ วรรคหนึ่ง สิ้นอายุหรือถูกยุบ หรือเป็นกรณีตามมาตรา ๑๑๔๗</w:t>
+        <w:t>เมื่อสภาผู้แทนราษฎรตามมาตรา ๑๑๓๑ วรรคหนึ่ง สิ้นอายุหรือถูกยุบ หรือเป็นกรณีตามมาตรา ๑๑๓๙</w:t>
       </w:r>
     </w:p>
     <w:p>
@@ -23458,7 +23326,7 @@
           <w:b/>
           <w:bCs/>
         </w:rPr>
-        <w:t>มาตรา ๑๑๔๑</w:t>
+        <w:t>มาตรา ๑๑๓๓</w:t>
       </w:r>
       <w:r>
         <w:t xml:space="preserve">  ให้คณะรัฐมนตรีที่บริหารราชการแผ่นดินอยู่ในวันประกาศใช้รัฐธรรมนูญนี้ คงเป็นคณะรัฐมนตรีตามบทบัญญัติแห่งรัฐธรรมนูญนี้</w:t>
@@ -23469,7 +23337,7 @@
         <w:pStyle w:val="วรรค"/>
       </w:pPr>
       <w:r>
-        <w:t>ให้นำบทบัญญัติมาตรา ๑๔๕ ของรัฐธรรมนูญแห่งราชอาณาจักรไทย พุทธศักราช ๒๔๔๕ ซึ่งแก้ไขเพิ่มเติมครั้งสุดท้ายโดยรัฐธรรมนูญแห่งราชอาณาจักรไทย แก้ไขเพิ่มเติม (ฉบับที่ ๖) พุทธศักราช ๒๔๔๕ มาใช้บังคับกับการอภิปรายไม่ไว้วางใจรัฐมนตรีเป็นรายบุคคลและคณะรัฐมนตรีตามวรรคหนึ่งหรือกับการอภิปรายไม่ไว้วางใจรัฐมนตรีเป็นรายบุคคลและคณะรัฐมนตรีที่จัดตั้งขึ้นใหม่ในระหว่างที่ยังไม่มีการเลือกตั้งสมาชิกสภาผู้แทนราษฎรตามมาตรา ๑๑๔๘ แล้วแต่กรณี และถ้ามติไม่ไว้วางใจมีคะแนนเสียงตามที่กำหนด ก็ให้รัฐมนตรีหรือคณะรัฐมนตรีดังกล่าว พ้นจากตำแหน่ง</w:t>
+        <w:t>ให้นำบทบัญญัติมาตรา ๑๔๕ ของรัฐธรรมนูญแห่งราชอาณาจักรไทย พุทธศักราช ๒๔๔๕ ซึ่งแก้ไขเพิ่มเติมครั้งสุดท้ายโดยรัฐธรรมนูญแห่งราชอาณาจักรไทย แก้ไขเพิ่มเติม (ฉบับที่ ๖) พุทธศักราช ๒๔๔๕ มาใช้บังคับกับการอภิปรายไม่ไว้วางใจรัฐมนตรีเป็นรายบุคคลและคณะรัฐมนตรีตามวรรคหนึ่งหรือกับการอภิปรายไม่ไว้วางใจรัฐมนตรีเป็นรายบุคคลและคณะรัฐมนตรีที่จัดตั้งขึ้นใหม่ในระหว่างที่ยังไม่มีการเลือกตั้งสมาชิกสภาผู้แทนราษฎรตามมาตรา ๑๑๔๐ แล้วแต่กรณี และถ้ามติไม่ไว้วางใจมีคะแนนเสียงตามที่กำหนด ก็ให้รัฐมนตรีหรือคณะรัฐมนตรีดังกล่าว พ้นจากตำแหน่ง</w:t>
       </w:r>
     </w:p>
     <w:p>
@@ -23477,7 +23345,7 @@
         <w:pStyle w:val="วรรค"/>
       </w:pPr>
       <w:r>
-        <w:t>เมื่อมีการเลือกตั้งสมาชิกสภาผู้แทนราษฎรตามมาตรา ๑๑๔๘ แล้ว ให้คณะรัฐมนตรีตามวรรคหนึ่งหรือคณะรัฐมนตรีที่จัดตั้งขึ้นใหม่ก่อนการเลือกตั้งสมาชิกสภาผู้แทนราษฎรตามมาตรา ๑๑๔๘ แล้วแต่กรณี พ้นจากตำแหน่ง แต่ต้องอยู่ในตำแหน่งเพื่อปฏิบัติหน้าที่ไปจนกว่าคณะรัฐมนตรีที่จัดตั้งขึ้นใหม่จะเข้ารับหน้าที่</w:t>
+        <w:t>เมื่อมีการเลือกตั้งสมาชิกสภาผู้แทนราษฎรตามมาตรา ๑๑๔๐ แล้ว ให้คณะรัฐมนตรีตามวรรคหนึ่งหรือคณะรัฐมนตรีที่จัดตั้งขึ้นใหม่ก่อนการเลือกตั้งสมาชิกสภาผู้แทนราษฎรตามมาตรา ๑๑๔๐ แล้วแต่กรณี พ้นจากตำแหน่ง แต่ต้องอยู่ในตำแหน่งเพื่อปฏิบัติหน้าที่ไปจนกว่าคณะรัฐมนตรีที่จัดตั้งขึ้นใหม่จะเข้ารับหน้าที่</w:t>
       </w:r>
     </w:p>
     <w:p>
@@ -23497,7 +23365,7 @@
           <w:b/>
           <w:bCs/>
         </w:rPr>
-        <w:t>มาตรา ๑๑๔๒</w:t>
+        <w:t>มาตรา ๑๑๓๔</w:t>
       </w:r>
       <w:r>
         <w:t xml:space="preserve">  ในวาระเริ่มแรก ให้คณะกรรมการตุลาการตามกฎหมายว่าด้วยระเบียบข้าราชการฝ่ายตุลาการ เป็นคณะกรรมการตุลาการศาลยุติธรรมตามรัฐธรรมนูญนี้ จนกว่าจะมีคณะกรรมการตุลาการศาลยุติธรรมตามมาตรา ๒๖๑ และการเลือกตั้งกรรมการตุลาการให้เป็นไปตามกฎหมายว่าด้วยระเบียบข้าราชการฝ่ายตุลาการ</w:t>
@@ -23520,7 +23388,7 @@
           <w:b/>
           <w:bCs/>
         </w:rPr>
-        <w:t>มาตรา ๑๑๔๓</w:t>
+        <w:t>มาตรา ๑๑๓๕</w:t>
       </w:r>
       <w:r>
         <w:t xml:space="preserve">  ในวาระเริ่มแรก ให้วุฒิสภาดำเนินการเลือกกรรมการการเลือกตั้งตามมาตรา ๓๑๓ ภายในสามสิบวันนับแต่วันประกาศใช้รัฐธรรมนูญนี้ และมิให้นำกำหนดเวลาตามมาตรา ๓๑๕ มาใช้บังคับ</w:t>
@@ -23551,7 +23419,7 @@
           <w:b/>
           <w:bCs/>
         </w:rPr>
-        <w:t>มาตรา ๑๑๔๔</w:t>
+        <w:t>มาตรา ๑๑๓๖</w:t>
       </w:r>
       <w:r>
         <w:t xml:space="preserve">  ในวาระเริ่มแรก ให้คณะตุลาการรัฐธรรมนูญตามรัฐธรรมนูญแห่งราชอาณาจักรไทย พุทธศักราช ๒๔๔๕ ซึ่งแก้ไขเพิ่มเติมครั้งสุดท้ายโดยรัฐธรรมนูญแห่งราชอาณาจักรไทย แก้ไขเพิ่มเติม (ฉบับที่ ๖) พุทธศักราช ๒๔๔๕ เป็นศาลรัฐธรรมนูญตามรัฐธรรมนูญนี้ จนกว่าจะมีศาลรัฐธรรมนูญตามวรรคสอง</w:t>
@@ -23582,7 +23450,7 @@
           <w:b/>
           <w:bCs/>
         </w:rPr>
-        <w:t>มาตรา ๑๑๔๕</w:t>
+        <w:t>มาตรา ๑๑๓๗</w:t>
       </w:r>
       <w:r>
         <w:t xml:space="preserve">  ให้คณะกรรมการป้องกันและปราบปรามการทุจริตและประพฤติมิชอบในวงราชการและสำนักงานคณะกรรมการป้องกันและปราบปรามการทุจริตและประพฤติมิชอบในวงราชการตามกฎหมายว่าด้วยการป้องกันและปราบปรามการทุจริตและประพฤติมิชอบในวงราชการ เป็นคณะกรรมการป้องกันและปราบปรามการทุจริตแห่งชาติและสำนักงานคณะกรรมการป้องกันและปราบปรามการทุจริตแห่งชาติ ตามรัฐธรรมนูญนี้ แล้วแต่กรณี จนกว่าจะมีการแต่งตั้งคณะกรรมการป้องกันและปราบปรามการทุจริตแห่งชาติหรือจัดตั้งสำนักงานคณะกรรมการป้องกันและปราบปรามการทุจริตแห่งชาติขึ้นตามบทบัญญัติแห่งรัฐธรรมนูญนี้ ซึ่งต้องกระทำภายในสองปีนับแต่วันประกาศใช้รัฐธรรมนูญนี้</w:t>
@@ -23613,10 +23481,10 @@
           <w:b/>
           <w:bCs/>
         </w:rPr>
-        <w:t>มาตรา ๑๑๔๖</w:t>
-      </w:r>
-      <w:r>
-        <w:t xml:space="preserve">  ในวาระเริ่มแรก กรรมการการเลือกตั้ง ผู้ตรวจการแผ่นดินของรัฐสภา กรรมการสิทธิมนุษยชนแห่งชาติ ตุลาการศาลรัฐธรรมนูญ กรรมการป้องกันและปราบปรามการทุจริตแห่งชาติ และกรรมการตรวจเงินแผ่นดิน ที่วุฒิสภาตามมาตรา ๑๑๓๙ วรรคสาม มีมติเลือก ให้มีระยะเวลาดำรงตำแหน่งเพียงกึ่งหนึ่งของวาระที่กำหนดไว้สำหรับตำแหน่งดังกล่าว และเพื่อประโยชน์ในการเลือกผู้ดำรงตำแหน่งดังกล่าวเป็นคราวแรกโดยวุฒิสภาซึ่งเลือกตั้งขึ้นตามรัฐธรรมนูญนี้ มิให้นำบทบัญญัติที่ให้ดำรงตำแหน่งดังกล่าวได้เพียงวาระเดียวมาใช้บังคับ</w:t>
+        <w:t>มาตรา ๑๑๓๘</w:t>
+      </w:r>
+      <w:r>
+        <w:t xml:space="preserve">  ในวาระเริ่มแรก กรรมการการเลือกตั้ง ผู้ตรวจการแผ่นดินของรัฐสภา กรรมการสิทธิมนุษยชนแห่งชาติ ตุลาการศาลรัฐธรรมนูญ กรรมการป้องกันและปราบปรามการทุจริตแห่งชาติ และกรรมการตรวจเงินแผ่นดิน ที่วุฒิสภาตามมาตรา ๑๑๓๑ วรรคสาม มีมติเลือก ให้มีระยะเวลาดำรงตำแหน่งเพียงกึ่งหนึ่งของวาระที่กำหนดไว้สำหรับตำแหน่งดังกล่าว และเพื่อประโยชน์ในการเลือกผู้ดำรงตำแหน่งดังกล่าวเป็นคราวแรกโดยวุฒิสภาซึ่งเลือกตั้งขึ้นตามรัฐธรรมนูญนี้ มิให้นำบทบัญญัติที่ให้ดำรงตำแหน่งดังกล่าวได้เพียงวาระเดียวมาใช้บังคับ</w:t>
       </w:r>
     </w:p>
     <w:p>
@@ -23624,19 +23492,19 @@
         <w:pStyle w:val="วรรค"/>
       </w:pPr>
       <w:r>
-        <w:t>ก่อนที่จะมีการเลือกตั้งสมาชิกวุฒิสภาตามรัฐธรรมนูญนี้ การถอดถอนผู้ดำรงตำแหน่งต่าง ๆ ตามรัฐธรรมนูญนี้ ให้เป็นมติของที่ประชุมร่วมของสภาผู้แทนราษฎรกับวุฒิสภาตามมาตรา ๑๑๓๙ และให้นำบทบัญญัติมาตรา ๑๑๐ (๑๔) มาตรา ๑๑๙ (๑๐) มาตรา ๑๓๔ (๘) มาตรา ๓๑๘ (๕) มาตรา ๑๕๗ (๓) มาตรา ๒๐๓ (๘) มาตรา ๒๔๗ (๖) มาตรา ๓๓๓ มาตรา ๒๘๕ มาตรา ๒๘๖ และมาตรา ๒๘๙ มาใช้บังคับโดยอนุโลม</w:t>
-      </w:r>
-    </w:p>
-    <w:p>
-      <w:pPr>
-        <w:pStyle w:val="มาตรา"/>
-      </w:pPr>
-      <w:r>
-        <w:rPr>
-          <w:b/>
-          <w:bCs/>
-        </w:rPr>
-        <w:t>มาตรา ๑๑๔๗</w:t>
+        <w:t>ก่อนที่จะมีการเลือกตั้งสมาชิกวุฒิสภาตามรัฐธรรมนูญนี้ การถอดถอนผู้ดำรงตำแหน่งต่าง ๆ ตามรัฐธรรมนูญนี้ ให้เป็นมติของที่ประชุมร่วมของสภาผู้แทนราษฎรกับวุฒิสภาตามมาตรา ๑๑๓๑ และให้นำบทบัญญัติมาตรา ๑๑๐ (๑๔) มาตรา ๑๑๙ (๑๐) มาตรา ๑๓๔ (๘) มาตรา ๓๑๘ (๕) มาตรา ๑๕๗ (๓) มาตรา ๒๐๓ (๘) มาตรา ๒๔๗ (๖) มาตรา ๓๓๓ มาตรา ๒๘๕ มาตรา ๒๘๖ และมาตรา ๒๘๙ มาใช้บังคับโดยอนุโลม</w:t>
+      </w:r>
+    </w:p>
+    <w:p>
+      <w:pPr>
+        <w:pStyle w:val="มาตรา"/>
+      </w:pPr>
+      <w:r>
+        <w:rPr>
+          <w:b/>
+          <w:bCs/>
+        </w:rPr>
+        <w:t>มาตรา ๑๑๓๙</w:t>
       </w:r>
       <w:r>
         <w:t xml:space="preserve">  ภายในสองร้อยสี่สิบวันนับแต่วันประกาศใช้รัฐธรรมนูญนี้ ให้รัฐสภาดำเนินการพิจารณาและให้ความเห็นชอบร่างพระราชบัญญัติประกอบรัฐธรรมนูญว่าด้วยการเลือกตั้งสมาชิกสภาผู้แทนราษฎรและสมาชิกวุฒิสภา ร่างพระราชบัญญัติประกอบรัฐธรรมนูญว่าด้วยคณะกรรมการการเลือกตั้ง และร่างพระราชบัญญัติประกอบรัฐธรรมนูญว่าด้วยพรรคการเมือง ให้แล้วเสร็จทุกฉบับ โดยในระหว่างเวลาดังกล่าวจะยุบสภาผู้แทนราษฎรมิได้</w:t>
@@ -23657,7 +23525,7 @@
       <w:r>
         <w:t>(๑)</w:t>
         <w:tab/>
-        <w:t>ให้สภาผู้แทนราษฎรพิจารณาร่างพระราชบัญญัติประกอบรัฐธรรมนูญตามวรรคหนึ่งให้แล้วเสร็จภายในหนึ่งร้อยยี่สิบวันนับแต่วันประกาศใช้รัฐธรรมนูญนี้ ในกรณีที่พ้นกำหนดเวลาดังกล่าวแต่การพิจารณาร่างพระราชบัญญัติประกอบรัฐธรรมนูญตามวรรคหนึ่งยังไม่แล้วเสร็จทุกฉบับ ให้สมาชิกภาพของสมาชิกสภาผู้แทนราษฎรสิ้นสุดลงพร้อมกันทั้งหมด และห้ามมิให้มีการดำเนินการเลือกตั้งทั่วไปตามรัฐธรรมนูญนี้ จนกว่าจะมีการให้ความเห็นชอบร่างพระราชบัญญัติประกอบรัฐธรรมนูญตามวรรคหนึ่งแล้วเสร็จทุกฉบับ หรือเป็นกรณีตามมาตรา ๑๑๔๘ ในกรณีนี้ ให้วุฒิสภาทำหน้าที่รัฐสภาและดำเนินการเสนอและพิจารณาร่างพระราชบัญญัติประกอบรัฐธรรมนูญดังกล่าวให้แล้วเสร็จภายในเก้าสิบวันนับแต่วันถัดจากวันที่ครบกำหนดหนึ่งร้อยยี่สิบวันนับแต่วันประกาศใช้รัฐธรรมนูญนี้</w:t>
+        <w:t>ให้สภาผู้แทนราษฎรพิจารณาร่างพระราชบัญญัติประกอบรัฐธรรมนูญตามวรรคหนึ่งให้แล้วเสร็จภายในหนึ่งร้อยยี่สิบวันนับแต่วันประกาศใช้รัฐธรรมนูญนี้ ในกรณีที่พ้นกำหนดเวลาดังกล่าวแต่การพิจารณาร่างพระราชบัญญัติประกอบรัฐธรรมนูญตามวรรคหนึ่งยังไม่แล้วเสร็จทุกฉบับ ให้สมาชิกภาพของสมาชิกสภาผู้แทนราษฎรสิ้นสุดลงพร้อมกันทั้งหมด และห้ามมิให้มีการดำเนินการเลือกตั้งทั่วไปตามรัฐธรรมนูญนี้ จนกว่าจะมีการให้ความเห็นชอบร่างพระราชบัญญัติประกอบรัฐธรรมนูญตามวรรคหนึ่งแล้วเสร็จทุกฉบับ หรือเป็นกรณีตามมาตรา ๑๑๔๐ ในกรณีนี้ ให้วุฒิสภาทำหน้าที่รัฐสภาและดำเนินการเสนอและพิจารณาร่างพระราชบัญญัติประกอบรัฐธรรมนูญดังกล่าวให้แล้วเสร็จภายในเก้าสิบวันนับแต่วันถัดจากวันที่ครบกำหนดหนึ่งร้อยยี่สิบวันนับแต่วันประกาศใช้รัฐธรรมนูญนี้</w:t>
       </w:r>
     </w:p>
     <w:p>
@@ -23713,7 +23581,7 @@
           <w:b/>
           <w:bCs/>
         </w:rPr>
-        <w:t>มาตรา ๑๑๔๘</w:t>
+        <w:t>มาตรา ๑๑๔๐</w:t>
       </w:r>
       <w:r>
         <w:t xml:space="preserve">  ให้ดำเนินการเลือกตั้งสมาชิกสภาผู้แทนราษฎรตามรัฐธรรมนูญนี้ เมื่อมีกรณีใดกรณีหนึ่งดังต่อไปนี้</w:t>
@@ -23726,7 +23594,7 @@
       <w:r>
         <w:t>(๑)</w:t>
         <w:tab/>
-        <w:t>ในกรณีที่รัฐสภาให้ความเห็นชอบร่างพระราชบัญญัติประกอบรัฐธรรมนูญทุกฉบับแล้วเสร็จภายในกำหนดเวลาตามมาตรา ๑๑๔๗ วรรคหนึ่ง หรือในกรณีที่สภาผู้แทนราษฎรหรือวุฒิสภาซึ่งทำหน้าที่รัฐสภาตามมาตรา ๑๑๔๗ พิจารณาให้ความเห็นชอบร่างพระราชบัญญัติประกอบรัฐธรรมนูญดังกล่าวทุกฉบับภายในกำหนดเวลาตามมาตรา ๑๑๔๗ ให้คณะกรรมการการเลือกตั้งตามมาตรา ๑๑๔๓ ดำเนินการเลือกตั้งสมาชิกสภาผู้แทนราษฎรตามรัฐธรรมนูญนี้ภายในหกสิบวันนับแต่วันที่สภาผู้แทนราษฎรสิ้นอายุหรือถูกยุบ หรือเมื่อมีกรณีตามมาตรา ๑๑๔๗</w:t>
+        <w:t>ในกรณีที่รัฐสภาให้ความเห็นชอบร่างพระราชบัญญัติประกอบรัฐธรรมนูญทุกฉบับแล้วเสร็จภายในกำหนดเวลาตามมาตรา ๑๑๓๙ วรรคหนึ่ง หรือในกรณีที่สภาผู้แทนราษฎรหรือวุฒิสภาซึ่งทำหน้าที่รัฐสภาตามมาตรา ๑๑๓๙ พิจารณาให้ความเห็นชอบร่างพระราชบัญญัติประกอบรัฐธรรมนูญดังกล่าวทุกฉบับภายในกำหนดเวลาตามมาตรา ๑๑๓๙ ให้คณะกรรมการการเลือกตั้งตามมาตรา ๑๑๓๕ ดำเนินการเลือกตั้งสมาชิกสภาผู้แทนราษฎรตามรัฐธรรมนูญนี้ภายในหกสิบวันนับแต่วันที่สภาผู้แทนราษฎรสิ้นอายุหรือถูกยุบ หรือเมื่อมีกรณีตามมาตรา ๑๑๓๙</w:t>
       </w:r>
     </w:p>
     <w:p>
@@ -23736,7 +23604,7 @@
       <w:r>
         <w:t>(๒)</w:t>
         <w:tab/>
-        <w:t>ในกรณีที่ทั้งสภาผู้แทนราษฎรและวุฒิสภาไม่สามารถพิจารณาและให้ความเห็นชอบร่างพระราชบัญญัติประกอบรัฐธรรมนูญตามมาตรา ๑๑๔๗ วรรคหนึ่ง ให้แล้วเสร็จภายในกำหนด ให้มีการเลือกตั้งสมาชิกสภาผู้แทนราษฎรตามรัฐธรรมนูญนี้ภายในเก้าสิบวันนับแต่วันที่พ้นกำหนดเวลาตามมาตรา ๑๑๔๗ วรรคหนึ่ง และให้นำกฎหมายว่าด้วยการเลือกตั้งสมาชิกสภาผู้แทนราษฎรซึ่งมีผลใช้บังคับอยู่ในวันประกาศใช้รัฐธรรมนูญนี้ เท่าที่ไม่ขัดหรือแย้งต่อรัฐธรรมนูญนี้ มาใช้บังคับกับการเลือกตั้งดังกล่าว โดยให้ประธานกรรมการการเลือกตั้งที่ตั้งขึ้นตามมาตรา ๑๑๔๓ เป็นผู้รักษาการตามกฎหมายดังกล่าวและในกรณีที่คณะกรรมการการเลือกตั้งเห็นว่าบทบัญญัติใดของกฎหมายว่าด้วยการเลือกตั้งสมาชิกสภาผู้แทนราษฎร ขัดหรือแย้งหรือไม่สอดคล้องกับรัฐธรรมนูญนี้ คณะกรรมการการเลือกตั้งมีอำนาจกำหนดระเบียบที่จำเป็นขึ้นใช้แทนบทบัญญัตินั้นได้เพื่อให้การเลือกตั้งเป็นไปโดยสุจริตและเที่ยงธรรม ระเบียบดังกล่าวและความเห็นที่ว่าบทบัญญัติแห่งกฎหมายดังกล่าวนั้นขัดหรือแย้งหรือไม่สอดคล้องกับรัฐธรรมนูญนี้ ให้ส่งศาลรัฐธรรมนูญพิจารณาวินิจฉัยความชอบด้วยรัฐธรรมนูญก่อนประกาศใช้ในราชกิจจานุเบกษา</w:t>
+        <w:t>ในกรณีที่ทั้งสภาผู้แทนราษฎรและวุฒิสภาไม่สามารถพิจารณาและให้ความเห็นชอบร่างพระราชบัญญัติประกอบรัฐธรรมนูญตามมาตรา ๑๑๓๙ วรรคหนึ่ง ให้แล้วเสร็จภายในกำหนด ให้มีการเลือกตั้งสมาชิกสภาผู้แทนราษฎรตามรัฐธรรมนูญนี้ภายในเก้าสิบวันนับแต่วันที่พ้นกำหนดเวลาตามมาตรา ๑๑๓๙ วรรคหนึ่ง และให้นำกฎหมายว่าด้วยการเลือกตั้งสมาชิกสภาผู้แทนราษฎรซึ่งมีผลใช้บังคับอยู่ในวันประกาศใช้รัฐธรรมนูญนี้ เท่าที่ไม่ขัดหรือแย้งต่อรัฐธรรมนูญนี้ มาใช้บังคับกับการเลือกตั้งดังกล่าว โดยให้ประธานกรรมการการเลือกตั้งที่ตั้งขึ้นตามมาตรา ๑๑๓๕ เป็นผู้รักษาการตามกฎหมายดังกล่าวและในกรณีที่คณะกรรมการการเลือกตั้งเห็นว่าบทบัญญัติใดของกฎหมายว่าด้วยการเลือกตั้งสมาชิกสภาผู้แทนราษฎร ขัดหรือแย้งหรือไม่สอดคล้องกับรัฐธรรมนูญนี้ คณะกรรมการการเลือกตั้งมีอำนาจกำหนดระเบียบที่จำเป็นขึ้นใช้แทนบทบัญญัตินั้นได้เพื่อให้การเลือกตั้งเป็นไปโดยสุจริตและเที่ยงธรรม ระเบียบดังกล่าวและความเห็นที่ว่าบทบัญญัติแห่งกฎหมายดังกล่าวนั้นขัดหรือแย้งหรือไม่สอดคล้องกับรัฐธรรมนูญนี้ ให้ส่งศาลรัฐธรรมนูญพิจารณาวินิจฉัยความชอบด้วยรัฐธรรมนูญก่อนประกาศใช้ในราชกิจจานุเบกษา</w:t>
       </w:r>
     </w:p>
     <w:p>
@@ -23744,19 +23612,19 @@
         <w:pStyle w:val="วรรค"/>
       </w:pPr>
       <w:r>
-        <w:t>เมื่อได้มีการเลือกตั้งสมาชิกสภาผู้แทนราษฎรและสมาชิกวุฒิสภาขึ้นใหม่ตามรัฐธรรมนูญนี้แล้ว และยังไม่มีพระราชบัญญัติประกอบรัฐธรรมนูญตามมาตรา ๑๑๔๗ วรรคหนึ่ง ครบทุกฉบับ ให้สภาผู้แทนราษฎรและวุฒิสภาดำเนินการพิจารณาและให้ความเห็นชอบร่างพระราชบัญญัติประกอบรัฐธรรมนูญที่ยังไม่ได้ตราขึ้นตามมาตรา ๑๑๔๗ โดยให้เริ่มนับกำหนดเวลานับแต่วันเลือกตั้งสมาชิกสภาผู้แทนราษฎรอันเป็นการเลือกตั้งทั่วไป เป็นต้นไป และให้นำความใน (๒) และมาตรา ๑๑๓๙ วรรคห้า (๒) มาใช้บังคับโดยอนุโลม</w:t>
-      </w:r>
-    </w:p>
-    <w:p>
-      <w:pPr>
-        <w:pStyle w:val="มาตรา"/>
-      </w:pPr>
-      <w:r>
-        <w:rPr>
-          <w:b/>
-          <w:bCs/>
-        </w:rPr>
-        <w:t>มาตรา ๑๑๔๙</w:t>
+        <w:t>เมื่อได้มีการเลือกตั้งสมาชิกสภาผู้แทนราษฎรและสมาชิกวุฒิสภาขึ้นใหม่ตามรัฐธรรมนูญนี้แล้ว และยังไม่มีพระราชบัญญัติประกอบรัฐธรรมนูญตามมาตรา ๑๑๓๙ วรรคหนึ่ง ครบทุกฉบับ ให้สภาผู้แทนราษฎรและวุฒิสภาดำเนินการพิจารณาและให้ความเห็นชอบร่างพระราชบัญญัติประกอบรัฐธรรมนูญที่ยังไม่ได้ตราขึ้นตามมาตรา ๑๑๓๙ โดยให้เริ่มนับกำหนดเวลานับแต่วันเลือกตั้งสมาชิกสภาผู้แทนราษฎรอันเป็นการเลือกตั้งทั่วไป เป็นต้นไป และให้นำความใน (๒) และมาตรา ๑๑๓๑ วรรคห้า (๒) มาใช้บังคับโดยอนุโลม</w:t>
+      </w:r>
+    </w:p>
+    <w:p>
+      <w:pPr>
+        <w:pStyle w:val="มาตรา"/>
+      </w:pPr>
+      <w:r>
+        <w:rPr>
+          <w:b/>
+          <w:bCs/>
+        </w:rPr>
+        <w:t>มาตรา ๑๑๔๑</w:t>
       </w:r>
       <w:r>
         <w:t xml:space="preserve">  ในการเลือกตั้งสมาชิกสภาผู้แทนราษฎรอันเป็นการเลือกตั้งทั่วไปครั้งแรกภายหลังการประกาศใช้รัฐธรรมนูญนี้ มิให้นำกำหนดเวลาตามมาตรา ๑๐๘ (๔) มาใช้บังคับ</w:t>
@@ -23771,7 +23639,7 @@
           <w:b/>
           <w:bCs/>
         </w:rPr>
-        <w:t>มาตรา ๑๑๕๐</w:t>
+        <w:t>มาตรา ๑๑๔๒</w:t>
       </w:r>
       <w:r>
         <w:t xml:space="preserve">  นอกจากที่มีบัญญัติไว้ในรัฐธรรมนูญนี้ กฎหมายประกอบรัฐธรรมนูญว่าด้วยการเลือกตั้งสมาชิกสภาผู้แทนราษฎรและสมาชิกวุฒิสภา อย่างน้อยต้องมีสาระสำคัญดังต่อไปนี้</w:t>
@@ -23876,7 +23744,7 @@
           <w:b/>
           <w:bCs/>
         </w:rPr>
-        <w:t>มาตรา ๑๑๕๑</w:t>
+        <w:t>มาตรา ๑๑๔๓</w:t>
       </w:r>
       <w:r>
         <w:t xml:space="preserve">  นอกจากที่มีบัญญัติไว้ในรัฐธรรมนูญนี้ กฎหมายประกอบรัฐธรรมนูญว่าด้วยคณะกรรมการการเลือกตั้ง อย่างน้อยต้องมีสาระสำคัญดังต่อไปนี้</w:t>
@@ -23981,7 +23849,7 @@
           <w:b/>
           <w:bCs/>
         </w:rPr>
-        <w:t>มาตรา ๑๑๕๒</w:t>
+        <w:t>มาตรา ๑๑๔๔</w:t>
       </w:r>
       <w:r>
         <w:t xml:space="preserve">  นอกจากที่มีบัญญัติไว้ในรัฐธรรมนูญนี้ กฎหมายประกอบรัฐธรรมนูญว่าด้วยพรรคการเมือง อย่างน้อยต้องมีสาระสำคัญดังต่อไปนี้</w:t>
@@ -24066,7 +23934,7 @@
           <w:b/>
           <w:bCs/>
         </w:rPr>
-        <w:t>มาตรา ๑๑๕๓</w:t>
+        <w:t>มาตรา ๑๑๔๕</w:t>
       </w:r>
       <w:r>
         <w:t xml:space="preserve">  ภายในสองปีนับแต่วันประกาศใช้รัฐธรรมนูญนี้ ให้ดำเนินการตรากฎหมายประกอบรัฐธรรมนูญดังต่อไปนี้ให้แล้วเสร็จ</w:t>
@@ -24131,7 +23999,7 @@
           <w:b/>
           <w:bCs/>
         </w:rPr>
-        <w:t>มาตรา ๑๑๕๔</w:t>
+        <w:t>มาตรา ๑๑๔๖</w:t>
       </w:r>
       <w:r>
         <w:t xml:space="preserve">  นอกจากที่มีบัญญัติไว้ในรัฐธรรมนูญนี้ กฎหมายประกอบรัฐธรรมนูญว่าด้วยผู้ตรวจการแผ่นดินของรัฐสภา อย่างน้อยต้องมีสาระสำคัญดังต่อไปนี้</w:t>
@@ -24186,7 +24054,7 @@
           <w:b/>
           <w:bCs/>
         </w:rPr>
-        <w:t>มาตรา ๑๑๕๕</w:t>
+        <w:t>มาตรา ๑๑๔๗</w:t>
       </w:r>
       <w:r>
         <w:t xml:space="preserve">  นอกจากที่มีบัญญัติไว้ในรัฐธรรมนูญนี้ กฎหมายประกอบรัฐธรรมนูญว่าด้วยการป้องกันและปราบปรามการทุจริต อย่างน้อยต้องมีสาระสำคัญดังต่อไปนี้</w:t>
@@ -24331,7 +24199,7 @@
           <w:b/>
           <w:bCs/>
         </w:rPr>
-        <w:t>มาตรา ๑๑๕๖</w:t>
+        <w:t>มาตรา ๑๑๔๘</w:t>
       </w:r>
       <w:r>
         <w:t xml:space="preserve">  นอกจากที่มีบัญญัติไว้ในรัฐธรรมนูญนี้ กฎหมายประกอบรัฐธรรมนูญว่าด้วยวิธีพิจารณาคดีอาญาของผู้ดำรงตำแหน่งทางการเมือง อย่างน้อยต้องมีสาระสำคัญดังต่อไปนี้</w:t>
@@ -24416,7 +24284,7 @@
           <w:b/>
           <w:bCs/>
         </w:rPr>
-        <w:t>มาตรา ๑๑๕๗</w:t>
+        <w:t>มาตรา ๑๑๔๙</w:t>
       </w:r>
       <w:r>
         <w:t xml:space="preserve">  นอกจากที่มีบัญญัติไว้ในรัฐธรรมนูญนี้ กฎหมายประกอบรัฐธรรมนูญว่าด้วยการตรวจเงินแผ่นดิน อย่างน้อยต้องมีสาระสำคัญดังต่อไปนี้</w:t>
@@ -24461,7 +24329,7 @@
           <w:b/>
           <w:bCs/>
         </w:rPr>
-        <w:t>มาตรา ๑๑๕๘</w:t>
+        <w:t>มาตรา ๑๑๕๐</w:t>
       </w:r>
       <w:r>
         <w:t xml:space="preserve">  ในวาระเริ่มแรก ให้ดำเนินการต่าง ๆ ดังต่อไปนี้ให้แล้วเสร็จภายในเวลาที่กำหนด</w:t>
@@ -24504,19 +24372,19 @@
       <w:r>
         <w:t>(๔)</w:t>
         <w:tab/>
-        <w:t>ให้ดำเนินการให้มีคณะผู้บริหารท้องถิ่นหรือผู้บริหารท้องถิ่นที่มาจากการเลือกตั้งโดยตรงของประชาชนหรือมาจากความเห็นชอบของสภาท้องถิ่นตามมาตรา ๒๗๒ วรรคสาม ให้ครบถ้วนภายในสองปีนับแต่วันประกาศใช้รัฐธรรมนูญนี้ ทั้งนี้ เว้นแต่เป็นกรณีตามมาตรา ๑๑๕๙ (๗)</w:t>
-      </w:r>
-    </w:p>
-    <w:p>
-      <w:pPr>
-        <w:pStyle w:val="มาตรา"/>
-      </w:pPr>
-      <w:r>
-        <w:rPr>
-          <w:b/>
-          <w:bCs/>
-        </w:rPr>
-        <w:t>มาตรา ๑๑๕๙</w:t>
+        <w:t>ให้ดำเนินการให้มีคณะผู้บริหารท้องถิ่นหรือผู้บริหารท้องถิ่นที่มาจากการเลือกตั้งโดยตรงของประชาชนหรือมาจากความเห็นชอบของสภาท้องถิ่นตามมาตรา ๒๗๒ วรรคสาม ให้ครบถ้วนภายในสองปีนับแต่วันประกาศใช้รัฐธรรมนูญนี้ ทั้งนี้ เว้นแต่เป็นกรณีตามมาตรา ๑๑๕๑ (๗)</w:t>
+      </w:r>
+    </w:p>
+    <w:p>
+      <w:pPr>
+        <w:pStyle w:val="มาตรา"/>
+      </w:pPr>
+      <w:r>
+        <w:rPr>
+          <w:b/>
+          <w:bCs/>
+        </w:rPr>
+        <w:t>มาตรา ๑๑๕๑</w:t>
       </w:r>
       <w:r>
         <w:t xml:space="preserve">  ในวาระเริ่มแรก มิให้นำบทบัญญัติดังต่อไปนี้ มาใช้บังคับกับกรณีต่าง ๆ ภายใต้เงื่อนไขดังต่อไปนี้</w:t>
@@ -24569,7 +24437,7 @@
       <w:r>
         <w:t>(๕)</w:t>
         <w:tab/>
-        <w:t>มิให้นำบทบัญญัติมาตรา ๒๒๓ และมาตรา ๒๓๖ วรรคสามและวรรคห้า มาใช้บังคับกับการพิจารณาคดีของศาลยุติธรรม และมิให้นำมาตรา ๒๖๐ วรรคสอง มาใช้บังคับกับคณะกรรมการตุลาการตามมาตรา ๑๑๔๒ แต่ทั้งนี้จะต้องดำเนินการเพื่อให้การเป็นไปตามบทบัญญัติดังกล่าว ซึ่งต้องไม่เกินห้าปีนับแต่วันประกาศใช้รัฐธรรมนูญนี้</w:t>
+        <w:t>มิให้นำบทบัญญัติมาตรา ๒๒๓ และมาตรา ๒๓๖ วรรคสามและวรรคห้า มาใช้บังคับกับการพิจารณาคดีของศาลยุติธรรม และมิให้นำมาตรา ๒๖๐ วรรคสอง มาใช้บังคับกับคณะกรรมการตุลาการตามมาตรา ๑๑๓๔ แต่ทั้งนี้จะต้องดำเนินการเพื่อให้การเป็นไปตามบทบัญญัติดังกล่าว ซึ่งต้องไม่เกินห้าปีนับแต่วันประกาศใช้รัฐธรรมนูญนี้</w:t>
       </w:r>
     </w:p>
     <w:p>
@@ -24611,10 +24479,143 @@
           <w:b/>
           <w:bCs/>
         </w:rPr>
+        <w:t>มาตรา ๑๑๕๒</w:t>
+      </w:r>
+      <w:r>
+        <w:t xml:space="preserve">  เมื่อครบห้าปีนับแต่วันประกาศใช้รัฐธรรมนูญนี้ คณะกรรมการการเลือกตั้ง คณะตุลาการศาลรัฐธรรมนูญ หรือคณะกรรมการป้องกันและปราบปรามการทุจริตแห่งชาติ มีอำนาจทำรายงานเสนอความเห็นต่อรัฐสภาและคณะรัฐมนตรีเกี่ยวกับการแก้ไขเพิ่มเติมรัฐธรรมนูญนี้หรือกฎหมายอื่นได้</w:t>
+      </w:r>
+    </w:p>
+    <w:p>
+      <w:pPr>
+        <w:pStyle w:val="หมวด"/>
+      </w:pPr>
+      <w:r>
+        <w:t>หมวดพิเศษ</w:t>
+        <w:br/>
+      </w:r>
+      <w:r>
+        <w:t>อำนาจสูงสุดพิทักษ์ประชาชน (The Supreme People's Power)</w:t>
+      </w:r>
+    </w:p>
+    <w:p>
+      <w:pPr>
+        <w:pStyle w:val="มาตรา"/>
+      </w:pPr>
+      <w:r>
+        <w:rPr>
+          <w:b/>
+          <w:bCs/>
+        </w:rPr>
+        <w:t>มาตรา ๑๑๕๓</w:t>
+      </w:r>
+      <w:r>
+        <w:t xml:space="preserve">  สภาประชาชนสูงสุด (Supreme Citizen Assembly): ให้มีสภาประชาชนสูงสุดประกอบด้วยประชาชนที่ได้จากการสุ่มเลือก (Sortition) จำนวนห้าร้อยคน หมุนเวียนวาระละหนึ่งปี มีอำนาจในฐานะตัวแทนปวงชนชาวไทยโดยตรง สภานี้มีอำนาจยับยั้ง (Veto) กฎหมาย มติคณะรัฐมนตรี หรือคำพิพากษาศาลฎีกาที่ขัดต่อประโยชน์สาธารณะได้</w:t>
+      </w:r>
+    </w:p>
+    <w:p>
+      <w:pPr>
+        <w:pStyle w:val="มาตรา"/>
+      </w:pPr>
+      <w:r>
+        <w:rPr>
+          <w:b/>
+          <w:bCs/>
+        </w:rPr>
+        <w:t>มาตรา ๑๑๕๔</w:t>
+      </w:r>
+      <w:r>
+        <w:t xml:space="preserve">  ระบบประชาธิปไตยทางตรงดิจิทัล: รัฐต้องจัดตั้งระบบออกเสียงผ่านแอปพลิเคชันที่มีความปลอดภัยสูงสุด ให้ประชาชนทุกคนสามารถเสนอกฎหมายและร่วมโหวตผ่านโทรศัพท์มือถือได้ หากกฎหมายใดที่ประชาชนโหวตเห็นชอบเกินกึ่งหนึ่งของผู้มีสิทธิเลือกตั้งทั้งประเทศ ให้มีผลบังคับใช้เป็นกฎหมายทันทีโดยไม่ต้องผ่านรัฐสภา</w:t>
+      </w:r>
+    </w:p>
+    <w:p>
+      <w:pPr>
+        <w:pStyle w:val="มาตรา"/>
+      </w:pPr>
+      <w:r>
+        <w:rPr>
+          <w:b/>
+          <w:bCs/>
+        </w:rPr>
+        <w:t>มาตรา ๑๑๕๕</w:t>
+      </w:r>
+      <w:r>
+        <w:t xml:space="preserve">  การถอดถอนข้าราชการระดับสูง: สิทธิในการถอดถอน (Recall)ถอดถอนผู้แทนราษฎรหรือผู้ดำรงตำแหน่งทางการเมือง มิได้จำกัดเพียงแค่นักการเมือง ประชาชนจำนวนหนึ่งหมื่นคนสามารถเข้าชื่อเพื่อจัดให้มีการลงประชามติถอดถอน ผู้พิพากษา อัยการสูงสุด ผบ.ตร. ผบ.ทบ. หรือข้าราชการระดับปลัดกระทรวง ได้ทุกเมื่อหากพบว่าทุจริตหรือปฏิบัติหน้าที่โดยมิชอบ</w:t>
+      </w:r>
+    </w:p>
+    <w:p>
+      <w:pPr>
+        <w:pStyle w:val="มาตรา"/>
+      </w:pPr>
+      <w:r>
+        <w:rPr>
+          <w:b/>
+          <w:bCs/>
+        </w:rPr>
+        <w:t>มาตรา ๑๑๕๖</w:t>
+      </w:r>
+      <w:r>
+        <w:t xml:space="preserve">  รายได้พื้นฐานถ้วนหน้า (Universal Basic Income - UBI): รัฐต้องประกันรายได้พื้นฐานให้แก่ประชาชนชาวไทยทุกคนตั้งแต่เกิดจนตาย ในอัตราไม่ต่ำกว่าเส้นความยากจน โดยห้ามนำข้ออ้างด้านงบประมาณมาลิดรอนสิทธินี้</w:t>
+      </w:r>
+    </w:p>
+    <w:p>
+      <w:pPr>
+        <w:pStyle w:val="มาตรา"/>
+      </w:pPr>
+      <w:r>
+        <w:rPr>
+          <w:b/>
+          <w:bCs/>
+        </w:rPr>
+        <w:t>มาตรา ๑๑๕๗</w:t>
+      </w:r>
+      <w:r>
+        <w:t xml:space="preserve">  สิทธิการเข้าควบคุมกิจการ (Worker's Control): ในกรณีที่กลุ่มทุนขนาดใหญ่หรือองค์กรเอกชนกระทำการเอาเปรียบประชาชนอย่างร้ายแรง สหภาพแรงงานและสมาคมผู้บริโภคมีสิทธิเข้าควบคุมและยึดกิจการนั้นมาดำเนินการในรูปแบบสหกรณ์ที่ประชาชนเป็นเจ้าของร่วมกันได้</w:t>
+      </w:r>
+    </w:p>
+    <w:p>
+      <w:pPr>
+        <w:pStyle w:val="มาตรา"/>
+      </w:pPr>
+      <w:r>
+        <w:rPr>
+          <w:b/>
+          <w:bCs/>
+        </w:rPr>
+        <w:t>มาตรา ๑๑๕๘</w:t>
+      </w:r>
+      <w:r>
+        <w:t xml:space="preserve">  กองทุนต่อต้านการทุจริตภาคประชาชน: ทรัพย์สินที่ยึดได้จากนักการเมืองและข้าราชการที่ทุจริตทั้งหมด ต้องถูกนำเข้ากองทุนนี้ และให้สภาประชาชนสูงสุดเป็นผู้จัดสรรเพื่อนำไปใช้เยียวยาผู้ได้รับผลกระทบ หรือลงทุนในโครงสร้างพื้นฐานของชุมชนท้องถิ่น</w:t>
+      </w:r>
+    </w:p>
+    <w:p>
+      <w:pPr>
+        <w:pStyle w:val="มาตรา"/>
+      </w:pPr>
+      <w:r>
+        <w:rPr>
+          <w:b/>
+          <w:bCs/>
+        </w:rPr>
+        <w:t>มาตรา ๑๑๕๙</w:t>
+      </w:r>
+      <w:r>
+        <w:t xml:space="preserve">  บทสรุปแห่งความศักดิ์สิทธิ์: รัฐธรรมนูญฉบับนี้ร่างขึ้นจากเจตจำนงของประชาชน การตีความเพื่อลดทอนสิทธิและอำนาจของประชาชนตามรัฐธรรมนูญนี้ จะกระทำมิได้โดยเด็ดขาด องค์กรหรือบุคคลใดฝ่าฝืน ให้ถือว่าเป็นการทรยศต่อชาติและประชาชน</w:t>
+      </w:r>
+    </w:p>
+    <w:p>
+      <w:pPr>
+        <w:pStyle w:val="มาตรา"/>
+        <w:keepNext/>
+      </w:pPr>
+      <w:r>
+        <w:rPr>
+          <w:b/>
+          <w:bCs/>
+        </w:rPr>
         <w:t>มาตรา ๑๑๖๐</w:t>
       </w:r>
       <w:r>
-        <w:t xml:space="preserve">  เมื่อครบห้าปีนับแต่วันประกาศใช้รัฐธรรมนูญนี้ คณะกรรมการการเลือกตั้ง คณะตุลาการศาลรัฐธรรมนูญ หรือคณะกรรมการป้องกันและปราบปรามการทุจริตแห่งชาติ มีอำนาจทำรายงานเสนอความเห็นต่อรัฐสภาและคณะรัฐมนตรีเกี่ยวกับการแก้ไขเพิ่มเติมรัฐธรรมนูญนี้หรือกฎหมายอื่นได้</w:t>
+        <w:t xml:space="preserve">  ข้อห้ามในการยกเลิกรัฐธรรมนูญและความผิดฐานกบฏแผ่นดิน: รัฐธรรมนูญฉบับนี้ไม่สามารถยกเลิกได้หากไม่ผ่านความเห็นชอบของประชาชนผ่านการออกเสียงประชามติ ไม่มีอำนาจหรือคณะบุคคลใดๆ ที่จะมีอำนาจยกเลิกรัฐธรรมนูญนี้ได้ ยกเว้นอำนาจของประชาชนผ่านการออกเสียงประชามติเท่านั้น ในกรณีที่คณะรัฐประหารหรือคณะบุคคลใดประกาศยกเลิกหรือลบล้างรัฐธรรมนูญนี้ ให้ถือว่าสมาชิกคณะบุคคลหรือคณะรัฐประหารดังกล่าวทั้งหมดมีความผิดฐานเป็นกบฏแผ่นดิน มีโทษสูงสุดโดยไม่มีอายุความ และห้ามมิให้มีการนิรโทษกรรมแก่คณะบุคคลดังกล่าวไม่ว่าด้วยวิธีการหรือทางใดๆ ก็ตาม ในกรณีที่คณะรัฐประหารคุมอำนาจไว้และทำการยกเลิกหรือเปลี่ยนแปลงรัฐธรรมนูญนี้จนทำให้บทบัญญัติการป้องกันไม่สามารถใช้บังคับได้ในทางปฏิบัติ เมื่อคณะรัฐประหารดังกล่าวพ้นจากอำนาจลงไม่ว่าในเวลาใด ให้ถือว่ารัฐธรรมนูญฉบับอื่นใดที่ถูกร่างขึ้นใหม่ในช่วงเวลาดังกล่าวไม่ว่าจะเป็นฉบับชั่วคราวหรือถาวรเป็นโมฆะและไม่มีผลบังคับใช้ โดยให้รัฐธรรมนูญฉบับนี้มีผลบังคับใช้กลับคืนมาโดยอัตโนมัติในฐานะกฎหมายสูงสุดของประเทศทันที สำหรับความผิดฐานกบฏแผ่นดินจากการยกเลิกหรือล้มล้างรัฐธรรมนูญนี้ ให้ถือว่าผู้กระทำความผิดเป็นอาชญากรข้ามชาติ หากหลบหนีออกนอกราชอาณาจักรให้ดำเนินการตามล่าตัวและส่งตัวกลับเพื่อดำเนินคดีจนกว่าจะเสียชีวิต โดยมีโทษทางอาญาในการล้มล้างหรือยกเลิกรัฐธรรมนูญนี้คือประหารชีวิตสถานเดียว เว้นแต่จะมีหลักฐานแน่ชัดว่ากระทำไปเนื่องจากถูกบังคับหรือข่มขู่ ให้ลดโทษลงเป็นจำคุกห้าสิบปี</w:t>
       </w:r>
     </w:p>
     <w:p>

</xml_diff>